<commit_message>
MAde Indholdsfortegnelse firt on one page
</commit_message>
<xml_diff>
--- a/Documentation/Official Documentation/Brugervejledning for IBOS Nodelæser version 4.0.0.0.docx
+++ b/Documentation/Official Documentation/Brugervejledning for IBOS Nodelæser version 4.0.0.0.docx
@@ -56,63 +56,13 @@
     </w:p>
     <w:p>
       <w:pPr>
-        <w:pStyle w:val="Brdtekst"/>
+        <w:pStyle w:val="Citatoverskrift"/>
         <w:rPr>
           <w:rFonts w:ascii="Verdana" w:hAnsi="Verdana" w:cs="Verdana"/>
-          <w:sz w:val="48"/>
-        </w:rPr>
-      </w:pPr>
-      <w:r>
-        <w:rPr>
-          <w:rFonts w:cs="Verdana" w:ascii="Verdana" w:hAnsi="Verdana"/>
-          <w:sz w:val="48"/>
-        </w:rPr>
-      </w:r>
-    </w:p>
-    <w:p>
-      <w:pPr>
-        <w:pStyle w:val="Citatoverskrift"/>
-        <w:rPr/>
-      </w:pPr>
-      <w:r>
-        <w:rPr>
-          <w:rFonts w:eastAsia="Verdana" w:cs="Verdana" w:ascii="Verdana" w:hAnsi="Verdana"/>
-        </w:rPr>
-        <w:t xml:space="preserve"> </w:t>
-      </w:r>
-      <w:r>
-        <w:rPr>
-          <w:rFonts w:cs="Verdana" w:ascii="Verdana" w:hAnsi="Verdana"/>
-        </w:rPr>
-        <w:t>Indholdsfortegnelse</w:t>
-      </w:r>
-    </w:p>
-    <w:p>
-      <w:pPr>
-        <w:sectPr>
-          <w:headerReference w:type="default" r:id="rId2"/>
-          <w:footerReference w:type="default" r:id="rId3"/>
-          <w:type w:val="nextPage"/>
-          <w:pgSz w:w="11906" w:h="16838"/>
-          <w:pgMar w:left="1134" w:right="1134" w:header="708" w:top="1134" w:footer="1134" w:bottom="1618" w:gutter="0"/>
-          <w:pgNumType w:fmt="decimal"/>
-          <w:formProt w:val="false"/>
-          <w:textDirection w:val="lrTb"/>
-          <w:docGrid w:type="default" w:linePitch="360" w:charSpace="0"/>
-        </w:sectPr>
-      </w:pPr>
-    </w:p>
-    <w:p>
-      <w:pPr>
-        <w:pStyle w:val="Citatoverskrift"/>
-        <w:rPr>
-          <w:rFonts w:ascii="Verdana" w:hAnsi="Verdana" w:cs="Verdana"/>
-        </w:rPr>
-      </w:pPr>
-      <w:r>
-        <w:rPr>
-          <w:rFonts w:cs="Verdana" w:ascii="Verdana" w:hAnsi="Verdana"/>
-        </w:rPr>
+        </w:rPr>
+      </w:pPr>
+      <w:r>
+        <w:rPr/>
       </w:r>
     </w:p>
     <w:sdt>
@@ -125,7 +75,7 @@
       <w:sdtContent>
         <w:p>
           <w:pPr>
-            <w:pStyle w:val="TOAHeading"/>
+            <w:pStyle w:val="Indholdsfortegnelseoverskrift"/>
             <w:suppressLineNumbers/>
             <w:ind w:left="0" w:hanging="0"/>
             <w:rPr>
@@ -143,7 +93,7 @@
               <w:sz w:val="32"/>
               <w:szCs w:val="32"/>
             </w:rPr>
-            <w:br/>
+            <w:t>Indholdsfortegnelse</w:t>
           </w:r>
         </w:p>
         <w:p>
@@ -176,7 +126,7 @@
               </w:rPr>
               <w:t>Grundlæggende principper</w:t>
               <w:tab/>
-              <w:t>3</w:t>
+              <w:t>2</w:t>
             </w:r>
           </w:hyperlink>
         </w:p>
@@ -195,7 +145,7 @@
               </w:rPr>
               <w:t>IBOS Nodelæsers visnings-komponenter</w:t>
               <w:tab/>
-              <w:t>6</w:t>
+              <w:t>5</w:t>
             </w:r>
           </w:hyperlink>
         </w:p>
@@ -214,7 +164,7 @@
               </w:rPr>
               <w:t>Menulinien</w:t>
               <w:tab/>
-              <w:t>6</w:t>
+              <w:t>5</w:t>
             </w:r>
           </w:hyperlink>
         </w:p>
@@ -233,7 +183,7 @@
               </w:rPr>
               <w:t>Filer</w:t>
               <w:tab/>
-              <w:t>7</w:t>
+              <w:t>6</w:t>
             </w:r>
           </w:hyperlink>
         </w:p>
@@ -252,7 +202,7 @@
               </w:rPr>
               <w:t>Redigér</w:t>
               <w:tab/>
-              <w:t>8</w:t>
+              <w:t>7</w:t>
             </w:r>
           </w:hyperlink>
         </w:p>
@@ -271,7 +221,7 @@
               </w:rPr>
               <w:t>Vis</w:t>
               <w:tab/>
-              <w:t>8</w:t>
+              <w:t>7</w:t>
             </w:r>
           </w:hyperlink>
         </w:p>
@@ -290,7 +240,7 @@
               </w:rPr>
               <w:t>Indstillinger</w:t>
               <w:tab/>
-              <w:t>9</w:t>
+              <w:t>8</w:t>
             </w:r>
           </w:hyperlink>
         </w:p>
@@ -309,7 +259,7 @@
               </w:rPr>
               <w:t>Værktøjer</w:t>
               <w:tab/>
-              <w:t>10</w:t>
+              <w:t>9</w:t>
             </w:r>
           </w:hyperlink>
         </w:p>
@@ -328,7 +278,7 @@
               </w:rPr>
               <w:t>Nodearkiver</w:t>
               <w:tab/>
-              <w:t>10</w:t>
+              <w:t>9</w:t>
             </w:r>
           </w:hyperlink>
         </w:p>
@@ -347,7 +297,7 @@
               </w:rPr>
               <w:t>Hjælp</w:t>
               <w:tab/>
-              <w:t>10</w:t>
+              <w:t>9</w:t>
             </w:r>
           </w:hyperlink>
         </w:p>
@@ -366,7 +316,7 @@
               </w:rPr>
               <w:t>NodeListen</w:t>
               <w:tab/>
-              <w:t>11</w:t>
+              <w:t>10</w:t>
             </w:r>
           </w:hyperlink>
         </w:p>
@@ -385,7 +335,7 @@
               </w:rPr>
               <w:t>NodeFilteret</w:t>
               <w:tab/>
-              <w:t>13</w:t>
+              <w:t>12</w:t>
             </w:r>
           </w:hyperlink>
         </w:p>
@@ -404,7 +354,7 @@
               </w:rPr>
               <w:t>Statuslinien</w:t>
               <w:tab/>
-              <w:t>15</w:t>
+              <w:t>14</w:t>
             </w:r>
           </w:hyperlink>
         </w:p>
@@ -423,7 +373,7 @@
               </w:rPr>
               <w:t>Detaljelisten</w:t>
               <w:tab/>
-              <w:t>16</w:t>
+              <w:t>15</w:t>
             </w:r>
           </w:hyperlink>
         </w:p>
@@ -442,7 +392,7 @@
               </w:rPr>
               <w:t>Statusdetaljer</w:t>
               <w:tab/>
-              <w:t>16</w:t>
+              <w:t>15</w:t>
             </w:r>
           </w:hyperlink>
         </w:p>
@@ -461,7 +411,7 @@
               </w:rPr>
               <w:t>Becifringer</w:t>
               <w:tab/>
-              <w:t>16</w:t>
+              <w:t>15</w:t>
             </w:r>
           </w:hyperlink>
         </w:p>
@@ -480,7 +430,7 @@
               </w:rPr>
               <w:t>Enkelttoner for alle stemmer</w:t>
               <w:tab/>
-              <w:t>17</w:t>
+              <w:t>16</w:t>
             </w:r>
           </w:hyperlink>
         </w:p>
@@ -499,7 +449,7 @@
               </w:rPr>
               <w:t>Enkeltstemmer</w:t>
               <w:tab/>
-              <w:t>17</w:t>
+              <w:t>16</w:t>
             </w:r>
           </w:hyperlink>
         </w:p>
@@ -518,7 +468,7 @@
               </w:rPr>
               <w:t>Enkelttoner for valgt enkeltstemme</w:t>
               <w:tab/>
-              <w:t>17</w:t>
+              <w:t>16</w:t>
             </w:r>
           </w:hyperlink>
         </w:p>
@@ -537,7 +487,7 @@
               </w:rPr>
               <w:t>Import af noder fra Internettet</w:t>
               <w:tab/>
-              <w:t>18</w:t>
+              <w:t>17</w:t>
             </w:r>
           </w:hyperlink>
         </w:p>
@@ -556,7 +506,7 @@
               </w:rPr>
               <w:t>Export af punktnoder</w:t>
               <w:tab/>
-              <w:t>19</w:t>
+              <w:t>18</w:t>
             </w:r>
           </w:hyperlink>
         </w:p>
@@ -575,7 +525,7 @@
               </w:rPr>
               <w:t>Begreber</w:t>
               <w:tab/>
-              <w:t>19</w:t>
+              <w:t>18</w:t>
             </w:r>
           </w:hyperlink>
         </w:p>
@@ -594,7 +544,7 @@
               </w:rPr>
               <w:t>Opstilling</w:t>
               <w:tab/>
-              <w:t>19</w:t>
+              <w:t>18</w:t>
             </w:r>
           </w:hyperlink>
         </w:p>
@@ -613,7 +563,7 @@
               </w:rPr>
               <w:t>Filformat</w:t>
               <w:tab/>
-              <w:t>19</w:t>
+              <w:t>18</w:t>
             </w:r>
           </w:hyperlink>
         </w:p>
@@ -632,7 +582,7 @@
               </w:rPr>
               <w:t>Punktskrift-apparat-type</w:t>
               <w:tab/>
-              <w:t>20</w:t>
+              <w:t>19</w:t>
             </w:r>
           </w:hyperlink>
         </w:p>
@@ -651,7 +601,7 @@
               </w:rPr>
               <w:t>Fysiske dimensioner</w:t>
               <w:tab/>
-              <w:t>20</w:t>
+              <w:t>19</w:t>
             </w:r>
           </w:hyperlink>
         </w:p>
@@ -670,7 +620,7 @@
               </w:rPr>
               <w:t>Profiler</w:t>
               <w:tab/>
-              <w:t>20</w:t>
+              <w:t>19</w:t>
             </w:r>
           </w:hyperlink>
         </w:p>
@@ -689,7 +639,7 @@
               </w:rPr>
               <w:t>IBOS Nodelæser opstilling</w:t>
               <w:tab/>
-              <w:t>21</w:t>
+              <w:t>20</w:t>
             </w:r>
           </w:hyperlink>
         </w:p>
@@ -708,7 +658,7 @@
               </w:rPr>
               <w:t>BANA 2015 Opstilling</w:t>
               <w:tab/>
-              <w:t>21</w:t>
+              <w:t>20</w:t>
             </w:r>
           </w:hyperlink>
         </w:p>
@@ -727,7 +677,7 @@
               </w:rPr>
               <w:t>Udskrivning af punktnodefiler</w:t>
               <w:tab/>
-              <w:t>22</w:t>
+              <w:t>21</w:t>
             </w:r>
           </w:hyperlink>
         </w:p>
@@ -746,7 +696,7 @@
               </w:rPr>
               <w:t>Kopiering af punktnodefiler</w:t>
               <w:tab/>
-              <w:t>22</w:t>
+              <w:t>21</w:t>
             </w:r>
           </w:hyperlink>
         </w:p>
@@ -765,7 +715,7 @@
               </w:rPr>
               <w:t>Tastaturgenveje</w:t>
               <w:tab/>
-              <w:t>23</w:t>
+              <w:t>22</w:t>
             </w:r>
           </w:hyperlink>
         </w:p>
@@ -784,7 +734,7 @@
               </w:rPr>
               <w:t>Lokalisering</w:t>
               <w:tab/>
-              <w:t>25</w:t>
+              <w:t>24</w:t>
             </w:r>
           </w:hyperlink>
         </w:p>
@@ -803,7 +753,7 @@
               </w:rPr>
               <w:t>Brug af Perkins-tastatur</w:t>
               <w:tab/>
-              <w:t>26</w:t>
+              <w:t>25</w:t>
             </w:r>
           </w:hyperlink>
         </w:p>
@@ -822,7 +772,7 @@
               </w:rPr>
               <w:t>Optimering af samspillet med JAWS</w:t>
               <w:tab/>
-              <w:t>26</w:t>
+              <w:t>25</w:t>
             </w:r>
           </w:hyperlink>
         </w:p>
@@ -840,7 +790,7 @@
                 <w:rStyle w:val="Indeksspring"/>
               </w:rPr>
               <w:tab/>
-              <w:t>26</w:t>
+              <w:t>25</w:t>
             </w:r>
           </w:hyperlink>
           <w:r>
@@ -853,9 +803,12 @@
         <w:p>
           <w:pPr>
             <w:sectPr>
-              <w:type w:val="continuous"/>
+              <w:headerReference w:type="default" r:id="rId2"/>
+              <w:footerReference w:type="default" r:id="rId3"/>
+              <w:type w:val="nextPage"/>
               <w:pgSz w:w="11906" w:h="16838"/>
               <w:pgMar w:left="1134" w:right="1134" w:header="708" w:top="1134" w:footer="1134" w:bottom="1618" w:gutter="0"/>
+              <w:pgNumType w:fmt="decimal"/>
               <w:formProt w:val="false"/>
               <w:textDirection w:val="lrTb"/>
               <w:docGrid w:type="default" w:linePitch="360" w:charSpace="0"/>
@@ -1302,14 +1255,14 @@
         </w:tblCellMar>
       </w:tblPr>
       <w:tblGrid>
-        <w:gridCol w:w="2517"/>
-        <w:gridCol w:w="7129"/>
+        <w:gridCol w:w="2516"/>
+        <w:gridCol w:w="7130"/>
       </w:tblGrid>
       <w:tr>
         <w:trPr/>
         <w:tc>
           <w:tcPr>
-            <w:tcW w:w="2517" w:type="dxa"/>
+            <w:tcW w:w="2516" w:type="dxa"/>
             <w:tcBorders>
               <w:top w:val="single" w:sz="2" w:space="0" w:color="000000"/>
               <w:left w:val="single" w:sz="2" w:space="0" w:color="000000"/>
@@ -1337,7 +1290,7 @@
         </w:tc>
         <w:tc>
           <w:tcPr>
-            <w:tcW w:w="7129" w:type="dxa"/>
+            <w:tcW w:w="7130" w:type="dxa"/>
             <w:tcBorders>
               <w:top w:val="single" w:sz="2" w:space="0" w:color="000000"/>
               <w:left w:val="single" w:sz="2" w:space="0" w:color="000000"/>
@@ -1425,7 +1378,7 @@
         <w:trPr/>
         <w:tc>
           <w:tcPr>
-            <w:tcW w:w="2517" w:type="dxa"/>
+            <w:tcW w:w="2516" w:type="dxa"/>
             <w:tcBorders>
               <w:left w:val="single" w:sz="2" w:space="0" w:color="000000"/>
               <w:bottom w:val="single" w:sz="2" w:space="0" w:color="000000"/>
@@ -1452,7 +1405,7 @@
         </w:tc>
         <w:tc>
           <w:tcPr>
-            <w:tcW w:w="7129" w:type="dxa"/>
+            <w:tcW w:w="7130" w:type="dxa"/>
             <w:tcBorders>
               <w:left w:val="single" w:sz="2" w:space="0" w:color="000000"/>
               <w:bottom w:val="single" w:sz="2" w:space="0" w:color="000000"/>
@@ -1521,7 +1474,7 @@
         <w:trPr/>
         <w:tc>
           <w:tcPr>
-            <w:tcW w:w="2517" w:type="dxa"/>
+            <w:tcW w:w="2516" w:type="dxa"/>
             <w:tcBorders>
               <w:left w:val="single" w:sz="2" w:space="0" w:color="000000"/>
               <w:bottom w:val="single" w:sz="2" w:space="0" w:color="000000"/>
@@ -1548,7 +1501,7 @@
         </w:tc>
         <w:tc>
           <w:tcPr>
-            <w:tcW w:w="7129" w:type="dxa"/>
+            <w:tcW w:w="7130" w:type="dxa"/>
             <w:tcBorders>
               <w:left w:val="single" w:sz="2" w:space="0" w:color="000000"/>
               <w:bottom w:val="single" w:sz="2" w:space="0" w:color="000000"/>
@@ -1577,7 +1530,7 @@
         <w:trPr/>
         <w:tc>
           <w:tcPr>
-            <w:tcW w:w="2517" w:type="dxa"/>
+            <w:tcW w:w="2516" w:type="dxa"/>
             <w:tcBorders>
               <w:left w:val="single" w:sz="2" w:space="0" w:color="000000"/>
             </w:tcBorders>
@@ -1606,7 +1559,7 @@
         </w:tc>
         <w:tc>
           <w:tcPr>
-            <w:tcW w:w="7129" w:type="dxa"/>
+            <w:tcW w:w="7130" w:type="dxa"/>
             <w:tcBorders>
               <w:left w:val="single" w:sz="2" w:space="0" w:color="000000"/>
               <w:right w:val="single" w:sz="2" w:space="0" w:color="000000"/>
@@ -1665,7 +1618,7 @@
         <w:trPr/>
         <w:tc>
           <w:tcPr>
-            <w:tcW w:w="2517" w:type="dxa"/>
+            <w:tcW w:w="2516" w:type="dxa"/>
             <w:tcBorders>
               <w:left w:val="single" w:sz="2" w:space="0" w:color="000000"/>
               <w:bottom w:val="single" w:sz="2" w:space="0" w:color="000000"/>
@@ -1695,7 +1648,7 @@
         </w:tc>
         <w:tc>
           <w:tcPr>
-            <w:tcW w:w="7129" w:type="dxa"/>
+            <w:tcW w:w="7130" w:type="dxa"/>
             <w:tcBorders>
               <w:left w:val="single" w:sz="2" w:space="0" w:color="000000"/>
               <w:bottom w:val="single" w:sz="2" w:space="0" w:color="000000"/>
@@ -2107,15 +2060,15 @@
         </w:tblCellMar>
       </w:tblPr>
       <w:tblGrid>
-        <w:gridCol w:w="1587"/>
-        <w:gridCol w:w="5326"/>
+        <w:gridCol w:w="1586"/>
+        <w:gridCol w:w="5327"/>
         <w:gridCol w:w="2734"/>
       </w:tblGrid>
       <w:tr>
         <w:trPr/>
         <w:tc>
           <w:tcPr>
-            <w:tcW w:w="1587" w:type="dxa"/>
+            <w:tcW w:w="1586" w:type="dxa"/>
             <w:tcBorders>
               <w:top w:val="single" w:sz="2" w:space="0" w:color="000000"/>
               <w:left w:val="single" w:sz="2" w:space="0" w:color="000000"/>
@@ -2175,7 +2128,7 @@
         </w:tc>
         <w:tc>
           <w:tcPr>
-            <w:tcW w:w="5326" w:type="dxa"/>
+            <w:tcW w:w="5327" w:type="dxa"/>
             <w:tcBorders>
               <w:top w:val="single" w:sz="2" w:space="0" w:color="000000"/>
               <w:left w:val="single" w:sz="2" w:space="0" w:color="000000"/>
@@ -2233,7 +2186,7 @@
         <w:trPr/>
         <w:tc>
           <w:tcPr>
-            <w:tcW w:w="1587" w:type="dxa"/>
+            <w:tcW w:w="1586" w:type="dxa"/>
             <w:tcBorders>
               <w:left w:val="single" w:sz="2" w:space="0" w:color="000000"/>
               <w:bottom w:val="single" w:sz="2" w:space="0" w:color="000000"/>
@@ -2259,7 +2212,7 @@
         </w:tc>
         <w:tc>
           <w:tcPr>
-            <w:tcW w:w="5326" w:type="dxa"/>
+            <w:tcW w:w="5327" w:type="dxa"/>
             <w:tcBorders>
               <w:left w:val="single" w:sz="2" w:space="0" w:color="000000"/>
               <w:bottom w:val="single" w:sz="2" w:space="0" w:color="000000"/>
@@ -2327,7 +2280,7 @@
         <w:trPr/>
         <w:tc>
           <w:tcPr>
-            <w:tcW w:w="1587" w:type="dxa"/>
+            <w:tcW w:w="1586" w:type="dxa"/>
             <w:tcBorders>
               <w:left w:val="single" w:sz="2" w:space="0" w:color="000000"/>
               <w:bottom w:val="single" w:sz="2" w:space="0" w:color="000000"/>
@@ -2351,7 +2304,7 @@
         </w:tc>
         <w:tc>
           <w:tcPr>
-            <w:tcW w:w="5326" w:type="dxa"/>
+            <w:tcW w:w="5327" w:type="dxa"/>
             <w:tcBorders>
               <w:left w:val="single" w:sz="2" w:space="0" w:color="000000"/>
               <w:bottom w:val="single" w:sz="2" w:space="0" w:color="000000"/>
@@ -2422,7 +2375,7 @@
         <w:trPr/>
         <w:tc>
           <w:tcPr>
-            <w:tcW w:w="1587" w:type="dxa"/>
+            <w:tcW w:w="1586" w:type="dxa"/>
             <w:tcBorders>
               <w:left w:val="single" w:sz="2" w:space="0" w:color="000000"/>
               <w:bottom w:val="single" w:sz="2" w:space="0" w:color="000000"/>
@@ -2448,7 +2401,7 @@
         </w:tc>
         <w:tc>
           <w:tcPr>
-            <w:tcW w:w="5326" w:type="dxa"/>
+            <w:tcW w:w="5327" w:type="dxa"/>
             <w:tcBorders>
               <w:left w:val="single" w:sz="2" w:space="0" w:color="000000"/>
               <w:bottom w:val="single" w:sz="2" w:space="0" w:color="000000"/>
@@ -2534,7 +2487,7 @@
         <w:trPr/>
         <w:tc>
           <w:tcPr>
-            <w:tcW w:w="1587" w:type="dxa"/>
+            <w:tcW w:w="1586" w:type="dxa"/>
             <w:tcBorders>
               <w:left w:val="single" w:sz="2" w:space="0" w:color="000000"/>
               <w:bottom w:val="single" w:sz="2" w:space="0" w:color="000000"/>
@@ -2560,7 +2513,7 @@
         </w:tc>
         <w:tc>
           <w:tcPr>
-            <w:tcW w:w="5326" w:type="dxa"/>
+            <w:tcW w:w="5327" w:type="dxa"/>
             <w:tcBorders>
               <w:left w:val="single" w:sz="2" w:space="0" w:color="000000"/>
               <w:bottom w:val="single" w:sz="2" w:space="0" w:color="000000"/>
@@ -2616,7 +2569,7 @@
         <w:trPr/>
         <w:tc>
           <w:tcPr>
-            <w:tcW w:w="1587" w:type="dxa"/>
+            <w:tcW w:w="1586" w:type="dxa"/>
             <w:tcBorders>
               <w:left w:val="single" w:sz="2" w:space="0" w:color="000000"/>
               <w:bottom w:val="single" w:sz="2" w:space="0" w:color="000000"/>
@@ -2642,7 +2595,7 @@
         </w:tc>
         <w:tc>
           <w:tcPr>
-            <w:tcW w:w="5326" w:type="dxa"/>
+            <w:tcW w:w="5327" w:type="dxa"/>
             <w:tcBorders>
               <w:left w:val="single" w:sz="2" w:space="0" w:color="000000"/>
               <w:bottom w:val="single" w:sz="2" w:space="0" w:color="000000"/>
@@ -2698,7 +2651,7 @@
         <w:trPr/>
         <w:tc>
           <w:tcPr>
-            <w:tcW w:w="1587" w:type="dxa"/>
+            <w:tcW w:w="1586" w:type="dxa"/>
             <w:tcBorders>
               <w:left w:val="single" w:sz="2" w:space="0" w:color="000000"/>
               <w:bottom w:val="single" w:sz="2" w:space="0" w:color="000000"/>
@@ -2724,7 +2677,7 @@
         </w:tc>
         <w:tc>
           <w:tcPr>
-            <w:tcW w:w="5326" w:type="dxa"/>
+            <w:tcW w:w="5327" w:type="dxa"/>
             <w:tcBorders>
               <w:left w:val="single" w:sz="2" w:space="0" w:color="000000"/>
               <w:bottom w:val="single" w:sz="2" w:space="0" w:color="000000"/>
@@ -2780,7 +2733,7 @@
         <w:trPr/>
         <w:tc>
           <w:tcPr>
-            <w:tcW w:w="1587" w:type="dxa"/>
+            <w:tcW w:w="1586" w:type="dxa"/>
             <w:tcBorders>
               <w:left w:val="single" w:sz="2" w:space="0" w:color="000000"/>
               <w:bottom w:val="single" w:sz="2" w:space="0" w:color="000000"/>
@@ -2806,7 +2759,7 @@
         </w:tc>
         <w:tc>
           <w:tcPr>
-            <w:tcW w:w="5326" w:type="dxa"/>
+            <w:tcW w:w="5327" w:type="dxa"/>
             <w:tcBorders>
               <w:left w:val="single" w:sz="2" w:space="0" w:color="000000"/>
               <w:bottom w:val="single" w:sz="2" w:space="0" w:color="000000"/>
@@ -2867,7 +2820,7 @@
         <w:trPr/>
         <w:tc>
           <w:tcPr>
-            <w:tcW w:w="1587" w:type="dxa"/>
+            <w:tcW w:w="1586" w:type="dxa"/>
             <w:tcBorders>
               <w:left w:val="single" w:sz="2" w:space="0" w:color="000000"/>
               <w:bottom w:val="single" w:sz="2" w:space="0" w:color="000000"/>
@@ -2897,7 +2850,7 @@
         </w:tc>
         <w:tc>
           <w:tcPr>
-            <w:tcW w:w="5326" w:type="dxa"/>
+            <w:tcW w:w="5327" w:type="dxa"/>
             <w:tcBorders>
               <w:left w:val="single" w:sz="2" w:space="0" w:color="000000"/>
               <w:bottom w:val="single" w:sz="2" w:space="0" w:color="000000"/>
@@ -2961,7 +2914,7 @@
         <w:trPr/>
         <w:tc>
           <w:tcPr>
-            <w:tcW w:w="1587" w:type="dxa"/>
+            <w:tcW w:w="1586" w:type="dxa"/>
             <w:tcBorders>
               <w:left w:val="single" w:sz="2" w:space="0" w:color="000000"/>
               <w:bottom w:val="single" w:sz="2" w:space="0" w:color="000000"/>
@@ -2991,7 +2944,7 @@
         </w:tc>
         <w:tc>
           <w:tcPr>
-            <w:tcW w:w="5326" w:type="dxa"/>
+            <w:tcW w:w="5327" w:type="dxa"/>
             <w:tcBorders>
               <w:left w:val="single" w:sz="2" w:space="0" w:color="000000"/>
               <w:bottom w:val="single" w:sz="2" w:space="0" w:color="000000"/>
@@ -3055,7 +3008,7 @@
         <w:trPr/>
         <w:tc>
           <w:tcPr>
-            <w:tcW w:w="1587" w:type="dxa"/>
+            <w:tcW w:w="1586" w:type="dxa"/>
             <w:tcBorders>
               <w:left w:val="single" w:sz="2" w:space="0" w:color="000000"/>
               <w:bottom w:val="single" w:sz="2" w:space="0" w:color="000000"/>
@@ -3085,7 +3038,7 @@
         </w:tc>
         <w:tc>
           <w:tcPr>
-            <w:tcW w:w="5326" w:type="dxa"/>
+            <w:tcW w:w="5327" w:type="dxa"/>
             <w:tcBorders>
               <w:left w:val="single" w:sz="2" w:space="0" w:color="000000"/>
               <w:bottom w:val="single" w:sz="2" w:space="0" w:color="000000"/>
@@ -3148,7 +3101,7 @@
         <w:trPr/>
         <w:tc>
           <w:tcPr>
-            <w:tcW w:w="1587" w:type="dxa"/>
+            <w:tcW w:w="1586" w:type="dxa"/>
             <w:tcBorders>
               <w:left w:val="single" w:sz="2" w:space="0" w:color="000000"/>
               <w:bottom w:val="single" w:sz="2" w:space="0" w:color="000000"/>
@@ -3178,7 +3131,7 @@
         </w:tc>
         <w:tc>
           <w:tcPr>
-            <w:tcW w:w="5326" w:type="dxa"/>
+            <w:tcW w:w="5327" w:type="dxa"/>
             <w:tcBorders>
               <w:left w:val="single" w:sz="2" w:space="0" w:color="000000"/>
               <w:bottom w:val="single" w:sz="2" w:space="0" w:color="000000"/>
@@ -3238,7 +3191,7 @@
         <w:trPr/>
         <w:tc>
           <w:tcPr>
-            <w:tcW w:w="1587" w:type="dxa"/>
+            <w:tcW w:w="1586" w:type="dxa"/>
             <w:tcBorders>
               <w:left w:val="single" w:sz="2" w:space="0" w:color="000000"/>
               <w:bottom w:val="single" w:sz="2" w:space="0" w:color="000000"/>
@@ -3264,7 +3217,7 @@
         </w:tc>
         <w:tc>
           <w:tcPr>
-            <w:tcW w:w="5326" w:type="dxa"/>
+            <w:tcW w:w="5327" w:type="dxa"/>
             <w:tcBorders>
               <w:left w:val="single" w:sz="2" w:space="0" w:color="000000"/>
               <w:bottom w:val="single" w:sz="2" w:space="0" w:color="000000"/>
@@ -3320,7 +3273,7 @@
         <w:trPr/>
         <w:tc>
           <w:tcPr>
-            <w:tcW w:w="1587" w:type="dxa"/>
+            <w:tcW w:w="1586" w:type="dxa"/>
             <w:tcBorders>
               <w:left w:val="single" w:sz="2" w:space="0" w:color="000000"/>
               <w:bottom w:val="single" w:sz="2" w:space="0" w:color="000000"/>
@@ -3346,7 +3299,7 @@
         </w:tc>
         <w:tc>
           <w:tcPr>
-            <w:tcW w:w="5326" w:type="dxa"/>
+            <w:tcW w:w="5327" w:type="dxa"/>
             <w:tcBorders>
               <w:left w:val="single" w:sz="2" w:space="0" w:color="000000"/>
               <w:bottom w:val="single" w:sz="2" w:space="0" w:color="000000"/>
@@ -3402,7 +3355,7 @@
         <w:trPr/>
         <w:tc>
           <w:tcPr>
-            <w:tcW w:w="1587" w:type="dxa"/>
+            <w:tcW w:w="1586" w:type="dxa"/>
             <w:tcBorders>
               <w:left w:val="single" w:sz="2" w:space="0" w:color="000000"/>
               <w:bottom w:val="single" w:sz="2" w:space="0" w:color="000000"/>
@@ -3428,7 +3381,7 @@
         </w:tc>
         <w:tc>
           <w:tcPr>
-            <w:tcW w:w="5326" w:type="dxa"/>
+            <w:tcW w:w="5327" w:type="dxa"/>
             <w:tcBorders>
               <w:left w:val="single" w:sz="2" w:space="0" w:color="000000"/>
               <w:bottom w:val="single" w:sz="2" w:space="0" w:color="000000"/>
@@ -3484,7 +3437,7 @@
         <w:trPr/>
         <w:tc>
           <w:tcPr>
-            <w:tcW w:w="1587" w:type="dxa"/>
+            <w:tcW w:w="1586" w:type="dxa"/>
             <w:tcBorders>
               <w:left w:val="single" w:sz="2" w:space="0" w:color="000000"/>
               <w:bottom w:val="single" w:sz="2" w:space="0" w:color="000000"/>
@@ -3510,7 +3463,7 @@
         </w:tc>
         <w:tc>
           <w:tcPr>
-            <w:tcW w:w="5326" w:type="dxa"/>
+            <w:tcW w:w="5327" w:type="dxa"/>
             <w:tcBorders>
               <w:left w:val="single" w:sz="2" w:space="0" w:color="000000"/>
               <w:bottom w:val="single" w:sz="2" w:space="0" w:color="000000"/>
@@ -3566,7 +3519,7 @@
         <w:trPr/>
         <w:tc>
           <w:tcPr>
-            <w:tcW w:w="1587" w:type="dxa"/>
+            <w:tcW w:w="1586" w:type="dxa"/>
             <w:tcBorders>
               <w:left w:val="single" w:sz="2" w:space="0" w:color="000000"/>
               <w:bottom w:val="single" w:sz="2" w:space="0" w:color="000000"/>
@@ -3592,7 +3545,7 @@
         </w:tc>
         <w:tc>
           <w:tcPr>
-            <w:tcW w:w="5326" w:type="dxa"/>
+            <w:tcW w:w="5327" w:type="dxa"/>
             <w:tcBorders>
               <w:left w:val="single" w:sz="2" w:space="0" w:color="000000"/>
               <w:bottom w:val="single" w:sz="2" w:space="0" w:color="000000"/>
@@ -3645,7 +3598,7 @@
         <w:trPr/>
         <w:tc>
           <w:tcPr>
-            <w:tcW w:w="1587" w:type="dxa"/>
+            <w:tcW w:w="1586" w:type="dxa"/>
             <w:tcBorders>
               <w:left w:val="single" w:sz="2" w:space="0" w:color="000000"/>
               <w:bottom w:val="single" w:sz="2" w:space="0" w:color="000000"/>
@@ -3671,7 +3624,7 @@
         </w:tc>
         <w:tc>
           <w:tcPr>
-            <w:tcW w:w="5326" w:type="dxa"/>
+            <w:tcW w:w="5327" w:type="dxa"/>
             <w:tcBorders>
               <w:left w:val="single" w:sz="2" w:space="0" w:color="000000"/>
               <w:bottom w:val="single" w:sz="2" w:space="0" w:color="000000"/>
@@ -3727,7 +3680,7 @@
         <w:trPr/>
         <w:tc>
           <w:tcPr>
-            <w:tcW w:w="1587" w:type="dxa"/>
+            <w:tcW w:w="1586" w:type="dxa"/>
             <w:tcBorders>
               <w:left w:val="single" w:sz="2" w:space="0" w:color="000000"/>
               <w:bottom w:val="single" w:sz="2" w:space="0" w:color="000000"/>
@@ -3753,7 +3706,7 @@
         </w:tc>
         <w:tc>
           <w:tcPr>
-            <w:tcW w:w="5326" w:type="dxa"/>
+            <w:tcW w:w="5327" w:type="dxa"/>
             <w:tcBorders>
               <w:left w:val="single" w:sz="2" w:space="0" w:color="000000"/>
               <w:bottom w:val="single" w:sz="2" w:space="0" w:color="000000"/>
@@ -3809,7 +3762,7 @@
         <w:trPr/>
         <w:tc>
           <w:tcPr>
-            <w:tcW w:w="1587" w:type="dxa"/>
+            <w:tcW w:w="1586" w:type="dxa"/>
             <w:tcBorders>
               <w:left w:val="single" w:sz="2" w:space="0" w:color="000000"/>
               <w:bottom w:val="single" w:sz="2" w:space="0" w:color="000000"/>
@@ -3835,7 +3788,7 @@
         </w:tc>
         <w:tc>
           <w:tcPr>
-            <w:tcW w:w="5326" w:type="dxa"/>
+            <w:tcW w:w="5327" w:type="dxa"/>
             <w:tcBorders>
               <w:left w:val="single" w:sz="2" w:space="0" w:color="000000"/>
               <w:bottom w:val="single" w:sz="2" w:space="0" w:color="000000"/>
@@ -3893,7 +3846,7 @@
         <w:trPr/>
         <w:tc>
           <w:tcPr>
-            <w:tcW w:w="1587" w:type="dxa"/>
+            <w:tcW w:w="1586" w:type="dxa"/>
             <w:tcBorders>
               <w:left w:val="single" w:sz="2" w:space="0" w:color="000000"/>
               <w:bottom w:val="single" w:sz="2" w:space="0" w:color="000000"/>
@@ -3919,7 +3872,7 @@
         </w:tc>
         <w:tc>
           <w:tcPr>
-            <w:tcW w:w="5326" w:type="dxa"/>
+            <w:tcW w:w="5327" w:type="dxa"/>
             <w:tcBorders>
               <w:left w:val="single" w:sz="2" w:space="0" w:color="000000"/>
               <w:bottom w:val="single" w:sz="2" w:space="0" w:color="000000"/>
@@ -3977,7 +3930,7 @@
         <w:trPr/>
         <w:tc>
           <w:tcPr>
-            <w:tcW w:w="1587" w:type="dxa"/>
+            <w:tcW w:w="1586" w:type="dxa"/>
             <w:tcBorders>
               <w:left w:val="single" w:sz="2" w:space="0" w:color="000000"/>
               <w:bottom w:val="single" w:sz="2" w:space="0" w:color="000000"/>
@@ -4003,7 +3956,7 @@
         </w:tc>
         <w:tc>
           <w:tcPr>
-            <w:tcW w:w="5326" w:type="dxa"/>
+            <w:tcW w:w="5327" w:type="dxa"/>
             <w:tcBorders>
               <w:left w:val="single" w:sz="2" w:space="0" w:color="000000"/>
               <w:bottom w:val="single" w:sz="2" w:space="0" w:color="000000"/>
@@ -4061,7 +4014,7 @@
         <w:trPr/>
         <w:tc>
           <w:tcPr>
-            <w:tcW w:w="1587" w:type="dxa"/>
+            <w:tcW w:w="1586" w:type="dxa"/>
             <w:tcBorders>
               <w:left w:val="single" w:sz="2" w:space="0" w:color="000000"/>
               <w:bottom w:val="single" w:sz="2" w:space="0" w:color="000000"/>
@@ -4084,7 +4037,7 @@
         </w:tc>
         <w:tc>
           <w:tcPr>
-            <w:tcW w:w="5326" w:type="dxa"/>
+            <w:tcW w:w="5327" w:type="dxa"/>
             <w:tcBorders>
               <w:left w:val="single" w:sz="2" w:space="0" w:color="000000"/>
               <w:bottom w:val="single" w:sz="2" w:space="0" w:color="000000"/>
@@ -4142,7 +4095,7 @@
         <w:trPr/>
         <w:tc>
           <w:tcPr>
-            <w:tcW w:w="1587" w:type="dxa"/>
+            <w:tcW w:w="1586" w:type="dxa"/>
             <w:tcBorders>
               <w:left w:val="single" w:sz="2" w:space="0" w:color="000000"/>
               <w:bottom w:val="single" w:sz="2" w:space="0" w:color="000000"/>
@@ -4168,7 +4121,7 @@
         </w:tc>
         <w:tc>
           <w:tcPr>
-            <w:tcW w:w="5326" w:type="dxa"/>
+            <w:tcW w:w="5327" w:type="dxa"/>
             <w:tcBorders>
               <w:left w:val="single" w:sz="2" w:space="0" w:color="000000"/>
               <w:bottom w:val="single" w:sz="2" w:space="0" w:color="000000"/>
@@ -4223,7 +4176,7 @@
         <w:trPr/>
         <w:tc>
           <w:tcPr>
-            <w:tcW w:w="1587" w:type="dxa"/>
+            <w:tcW w:w="1586" w:type="dxa"/>
             <w:tcBorders>
               <w:left w:val="single" w:sz="2" w:space="0" w:color="000000"/>
               <w:bottom w:val="single" w:sz="2" w:space="0" w:color="000000"/>
@@ -4251,7 +4204,7 @@
         </w:tc>
         <w:tc>
           <w:tcPr>
-            <w:tcW w:w="5326" w:type="dxa"/>
+            <w:tcW w:w="5327" w:type="dxa"/>
             <w:tcBorders>
               <w:left w:val="single" w:sz="2" w:space="0" w:color="000000"/>
               <w:bottom w:val="single" w:sz="2" w:space="0" w:color="000000"/>
@@ -4309,7 +4262,7 @@
         <w:trPr/>
         <w:tc>
           <w:tcPr>
-            <w:tcW w:w="1587" w:type="dxa"/>
+            <w:tcW w:w="1586" w:type="dxa"/>
             <w:tcBorders>
               <w:left w:val="single" w:sz="2" w:space="0" w:color="000000"/>
               <w:bottom w:val="single" w:sz="2" w:space="0" w:color="000000"/>
@@ -4337,7 +4290,7 @@
         </w:tc>
         <w:tc>
           <w:tcPr>
-            <w:tcW w:w="5326" w:type="dxa"/>
+            <w:tcW w:w="5327" w:type="dxa"/>
             <w:tcBorders>
               <w:left w:val="single" w:sz="2" w:space="0" w:color="000000"/>
               <w:bottom w:val="single" w:sz="2" w:space="0" w:color="000000"/>
@@ -4397,7 +4350,7 @@
         <w:trPr/>
         <w:tc>
           <w:tcPr>
-            <w:tcW w:w="1587" w:type="dxa"/>
+            <w:tcW w:w="1586" w:type="dxa"/>
             <w:tcBorders>
               <w:left w:val="single" w:sz="2" w:space="0" w:color="000000"/>
               <w:bottom w:val="single" w:sz="2" w:space="0" w:color="000000"/>
@@ -4427,7 +4380,7 @@
         </w:tc>
         <w:tc>
           <w:tcPr>
-            <w:tcW w:w="5326" w:type="dxa"/>
+            <w:tcW w:w="5327" w:type="dxa"/>
             <w:tcBorders>
               <w:left w:val="single" w:sz="2" w:space="0" w:color="000000"/>
               <w:bottom w:val="single" w:sz="2" w:space="0" w:color="000000"/>
@@ -4492,7 +4445,7 @@
         <w:trPr/>
         <w:tc>
           <w:tcPr>
-            <w:tcW w:w="1587" w:type="dxa"/>
+            <w:tcW w:w="1586" w:type="dxa"/>
             <w:tcBorders>
               <w:left w:val="single" w:sz="2" w:space="0" w:color="000000"/>
               <w:bottom w:val="single" w:sz="2" w:space="0" w:color="000000"/>
@@ -4522,7 +4475,7 @@
         </w:tc>
         <w:tc>
           <w:tcPr>
-            <w:tcW w:w="5326" w:type="dxa"/>
+            <w:tcW w:w="5327" w:type="dxa"/>
             <w:tcBorders>
               <w:left w:val="single" w:sz="2" w:space="0" w:color="000000"/>
               <w:bottom w:val="single" w:sz="2" w:space="0" w:color="000000"/>
@@ -4587,7 +4540,7 @@
         <w:trPr/>
         <w:tc>
           <w:tcPr>
-            <w:tcW w:w="1587" w:type="dxa"/>
+            <w:tcW w:w="1586" w:type="dxa"/>
             <w:tcBorders>
               <w:left w:val="single" w:sz="2" w:space="0" w:color="000000"/>
               <w:bottom w:val="single" w:sz="2" w:space="0" w:color="000000"/>
@@ -4617,7 +4570,7 @@
         </w:tc>
         <w:tc>
           <w:tcPr>
-            <w:tcW w:w="5326" w:type="dxa"/>
+            <w:tcW w:w="5327" w:type="dxa"/>
             <w:tcBorders>
               <w:left w:val="single" w:sz="2" w:space="0" w:color="000000"/>
               <w:bottom w:val="single" w:sz="2" w:space="0" w:color="000000"/>
@@ -4682,7 +4635,7 @@
         <w:trPr/>
         <w:tc>
           <w:tcPr>
-            <w:tcW w:w="1587" w:type="dxa"/>
+            <w:tcW w:w="1586" w:type="dxa"/>
             <w:tcBorders>
               <w:left w:val="single" w:sz="2" w:space="0" w:color="000000"/>
               <w:bottom w:val="single" w:sz="2" w:space="0" w:color="000000"/>
@@ -4712,7 +4665,7 @@
         </w:tc>
         <w:tc>
           <w:tcPr>
-            <w:tcW w:w="5326" w:type="dxa"/>
+            <w:tcW w:w="5327" w:type="dxa"/>
             <w:tcBorders>
               <w:left w:val="single" w:sz="2" w:space="0" w:color="000000"/>
               <w:bottom w:val="single" w:sz="2" w:space="0" w:color="000000"/>
@@ -4777,7 +4730,7 @@
         <w:trPr/>
         <w:tc>
           <w:tcPr>
-            <w:tcW w:w="1587" w:type="dxa"/>
+            <w:tcW w:w="1586" w:type="dxa"/>
             <w:tcBorders>
               <w:left w:val="single" w:sz="2" w:space="0" w:color="000000"/>
               <w:bottom w:val="single" w:sz="2" w:space="0" w:color="000000"/>
@@ -4807,7 +4760,7 @@
         </w:tc>
         <w:tc>
           <w:tcPr>
-            <w:tcW w:w="5326" w:type="dxa"/>
+            <w:tcW w:w="5327" w:type="dxa"/>
             <w:tcBorders>
               <w:left w:val="single" w:sz="2" w:space="0" w:color="000000"/>
               <w:bottom w:val="single" w:sz="2" w:space="0" w:color="000000"/>
@@ -4872,7 +4825,7 @@
         <w:trPr/>
         <w:tc>
           <w:tcPr>
-            <w:tcW w:w="1587" w:type="dxa"/>
+            <w:tcW w:w="1586" w:type="dxa"/>
             <w:tcBorders>
               <w:left w:val="single" w:sz="2" w:space="0" w:color="000000"/>
               <w:bottom w:val="single" w:sz="2" w:space="0" w:color="000000"/>
@@ -4898,7 +4851,7 @@
         </w:tc>
         <w:tc>
           <w:tcPr>
-            <w:tcW w:w="5326" w:type="dxa"/>
+            <w:tcW w:w="5327" w:type="dxa"/>
             <w:tcBorders>
               <w:left w:val="single" w:sz="2" w:space="0" w:color="000000"/>
               <w:bottom w:val="single" w:sz="2" w:space="0" w:color="000000"/>
@@ -4969,7 +4922,7 @@
         <w:trPr/>
         <w:tc>
           <w:tcPr>
-            <w:tcW w:w="1587" w:type="dxa"/>
+            <w:tcW w:w="1586" w:type="dxa"/>
             <w:tcBorders>
               <w:left w:val="single" w:sz="2" w:space="0" w:color="000000"/>
               <w:bottom w:val="single" w:sz="2" w:space="0" w:color="000000"/>
@@ -4995,7 +4948,7 @@
         </w:tc>
         <w:tc>
           <w:tcPr>
-            <w:tcW w:w="5326" w:type="dxa"/>
+            <w:tcW w:w="5327" w:type="dxa"/>
             <w:tcBorders>
               <w:left w:val="single" w:sz="2" w:space="0" w:color="000000"/>
               <w:bottom w:val="single" w:sz="2" w:space="0" w:color="000000"/>
@@ -5066,7 +5019,7 @@
         <w:trPr/>
         <w:tc>
           <w:tcPr>
-            <w:tcW w:w="1587" w:type="dxa"/>
+            <w:tcW w:w="1586" w:type="dxa"/>
             <w:tcBorders>
               <w:left w:val="single" w:sz="2" w:space="0" w:color="000000"/>
               <w:bottom w:val="single" w:sz="2" w:space="0" w:color="000000"/>
@@ -5092,7 +5045,7 @@
         </w:tc>
         <w:tc>
           <w:tcPr>
-            <w:tcW w:w="5326" w:type="dxa"/>
+            <w:tcW w:w="5327" w:type="dxa"/>
             <w:tcBorders>
               <w:left w:val="single" w:sz="2" w:space="0" w:color="000000"/>
               <w:bottom w:val="single" w:sz="2" w:space="0" w:color="000000"/>
@@ -5168,7 +5121,7 @@
         <w:trPr/>
         <w:tc>
           <w:tcPr>
-            <w:tcW w:w="1587" w:type="dxa"/>
+            <w:tcW w:w="1586" w:type="dxa"/>
             <w:tcBorders>
               <w:left w:val="single" w:sz="2" w:space="0" w:color="000000"/>
               <w:bottom w:val="single" w:sz="2" w:space="0" w:color="000000"/>
@@ -5194,7 +5147,7 @@
         </w:tc>
         <w:tc>
           <w:tcPr>
-            <w:tcW w:w="5326" w:type="dxa"/>
+            <w:tcW w:w="5327" w:type="dxa"/>
             <w:tcBorders>
               <w:left w:val="single" w:sz="2" w:space="0" w:color="000000"/>
               <w:bottom w:val="single" w:sz="2" w:space="0" w:color="000000"/>
@@ -5270,7 +5223,7 @@
         <w:trPr/>
         <w:tc>
           <w:tcPr>
-            <w:tcW w:w="1587" w:type="dxa"/>
+            <w:tcW w:w="1586" w:type="dxa"/>
             <w:tcBorders>
               <w:left w:val="single" w:sz="2" w:space="0" w:color="000000"/>
               <w:bottom w:val="single" w:sz="2" w:space="0" w:color="000000"/>
@@ -5296,7 +5249,7 @@
         </w:tc>
         <w:tc>
           <w:tcPr>
-            <w:tcW w:w="5326" w:type="dxa"/>
+            <w:tcW w:w="5327" w:type="dxa"/>
             <w:tcBorders>
               <w:left w:val="single" w:sz="2" w:space="0" w:color="000000"/>
               <w:bottom w:val="single" w:sz="2" w:space="0" w:color="000000"/>
@@ -5352,7 +5305,7 @@
         <w:trPr/>
         <w:tc>
           <w:tcPr>
-            <w:tcW w:w="1587" w:type="dxa"/>
+            <w:tcW w:w="1586" w:type="dxa"/>
             <w:tcBorders>
               <w:left w:val="single" w:sz="2" w:space="0" w:color="000000"/>
               <w:bottom w:val="single" w:sz="2" w:space="0" w:color="000000"/>
@@ -5378,7 +5331,7 @@
         </w:tc>
         <w:tc>
           <w:tcPr>
-            <w:tcW w:w="5326" w:type="dxa"/>
+            <w:tcW w:w="5327" w:type="dxa"/>
             <w:tcBorders>
               <w:left w:val="single" w:sz="2" w:space="0" w:color="000000"/>
               <w:bottom w:val="single" w:sz="2" w:space="0" w:color="000000"/>
@@ -5434,7 +5387,7 @@
         <w:trPr/>
         <w:tc>
           <w:tcPr>
-            <w:tcW w:w="1587" w:type="dxa"/>
+            <w:tcW w:w="1586" w:type="dxa"/>
             <w:tcBorders>
               <w:left w:val="single" w:sz="2" w:space="0" w:color="000000"/>
               <w:bottom w:val="single" w:sz="2" w:space="0" w:color="000000"/>
@@ -5460,7 +5413,7 @@
         </w:tc>
         <w:tc>
           <w:tcPr>
-            <w:tcW w:w="5326" w:type="dxa"/>
+            <w:tcW w:w="5327" w:type="dxa"/>
             <w:tcBorders>
               <w:left w:val="single" w:sz="2" w:space="0" w:color="000000"/>
               <w:bottom w:val="single" w:sz="2" w:space="0" w:color="000000"/>
@@ -5528,7 +5481,7 @@
         <w:trPr/>
         <w:tc>
           <w:tcPr>
-            <w:tcW w:w="1587" w:type="dxa"/>
+            <w:tcW w:w="1586" w:type="dxa"/>
             <w:tcBorders>
               <w:left w:val="single" w:sz="2" w:space="0" w:color="000000"/>
               <w:bottom w:val="single" w:sz="2" w:space="0" w:color="000000"/>
@@ -5558,7 +5511,7 @@
         </w:tc>
         <w:tc>
           <w:tcPr>
-            <w:tcW w:w="5326" w:type="dxa"/>
+            <w:tcW w:w="5327" w:type="dxa"/>
             <w:tcBorders>
               <w:left w:val="single" w:sz="2" w:space="0" w:color="000000"/>
               <w:bottom w:val="single" w:sz="2" w:space="0" w:color="000000"/>
@@ -5641,7 +5594,7 @@
         <w:trPr/>
         <w:tc>
           <w:tcPr>
-            <w:tcW w:w="1587" w:type="dxa"/>
+            <w:tcW w:w="1586" w:type="dxa"/>
             <w:tcBorders>
               <w:left w:val="single" w:sz="2" w:space="0" w:color="000000"/>
               <w:bottom w:val="single" w:sz="2" w:space="0" w:color="000000"/>
@@ -5667,7 +5620,7 @@
         </w:tc>
         <w:tc>
           <w:tcPr>
-            <w:tcW w:w="5326" w:type="dxa"/>
+            <w:tcW w:w="5327" w:type="dxa"/>
             <w:tcBorders>
               <w:left w:val="single" w:sz="2" w:space="0" w:color="000000"/>
               <w:bottom w:val="single" w:sz="2" w:space="0" w:color="000000"/>
@@ -5720,7 +5673,7 @@
         <w:trPr/>
         <w:tc>
           <w:tcPr>
-            <w:tcW w:w="1587" w:type="dxa"/>
+            <w:tcW w:w="1586" w:type="dxa"/>
             <w:tcBorders>
               <w:left w:val="single" w:sz="2" w:space="0" w:color="000000"/>
               <w:bottom w:val="single" w:sz="2" w:space="0" w:color="000000"/>
@@ -5746,7 +5699,7 @@
         </w:tc>
         <w:tc>
           <w:tcPr>
-            <w:tcW w:w="5326" w:type="dxa"/>
+            <w:tcW w:w="5327" w:type="dxa"/>
             <w:tcBorders>
               <w:left w:val="single" w:sz="2" w:space="0" w:color="000000"/>
               <w:bottom w:val="single" w:sz="2" w:space="0" w:color="000000"/>
@@ -5802,7 +5755,7 @@
         <w:trPr/>
         <w:tc>
           <w:tcPr>
-            <w:tcW w:w="1587" w:type="dxa"/>
+            <w:tcW w:w="1586" w:type="dxa"/>
             <w:tcBorders>
               <w:left w:val="single" w:sz="2" w:space="0" w:color="000000"/>
               <w:bottom w:val="single" w:sz="2" w:space="0" w:color="000000"/>
@@ -5828,7 +5781,7 @@
         </w:tc>
         <w:tc>
           <w:tcPr>
-            <w:tcW w:w="5326" w:type="dxa"/>
+            <w:tcW w:w="5327" w:type="dxa"/>
             <w:tcBorders>
               <w:left w:val="single" w:sz="2" w:space="0" w:color="000000"/>
               <w:bottom w:val="single" w:sz="2" w:space="0" w:color="000000"/>
@@ -5936,7 +5889,7 @@
         <w:trPr/>
         <w:tc>
           <w:tcPr>
-            <w:tcW w:w="1587" w:type="dxa"/>
+            <w:tcW w:w="1586" w:type="dxa"/>
             <w:tcBorders>
               <w:left w:val="single" w:sz="2" w:space="0" w:color="000000"/>
               <w:bottom w:val="single" w:sz="2" w:space="0" w:color="000000"/>
@@ -5962,7 +5915,7 @@
         </w:tc>
         <w:tc>
           <w:tcPr>
-            <w:tcW w:w="5326" w:type="dxa"/>
+            <w:tcW w:w="5327" w:type="dxa"/>
             <w:tcBorders>
               <w:left w:val="single" w:sz="2" w:space="0" w:color="000000"/>
               <w:bottom w:val="single" w:sz="2" w:space="0" w:color="000000"/>
@@ -7509,15 +7462,15 @@
         </w:tblCellMar>
       </w:tblPr>
       <w:tblGrid>
-        <w:gridCol w:w="3237"/>
+        <w:gridCol w:w="3236"/>
         <w:gridCol w:w="2309"/>
-        <w:gridCol w:w="4101"/>
+        <w:gridCol w:w="4102"/>
       </w:tblGrid>
       <w:tr>
         <w:trPr/>
         <w:tc>
           <w:tcPr>
-            <w:tcW w:w="3237" w:type="dxa"/>
+            <w:tcW w:w="3236" w:type="dxa"/>
             <w:tcBorders>
               <w:top w:val="single" w:sz="2" w:space="0" w:color="000000"/>
               <w:left w:val="single" w:sz="2" w:space="0" w:color="000000"/>
@@ -7567,7 +7520,7 @@
         </w:tc>
         <w:tc>
           <w:tcPr>
-            <w:tcW w:w="4101" w:type="dxa"/>
+            <w:tcW w:w="4102" w:type="dxa"/>
             <w:tcBorders>
               <w:top w:val="single" w:sz="2" w:space="0" w:color="000000"/>
               <w:left w:val="single" w:sz="2" w:space="0" w:color="000000"/>
@@ -7596,7 +7549,7 @@
         <w:trPr/>
         <w:tc>
           <w:tcPr>
-            <w:tcW w:w="3237" w:type="dxa"/>
+            <w:tcW w:w="3236" w:type="dxa"/>
             <w:tcBorders>
               <w:left w:val="single" w:sz="2" w:space="0" w:color="000000"/>
               <w:bottom w:val="single" w:sz="2" w:space="0" w:color="000000"/>
@@ -7658,7 +7611,7 @@
         </w:tc>
         <w:tc>
           <w:tcPr>
-            <w:tcW w:w="4101" w:type="dxa"/>
+            <w:tcW w:w="4102" w:type="dxa"/>
             <w:tcBorders>
               <w:left w:val="single" w:sz="2" w:space="0" w:color="000000"/>
               <w:bottom w:val="single" w:sz="2" w:space="0" w:color="000000"/>
@@ -7706,7 +7659,7 @@
         <w:trPr/>
         <w:tc>
           <w:tcPr>
-            <w:tcW w:w="3237" w:type="dxa"/>
+            <w:tcW w:w="3236" w:type="dxa"/>
             <w:tcBorders>
               <w:left w:val="single" w:sz="2" w:space="0" w:color="000000"/>
               <w:bottom w:val="single" w:sz="2" w:space="0" w:color="000000"/>
@@ -7779,7 +7732,7 @@
         </w:tc>
         <w:tc>
           <w:tcPr>
-            <w:tcW w:w="4101" w:type="dxa"/>
+            <w:tcW w:w="4102" w:type="dxa"/>
             <w:tcBorders>
               <w:left w:val="single" w:sz="2" w:space="0" w:color="000000"/>
               <w:bottom w:val="single" w:sz="2" w:space="0" w:color="000000"/>
@@ -7818,7 +7771,7 @@
         <w:trPr/>
         <w:tc>
           <w:tcPr>
-            <w:tcW w:w="3237" w:type="dxa"/>
+            <w:tcW w:w="3236" w:type="dxa"/>
             <w:tcBorders>
               <w:left w:val="single" w:sz="2" w:space="0" w:color="000000"/>
               <w:bottom w:val="single" w:sz="2" w:space="0" w:color="000000"/>
@@ -7868,7 +7821,7 @@
         </w:tc>
         <w:tc>
           <w:tcPr>
-            <w:tcW w:w="4101" w:type="dxa"/>
+            <w:tcW w:w="4102" w:type="dxa"/>
             <w:tcBorders>
               <w:left w:val="single" w:sz="2" w:space="0" w:color="000000"/>
               <w:bottom w:val="single" w:sz="2" w:space="0" w:color="000000"/>
@@ -7896,7 +7849,7 @@
         <w:trPr/>
         <w:tc>
           <w:tcPr>
-            <w:tcW w:w="3237" w:type="dxa"/>
+            <w:tcW w:w="3236" w:type="dxa"/>
             <w:tcBorders>
               <w:left w:val="single" w:sz="2" w:space="0" w:color="000000"/>
               <w:bottom w:val="single" w:sz="2" w:space="0" w:color="000000"/>
@@ -7946,7 +7899,7 @@
         </w:tc>
         <w:tc>
           <w:tcPr>
-            <w:tcW w:w="4101" w:type="dxa"/>
+            <w:tcW w:w="4102" w:type="dxa"/>
             <w:tcBorders>
               <w:left w:val="single" w:sz="2" w:space="0" w:color="000000"/>
               <w:bottom w:val="single" w:sz="2" w:space="0" w:color="000000"/>
@@ -7974,7 +7927,7 @@
         <w:trPr/>
         <w:tc>
           <w:tcPr>
-            <w:tcW w:w="3237" w:type="dxa"/>
+            <w:tcW w:w="3236" w:type="dxa"/>
             <w:tcBorders>
               <w:left w:val="single" w:sz="2" w:space="0" w:color="000000"/>
               <w:bottom w:val="single" w:sz="2" w:space="0" w:color="000000"/>
@@ -8022,7 +7975,7 @@
         </w:tc>
         <w:tc>
           <w:tcPr>
-            <w:tcW w:w="4101" w:type="dxa"/>
+            <w:tcW w:w="4102" w:type="dxa"/>
             <w:tcBorders>
               <w:left w:val="single" w:sz="2" w:space="0" w:color="000000"/>
               <w:bottom w:val="single" w:sz="2" w:space="0" w:color="000000"/>
@@ -8083,15 +8036,15 @@
         </w:tblCellMar>
       </w:tblPr>
       <w:tblGrid>
-        <w:gridCol w:w="3237"/>
+        <w:gridCol w:w="3236"/>
         <w:gridCol w:w="2338"/>
-        <w:gridCol w:w="4072"/>
+        <w:gridCol w:w="4073"/>
       </w:tblGrid>
       <w:tr>
         <w:trPr/>
         <w:tc>
           <w:tcPr>
-            <w:tcW w:w="3237" w:type="dxa"/>
+            <w:tcW w:w="3236" w:type="dxa"/>
             <w:tcBorders>
               <w:top w:val="single" w:sz="2" w:space="0" w:color="000000"/>
               <w:left w:val="single" w:sz="2" w:space="0" w:color="000000"/>
@@ -8141,7 +8094,7 @@
         </w:tc>
         <w:tc>
           <w:tcPr>
-            <w:tcW w:w="4072" w:type="dxa"/>
+            <w:tcW w:w="4073" w:type="dxa"/>
             <w:tcBorders>
               <w:top w:val="single" w:sz="2" w:space="0" w:color="000000"/>
               <w:left w:val="single" w:sz="2" w:space="0" w:color="000000"/>
@@ -8170,7 +8123,7 @@
         <w:trPr/>
         <w:tc>
           <w:tcPr>
-            <w:tcW w:w="3237" w:type="dxa"/>
+            <w:tcW w:w="3236" w:type="dxa"/>
             <w:tcBorders>
               <w:left w:val="single" w:sz="2" w:space="0" w:color="000000"/>
               <w:bottom w:val="single" w:sz="2" w:space="0" w:color="000000"/>
@@ -8216,7 +8169,7 @@
         </w:tc>
         <w:tc>
           <w:tcPr>
-            <w:tcW w:w="4072" w:type="dxa"/>
+            <w:tcW w:w="4073" w:type="dxa"/>
             <w:tcBorders>
               <w:left w:val="single" w:sz="2" w:space="0" w:color="000000"/>
               <w:bottom w:val="single" w:sz="2" w:space="0" w:color="000000"/>
@@ -9894,8 +9847,8 @@
         </w:tblCellMar>
       </w:tblPr>
       <w:tblGrid>
-        <w:gridCol w:w="1977"/>
-        <w:gridCol w:w="7669"/>
+        <w:gridCol w:w="1976"/>
+        <w:gridCol w:w="7670"/>
       </w:tblGrid>
       <w:tr>
         <w:trPr>
@@ -9903,7 +9856,7 @@
         </w:trPr>
         <w:tc>
           <w:tcPr>
-            <w:tcW w:w="1977" w:type="dxa"/>
+            <w:tcW w:w="1976" w:type="dxa"/>
             <w:tcBorders>
               <w:top w:val="single" w:sz="2" w:space="0" w:color="000000"/>
               <w:left w:val="single" w:sz="2" w:space="0" w:color="000000"/>
@@ -9930,7 +9883,7 @@
         </w:tc>
         <w:tc>
           <w:tcPr>
-            <w:tcW w:w="7669" w:type="dxa"/>
+            <w:tcW w:w="7670" w:type="dxa"/>
             <w:tcBorders>
               <w:top w:val="single" w:sz="2" w:space="0" w:color="000000"/>
               <w:left w:val="single" w:sz="2" w:space="0" w:color="000000"/>
@@ -9958,7 +9911,7 @@
         <w:trPr/>
         <w:tc>
           <w:tcPr>
-            <w:tcW w:w="1977" w:type="dxa"/>
+            <w:tcW w:w="1976" w:type="dxa"/>
             <w:tcBorders>
               <w:left w:val="single" w:sz="2" w:space="0" w:color="000000"/>
               <w:bottom w:val="single" w:sz="2" w:space="0" w:color="000000"/>
@@ -9983,7 +9936,7 @@
         </w:tc>
         <w:tc>
           <w:tcPr>
-            <w:tcW w:w="7669" w:type="dxa"/>
+            <w:tcW w:w="7670" w:type="dxa"/>
             <w:tcBorders>
               <w:left w:val="single" w:sz="2" w:space="0" w:color="000000"/>
               <w:bottom w:val="single" w:sz="2" w:space="0" w:color="000000"/>
@@ -10011,7 +9964,7 @@
         <w:trPr/>
         <w:tc>
           <w:tcPr>
-            <w:tcW w:w="1977" w:type="dxa"/>
+            <w:tcW w:w="1976" w:type="dxa"/>
             <w:tcBorders>
               <w:left w:val="single" w:sz="2" w:space="0" w:color="000000"/>
               <w:bottom w:val="single" w:sz="2" w:space="0" w:color="000000"/>
@@ -10036,7 +9989,7 @@
         </w:tc>
         <w:tc>
           <w:tcPr>
-            <w:tcW w:w="7669" w:type="dxa"/>
+            <w:tcW w:w="7670" w:type="dxa"/>
             <w:tcBorders>
               <w:left w:val="single" w:sz="2" w:space="0" w:color="000000"/>
               <w:bottom w:val="single" w:sz="2" w:space="0" w:color="000000"/>
@@ -10062,7 +10015,7 @@
         <w:trPr/>
         <w:tc>
           <w:tcPr>
-            <w:tcW w:w="1977" w:type="dxa"/>
+            <w:tcW w:w="1976" w:type="dxa"/>
             <w:tcBorders>
               <w:left w:val="single" w:sz="2" w:space="0" w:color="000000"/>
               <w:bottom w:val="single" w:sz="2" w:space="0" w:color="000000"/>
@@ -10087,7 +10040,7 @@
         </w:tc>
         <w:tc>
           <w:tcPr>
-            <w:tcW w:w="7669" w:type="dxa"/>
+            <w:tcW w:w="7670" w:type="dxa"/>
             <w:tcBorders>
               <w:left w:val="single" w:sz="2" w:space="0" w:color="000000"/>
               <w:bottom w:val="single" w:sz="2" w:space="0" w:color="000000"/>
@@ -10126,7 +10079,7 @@
         <w:trPr/>
         <w:tc>
           <w:tcPr>
-            <w:tcW w:w="1977" w:type="dxa"/>
+            <w:tcW w:w="1976" w:type="dxa"/>
             <w:tcBorders>
               <w:left w:val="single" w:sz="2" w:space="0" w:color="000000"/>
               <w:bottom w:val="single" w:sz="2" w:space="0" w:color="000000"/>
@@ -10151,7 +10104,7 @@
         </w:tc>
         <w:tc>
           <w:tcPr>
-            <w:tcW w:w="7669" w:type="dxa"/>
+            <w:tcW w:w="7670" w:type="dxa"/>
             <w:tcBorders>
               <w:left w:val="single" w:sz="2" w:space="0" w:color="000000"/>
               <w:bottom w:val="single" w:sz="2" w:space="0" w:color="000000"/>
@@ -10177,7 +10130,7 @@
         <w:trPr/>
         <w:tc>
           <w:tcPr>
-            <w:tcW w:w="1977" w:type="dxa"/>
+            <w:tcW w:w="1976" w:type="dxa"/>
             <w:tcBorders>
               <w:left w:val="single" w:sz="2" w:space="0" w:color="000000"/>
               <w:bottom w:val="single" w:sz="2" w:space="0" w:color="000000"/>
@@ -10202,7 +10155,7 @@
         </w:tc>
         <w:tc>
           <w:tcPr>
-            <w:tcW w:w="7669" w:type="dxa"/>
+            <w:tcW w:w="7670" w:type="dxa"/>
             <w:tcBorders>
               <w:left w:val="single" w:sz="2" w:space="0" w:color="000000"/>
               <w:bottom w:val="single" w:sz="2" w:space="0" w:color="000000"/>
@@ -10228,7 +10181,7 @@
         <w:trPr/>
         <w:tc>
           <w:tcPr>
-            <w:tcW w:w="1977" w:type="dxa"/>
+            <w:tcW w:w="1976" w:type="dxa"/>
             <w:tcBorders>
               <w:left w:val="single" w:sz="2" w:space="0" w:color="000000"/>
               <w:bottom w:val="single" w:sz="2" w:space="0" w:color="000000"/>
@@ -10253,7 +10206,7 @@
         </w:tc>
         <w:tc>
           <w:tcPr>
-            <w:tcW w:w="7669" w:type="dxa"/>
+            <w:tcW w:w="7670" w:type="dxa"/>
             <w:tcBorders>
               <w:left w:val="single" w:sz="2" w:space="0" w:color="000000"/>
               <w:bottom w:val="single" w:sz="2" w:space="0" w:color="000000"/>
@@ -10281,7 +10234,7 @@
         <w:trPr/>
         <w:tc>
           <w:tcPr>
-            <w:tcW w:w="1977" w:type="dxa"/>
+            <w:tcW w:w="1976" w:type="dxa"/>
             <w:tcBorders>
               <w:left w:val="single" w:sz="2" w:space="0" w:color="000000"/>
               <w:bottom w:val="single" w:sz="2" w:space="0" w:color="000000"/>
@@ -10306,7 +10259,7 @@
         </w:tc>
         <w:tc>
           <w:tcPr>
-            <w:tcW w:w="7669" w:type="dxa"/>
+            <w:tcW w:w="7670" w:type="dxa"/>
             <w:tcBorders>
               <w:left w:val="single" w:sz="2" w:space="0" w:color="000000"/>
               <w:bottom w:val="single" w:sz="2" w:space="0" w:color="000000"/>
@@ -10332,7 +10285,7 @@
         <w:trPr/>
         <w:tc>
           <w:tcPr>
-            <w:tcW w:w="1977" w:type="dxa"/>
+            <w:tcW w:w="1976" w:type="dxa"/>
             <w:tcBorders>
               <w:left w:val="single" w:sz="2" w:space="0" w:color="000000"/>
               <w:bottom w:val="single" w:sz="2" w:space="0" w:color="000000"/>
@@ -10356,7 +10309,7 @@
         </w:tc>
         <w:tc>
           <w:tcPr>
-            <w:tcW w:w="7669" w:type="dxa"/>
+            <w:tcW w:w="7670" w:type="dxa"/>
             <w:tcBorders>
               <w:left w:val="single" w:sz="2" w:space="0" w:color="000000"/>
               <w:bottom w:val="single" w:sz="2" w:space="0" w:color="000000"/>
@@ -11788,23 +11741,7 @@
           <w:color w:val="C9211E"/>
           <w:lang w:val="da-DK"/>
         </w:rPr>
-        <w:t xml:space="preserve">Fra og med version </w:t>
-      </w:r>
-      <w:r>
-        <w:rPr>
-          <w:rFonts w:cs="Verdana" w:ascii="Verdana" w:hAnsi="Verdana"/>
-          <w:color w:val="C9211E"/>
-          <w:lang w:val="da-DK"/>
-        </w:rPr>
-        <w:t>4.0</w:t>
-      </w:r>
-      <w:r>
-        <w:rPr>
-          <w:rFonts w:cs="Verdana" w:ascii="Verdana" w:hAnsi="Verdana"/>
-          <w:color w:val="C9211E"/>
-          <w:lang w:val="da-DK"/>
-        </w:rPr>
-        <w:t xml:space="preserve">  kan man desuden eksportere den viste punktnode-repræsentation til en fil, som igen kan anvendes i et notatapparat eller en punktprinter. </w:t>
+        <w:t xml:space="preserve">Fra og med version 4.0  kan man desuden eksportere den viste punktnode-repræsentation til en fil, som igen kan anvendes i et notatapparat eller en punktprinter. </w:t>
       </w:r>
     </w:p>
     <w:p>
@@ -11986,23 +11923,7 @@
           <w:color w:val="C9211E"/>
           <w:lang w:val="da-DK"/>
         </w:rPr>
-        <w:t xml:space="preserve">Version </w:t>
-      </w:r>
-      <w:r>
-        <w:rPr>
-          <w:rFonts w:cs="Verdana" w:ascii="Verdana" w:hAnsi="Verdana"/>
-          <w:color w:val="C9211E"/>
-          <w:lang w:val="da-DK"/>
-        </w:rPr>
-        <w:t>4.0</w:t>
-      </w:r>
-      <w:r>
-        <w:rPr>
-          <w:rFonts w:cs="Verdana" w:ascii="Verdana" w:hAnsi="Verdana"/>
-          <w:color w:val="C9211E"/>
-          <w:lang w:val="da-DK"/>
-        </w:rPr>
-        <w:t xml:space="preserve">  understøtter opstillingerne:</w:t>
+        <w:t>Version 4.0  understøtter opstillingerne:</w:t>
       </w:r>
     </w:p>
     <w:tbl>
@@ -12018,14 +11939,14 @@
         </w:tblCellMar>
       </w:tblPr>
       <w:tblGrid>
-        <w:gridCol w:w="2383"/>
-        <w:gridCol w:w="7267"/>
+        <w:gridCol w:w="2382"/>
+        <w:gridCol w:w="7268"/>
       </w:tblGrid>
       <w:tr>
         <w:trPr/>
         <w:tc>
           <w:tcPr>
-            <w:tcW w:w="2383" w:type="dxa"/>
+            <w:tcW w:w="2382" w:type="dxa"/>
             <w:tcBorders>
               <w:top w:val="single" w:sz="2" w:space="0" w:color="000000"/>
               <w:left w:val="single" w:sz="2" w:space="0" w:color="000000"/>
@@ -12061,7 +11982,7 @@
         </w:tc>
         <w:tc>
           <w:tcPr>
-            <w:tcW w:w="7267" w:type="dxa"/>
+            <w:tcW w:w="7268" w:type="dxa"/>
             <w:tcBorders>
               <w:top w:val="single" w:sz="2" w:space="0" w:color="000000"/>
               <w:left w:val="single" w:sz="2" w:space="0" w:color="000000"/>
@@ -12082,15 +12003,7 @@
                 <w:color w:val="C9211E"/>
                 <w:lang w:val="da-DK"/>
               </w:rPr>
-              <w:t xml:space="preserve">Svarer til visningen i IBOS Nodelæsers nodeliste </w:t>
-            </w:r>
-            <w:r>
-              <w:rPr>
-                <w:rFonts w:cs="Verdana" w:ascii="Verdana" w:hAnsi="Verdana"/>
-                <w:color w:val="C9211E"/>
-                <w:lang w:val="da-DK"/>
-              </w:rPr>
-              <w:t>og viser lige som denne én linie punktnoder pr. slag i musikken.</w:t>
+              <w:t>Svarer til visningen i IBOS Nodelæsers nodeliste og viser lige som denne én linie punktnoder pr. slag i musikken.</w:t>
             </w:r>
           </w:p>
         </w:tc>
@@ -12099,7 +12012,7 @@
         <w:trPr/>
         <w:tc>
           <w:tcPr>
-            <w:tcW w:w="2383" w:type="dxa"/>
+            <w:tcW w:w="2382" w:type="dxa"/>
             <w:tcBorders>
               <w:left w:val="single" w:sz="2" w:space="0" w:color="000000"/>
               <w:bottom w:val="single" w:sz="2" w:space="0" w:color="000000"/>
@@ -12134,7 +12047,7 @@
         </w:tc>
         <w:tc>
           <w:tcPr>
-            <w:tcW w:w="7267" w:type="dxa"/>
+            <w:tcW w:w="7268" w:type="dxa"/>
             <w:tcBorders>
               <w:left w:val="single" w:sz="2" w:space="0" w:color="000000"/>
               <w:bottom w:val="single" w:sz="2" w:space="0" w:color="000000"/>
@@ -12782,76 +12695,36 @@
           <w:color w:val="C9211E"/>
           <w:lang w:val="da-DK"/>
         </w:rPr>
-        <w:t xml:space="preserve">Som hovedregel genereres 1 </w:t>
-      </w:r>
+        <w:t>Som hovedregel genereres 1 punktnodefil pr stemme i partituret samt en ”TUTTI” punktnodefil, som indeholder en samlet repræsentation af alle stemmer.</w:t>
+      </w:r>
+    </w:p>
+    <w:p>
+      <w:pPr>
+        <w:pStyle w:val="Brdtekst"/>
+        <w:rPr>
+          <w:rFonts w:ascii="Verdana" w:hAnsi="Verdana" w:cs="Verdana"/>
+          <w:lang w:val="da-DK"/>
+        </w:rPr>
+      </w:pPr>
+      <w:r>
+        <w:rPr>
+          <w:rFonts w:cs="Verdana" w:ascii="Verdana" w:hAnsi="Verdana"/>
+          <w:lang w:val="da-DK"/>
+        </w:rPr>
+      </w:r>
+    </w:p>
+    <w:p>
+      <w:pPr>
+        <w:pStyle w:val="Brdtekst"/>
+        <w:rPr/>
+      </w:pPr>
       <w:r>
         <w:rPr>
           <w:rFonts w:cs="Verdana" w:ascii="Verdana" w:hAnsi="Verdana"/>
           <w:color w:val="C9211E"/>
           <w:lang w:val="da-DK"/>
         </w:rPr>
-        <w:t>punktnode</w:t>
-      </w:r>
-      <w:r>
-        <w:rPr>
-          <w:rFonts w:cs="Verdana" w:ascii="Verdana" w:hAnsi="Verdana"/>
-          <w:color w:val="C9211E"/>
-          <w:lang w:val="da-DK"/>
-        </w:rPr>
-        <w:t xml:space="preserve">fil pr stemme i partituret samt en ”TUTTI” </w:t>
-      </w:r>
-      <w:r>
-        <w:rPr>
-          <w:rFonts w:cs="Verdana" w:ascii="Verdana" w:hAnsi="Verdana"/>
-          <w:color w:val="C9211E"/>
-          <w:lang w:val="da-DK"/>
-        </w:rPr>
-        <w:t>punktnodefil</w:t>
-      </w:r>
-      <w:r>
-        <w:rPr>
-          <w:rFonts w:cs="Verdana" w:ascii="Verdana" w:hAnsi="Verdana"/>
-          <w:color w:val="C9211E"/>
-          <w:lang w:val="da-DK"/>
-        </w:rPr>
-        <w:t>, som indeholder en samlet repræsentation af alle stemmer.</w:t>
-      </w:r>
-    </w:p>
-    <w:p>
-      <w:pPr>
-        <w:pStyle w:val="Brdtekst"/>
-        <w:rPr>
-          <w:rFonts w:ascii="Verdana" w:hAnsi="Verdana" w:cs="Verdana"/>
-          <w:lang w:val="da-DK"/>
-        </w:rPr>
-      </w:pPr>
-      <w:r>
-        <w:rPr>
-          <w:rFonts w:cs="Verdana" w:ascii="Verdana" w:hAnsi="Verdana"/>
-          <w:lang w:val="da-DK"/>
-        </w:rPr>
-      </w:r>
-    </w:p>
-    <w:p>
-      <w:pPr>
-        <w:pStyle w:val="Brdtekst"/>
-        <w:rPr/>
-      </w:pPr>
-      <w:r>
-        <w:rPr>
-          <w:rFonts w:cs="Verdana" w:ascii="Verdana" w:hAnsi="Verdana"/>
-          <w:color w:val="C9211E"/>
-          <w:lang w:val="da-DK"/>
-        </w:rPr>
-        <w:t>For</w:t>
-      </w:r>
-      <w:r>
-        <w:rPr>
-          <w:rFonts w:cs="Verdana" w:ascii="Verdana" w:hAnsi="Verdana"/>
-          <w:color w:val="C9211E"/>
-          <w:lang w:val="da-DK"/>
-        </w:rPr>
-        <w:t xml:space="preserve"> SATB (Sopran, Alt, Tenot, Bas) kor-partiturer genereres desuden: </w:t>
+        <w:t xml:space="preserve">For SATB (Sopran, Alt, Tenot, Bas) kor-partiturer genereres desuden: </w:t>
       </w:r>
     </w:p>
     <w:p>
@@ -12947,23 +12820,7 @@
           <w:color w:val="C9211E"/>
           <w:lang w:val="da-DK"/>
         </w:rPr>
-        <w:t xml:space="preserve">For et typisk SATB partitur genereres således 8 </w:t>
-      </w:r>
-      <w:r>
-        <w:rPr>
-          <w:rFonts w:cs="Verdana" w:ascii="Verdana" w:hAnsi="Verdana"/>
-          <w:color w:val="C9211E"/>
-          <w:lang w:val="da-DK"/>
-        </w:rPr>
-        <w:t>punktnode</w:t>
-      </w:r>
-      <w:r>
-        <w:rPr>
-          <w:rFonts w:cs="Verdana" w:ascii="Verdana" w:hAnsi="Verdana"/>
-          <w:color w:val="C9211E"/>
-          <w:lang w:val="da-DK"/>
-        </w:rPr>
-        <w:t>filer:</w:t>
+        <w:t>For et typisk SATB partitur genereres således 8 punktnodefiler:</w:t>
       </w:r>
     </w:p>
     <w:p>
@@ -13088,23 +12945,7 @@
           <w:color w:val="C9211E"/>
           <w:lang w:val="da-DK"/>
         </w:rPr>
-        <w:t>Filer” → ”Kopiér punktnodefil til Braille apparat ved hjælp af</w:t>
-      </w:r>
-      <w:r>
-        <w:rPr>
-          <w:rFonts w:cs="Verdana" w:ascii="Verdana" w:hAnsi="Verdana"/>
-          <w:color w:val="C9211E"/>
-          <w:lang w:val="da-DK"/>
-        </w:rPr>
-        <w:t xml:space="preserve"> </w:t>
-      </w:r>
-      <w:r>
-        <w:rPr>
-          <w:rFonts w:cs="Verdana" w:ascii="Verdana" w:hAnsi="Verdana"/>
-          <w:color w:val="C9211E"/>
-          <w:lang w:val="da-DK"/>
-        </w:rPr>
-        <w:t>Stifinder”</w:t>
+        <w:t>Filer” → ”Kopiér punktnodefil til Braille apparat ved hjælp af Stifinder”</w:t>
       </w:r>
     </w:p>
     <w:p>
@@ -13230,14 +13071,14 @@
         </w:tblCellMar>
       </w:tblPr>
       <w:tblGrid>
-        <w:gridCol w:w="1648"/>
-        <w:gridCol w:w="8002"/>
+        <w:gridCol w:w="1647"/>
+        <w:gridCol w:w="8003"/>
       </w:tblGrid>
       <w:tr>
         <w:trPr/>
         <w:tc>
           <w:tcPr>
-            <w:tcW w:w="1648" w:type="dxa"/>
+            <w:tcW w:w="1647" w:type="dxa"/>
             <w:tcBorders>
               <w:top w:val="single" w:sz="2" w:space="0" w:color="000000"/>
               <w:left w:val="single" w:sz="2" w:space="0" w:color="000000"/>
@@ -13285,7 +13126,7 @@
         </w:tc>
         <w:tc>
           <w:tcPr>
-            <w:tcW w:w="8002" w:type="dxa"/>
+            <w:tcW w:w="8003" w:type="dxa"/>
             <w:tcBorders>
               <w:top w:val="single" w:sz="2" w:space="0" w:color="000000"/>
               <w:left w:val="single" w:sz="2" w:space="0" w:color="000000"/>
@@ -13345,7 +13186,7 @@
         <w:trPr/>
         <w:tc>
           <w:tcPr>
-            <w:tcW w:w="1648" w:type="dxa"/>
+            <w:tcW w:w="1647" w:type="dxa"/>
             <w:tcBorders>
               <w:left w:val="single" w:sz="2" w:space="0" w:color="000000"/>
               <w:bottom w:val="single" w:sz="2" w:space="0" w:color="000000"/>
@@ -13385,7 +13226,7 @@
         </w:tc>
         <w:tc>
           <w:tcPr>
-            <w:tcW w:w="8002" w:type="dxa"/>
+            <w:tcW w:w="8003" w:type="dxa"/>
             <w:tcBorders>
               <w:left w:val="single" w:sz="2" w:space="0" w:color="000000"/>
               <w:bottom w:val="single" w:sz="2" w:space="0" w:color="000000"/>
@@ -13729,14 +13570,14 @@
         </w:tblCellMar>
       </w:tblPr>
       <w:tblGrid>
-        <w:gridCol w:w="3282"/>
-        <w:gridCol w:w="6364"/>
+        <w:gridCol w:w="3281"/>
+        <w:gridCol w:w="6365"/>
       </w:tblGrid>
       <w:tr>
         <w:trPr/>
         <w:tc>
           <w:tcPr>
-            <w:tcW w:w="3282" w:type="dxa"/>
+            <w:tcW w:w="3281" w:type="dxa"/>
             <w:tcBorders>
               <w:top w:val="single" w:sz="2" w:space="0" w:color="000000"/>
               <w:left w:val="single" w:sz="2" w:space="0" w:color="000000"/>
@@ -13763,7 +13604,7 @@
         </w:tc>
         <w:tc>
           <w:tcPr>
-            <w:tcW w:w="6364" w:type="dxa"/>
+            <w:tcW w:w="6365" w:type="dxa"/>
             <w:tcBorders>
               <w:top w:val="single" w:sz="2" w:space="0" w:color="000000"/>
               <w:left w:val="single" w:sz="2" w:space="0" w:color="000000"/>
@@ -13794,7 +13635,7 @@
         <w:trPr/>
         <w:tc>
           <w:tcPr>
-            <w:tcW w:w="3282" w:type="dxa"/>
+            <w:tcW w:w="3281" w:type="dxa"/>
             <w:tcBorders>
               <w:left w:val="single" w:sz="2" w:space="0" w:color="000000"/>
               <w:bottom w:val="single" w:sz="2" w:space="0" w:color="000000"/>
@@ -13829,7 +13670,7 @@
         </w:tc>
         <w:tc>
           <w:tcPr>
-            <w:tcW w:w="6364" w:type="dxa"/>
+            <w:tcW w:w="6365" w:type="dxa"/>
             <w:tcBorders>
               <w:left w:val="single" w:sz="2" w:space="0" w:color="000000"/>
               <w:bottom w:val="single" w:sz="2" w:space="0" w:color="000000"/>
@@ -13857,7 +13698,7 @@
         <w:trPr/>
         <w:tc>
           <w:tcPr>
-            <w:tcW w:w="3282" w:type="dxa"/>
+            <w:tcW w:w="3281" w:type="dxa"/>
             <w:tcBorders>
               <w:left w:val="single" w:sz="2" w:space="0" w:color="000000"/>
               <w:bottom w:val="single" w:sz="2" w:space="0" w:color="000000"/>
@@ -13881,7 +13722,7 @@
         </w:tc>
         <w:tc>
           <w:tcPr>
-            <w:tcW w:w="6364" w:type="dxa"/>
+            <w:tcW w:w="6365" w:type="dxa"/>
             <w:tcBorders>
               <w:left w:val="single" w:sz="2" w:space="0" w:color="000000"/>
               <w:bottom w:val="single" w:sz="2" w:space="0" w:color="000000"/>
@@ -13909,7 +13750,7 @@
         <w:trPr/>
         <w:tc>
           <w:tcPr>
-            <w:tcW w:w="3282" w:type="dxa"/>
+            <w:tcW w:w="3281" w:type="dxa"/>
             <w:tcBorders>
               <w:left w:val="single" w:sz="2" w:space="0" w:color="000000"/>
               <w:bottom w:val="single" w:sz="2" w:space="0" w:color="000000"/>
@@ -13933,7 +13774,7 @@
         </w:tc>
         <w:tc>
           <w:tcPr>
-            <w:tcW w:w="6364" w:type="dxa"/>
+            <w:tcW w:w="6365" w:type="dxa"/>
             <w:tcBorders>
               <w:left w:val="single" w:sz="2" w:space="0" w:color="000000"/>
               <w:bottom w:val="single" w:sz="2" w:space="0" w:color="000000"/>
@@ -13961,7 +13802,7 @@
         <w:trPr/>
         <w:tc>
           <w:tcPr>
-            <w:tcW w:w="3282" w:type="dxa"/>
+            <w:tcW w:w="3281" w:type="dxa"/>
             <w:tcBorders>
               <w:left w:val="single" w:sz="2" w:space="0" w:color="000000"/>
               <w:bottom w:val="single" w:sz="2" w:space="0" w:color="000000"/>
@@ -13985,7 +13826,7 @@
         </w:tc>
         <w:tc>
           <w:tcPr>
-            <w:tcW w:w="6364" w:type="dxa"/>
+            <w:tcW w:w="6365" w:type="dxa"/>
             <w:tcBorders>
               <w:left w:val="single" w:sz="2" w:space="0" w:color="000000"/>
               <w:bottom w:val="single" w:sz="2" w:space="0" w:color="000000"/>
@@ -14013,7 +13854,7 @@
         <w:trPr/>
         <w:tc>
           <w:tcPr>
-            <w:tcW w:w="3282" w:type="dxa"/>
+            <w:tcW w:w="3281" w:type="dxa"/>
             <w:tcBorders>
               <w:left w:val="single" w:sz="2" w:space="0" w:color="000000"/>
               <w:bottom w:val="single" w:sz="2" w:space="0" w:color="000000"/>
@@ -14038,7 +13879,7 @@
         </w:tc>
         <w:tc>
           <w:tcPr>
-            <w:tcW w:w="6364" w:type="dxa"/>
+            <w:tcW w:w="6365" w:type="dxa"/>
             <w:tcBorders>
               <w:left w:val="single" w:sz="2" w:space="0" w:color="000000"/>
               <w:bottom w:val="single" w:sz="2" w:space="0" w:color="000000"/>
@@ -14066,7 +13907,7 @@
         <w:trPr/>
         <w:tc>
           <w:tcPr>
-            <w:tcW w:w="3282" w:type="dxa"/>
+            <w:tcW w:w="3281" w:type="dxa"/>
             <w:tcBorders>
               <w:left w:val="single" w:sz="2" w:space="0" w:color="000000"/>
               <w:bottom w:val="single" w:sz="2" w:space="0" w:color="000000"/>
@@ -14095,7 +13936,7 @@
         </w:tc>
         <w:tc>
           <w:tcPr>
-            <w:tcW w:w="6364" w:type="dxa"/>
+            <w:tcW w:w="6365" w:type="dxa"/>
             <w:tcBorders>
               <w:left w:val="single" w:sz="2" w:space="0" w:color="000000"/>
               <w:bottom w:val="single" w:sz="2" w:space="0" w:color="000000"/>
@@ -14125,7 +13966,7 @@
         <w:trPr/>
         <w:tc>
           <w:tcPr>
-            <w:tcW w:w="3282" w:type="dxa"/>
+            <w:tcW w:w="3281" w:type="dxa"/>
             <w:tcBorders>
               <w:left w:val="single" w:sz="2" w:space="0" w:color="000000"/>
             </w:tcBorders>
@@ -14153,7 +13994,7 @@
         </w:tc>
         <w:tc>
           <w:tcPr>
-            <w:tcW w:w="6364" w:type="dxa"/>
+            <w:tcW w:w="6365" w:type="dxa"/>
             <w:tcBorders>
               <w:left w:val="single" w:sz="2" w:space="0" w:color="000000"/>
               <w:right w:val="single" w:sz="2" w:space="0" w:color="000000"/>
@@ -14182,7 +14023,7 @@
         <w:trPr/>
         <w:tc>
           <w:tcPr>
-            <w:tcW w:w="3282" w:type="dxa"/>
+            <w:tcW w:w="3281" w:type="dxa"/>
             <w:tcBorders>
               <w:left w:val="single" w:sz="2" w:space="0" w:color="000000"/>
             </w:tcBorders>
@@ -14208,7 +14049,7 @@
         </w:tc>
         <w:tc>
           <w:tcPr>
-            <w:tcW w:w="6364" w:type="dxa"/>
+            <w:tcW w:w="6365" w:type="dxa"/>
             <w:tcBorders>
               <w:left w:val="single" w:sz="2" w:space="0" w:color="000000"/>
               <w:right w:val="single" w:sz="2" w:space="0" w:color="000000"/>
@@ -14237,7 +14078,7 @@
         <w:trPr/>
         <w:tc>
           <w:tcPr>
-            <w:tcW w:w="3282" w:type="dxa"/>
+            <w:tcW w:w="3281" w:type="dxa"/>
             <w:tcBorders>
               <w:left w:val="single" w:sz="2" w:space="0" w:color="000000"/>
               <w:bottom w:val="single" w:sz="2" w:space="0" w:color="000000"/>
@@ -14263,7 +14104,7 @@
         </w:tc>
         <w:tc>
           <w:tcPr>
-            <w:tcW w:w="6364" w:type="dxa"/>
+            <w:tcW w:w="6365" w:type="dxa"/>
             <w:tcBorders>
               <w:left w:val="single" w:sz="2" w:space="0" w:color="000000"/>
               <w:bottom w:val="single" w:sz="2" w:space="0" w:color="000000"/>
@@ -14754,14 +14595,14 @@
         </w:tblCellMar>
       </w:tblPr>
       <w:tblGrid>
-        <w:gridCol w:w="3399"/>
-        <w:gridCol w:w="6247"/>
+        <w:gridCol w:w="3398"/>
+        <w:gridCol w:w="6248"/>
       </w:tblGrid>
       <w:tr>
         <w:trPr/>
         <w:tc>
           <w:tcPr>
-            <w:tcW w:w="3399" w:type="dxa"/>
+            <w:tcW w:w="3398" w:type="dxa"/>
             <w:tcBorders>
               <w:top w:val="single" w:sz="2" w:space="0" w:color="000000"/>
               <w:left w:val="single" w:sz="2" w:space="0" w:color="000000"/>
@@ -14788,7 +14629,7 @@
         </w:tc>
         <w:tc>
           <w:tcPr>
-            <w:tcW w:w="6247" w:type="dxa"/>
+            <w:tcW w:w="6248" w:type="dxa"/>
             <w:tcBorders>
               <w:top w:val="single" w:sz="2" w:space="0" w:color="000000"/>
               <w:left w:val="single" w:sz="2" w:space="0" w:color="000000"/>
@@ -14819,7 +14660,7 @@
         <w:trPr/>
         <w:tc>
           <w:tcPr>
-            <w:tcW w:w="3399" w:type="dxa"/>
+            <w:tcW w:w="3398" w:type="dxa"/>
             <w:tcBorders>
               <w:left w:val="single" w:sz="2" w:space="0" w:color="000000"/>
               <w:bottom w:val="single" w:sz="2" w:space="0" w:color="000000"/>
@@ -14843,7 +14684,7 @@
         </w:tc>
         <w:tc>
           <w:tcPr>
-            <w:tcW w:w="6247" w:type="dxa"/>
+            <w:tcW w:w="6248" w:type="dxa"/>
             <w:tcBorders>
               <w:left w:val="single" w:sz="2" w:space="0" w:color="000000"/>
               <w:bottom w:val="single" w:sz="2" w:space="0" w:color="000000"/>
@@ -14871,7 +14712,7 @@
         <w:trPr/>
         <w:tc>
           <w:tcPr>
-            <w:tcW w:w="3399" w:type="dxa"/>
+            <w:tcW w:w="3398" w:type="dxa"/>
             <w:tcBorders>
               <w:left w:val="single" w:sz="2" w:space="0" w:color="000000"/>
               <w:bottom w:val="single" w:sz="2" w:space="0" w:color="000000"/>
@@ -14895,7 +14736,7 @@
         </w:tc>
         <w:tc>
           <w:tcPr>
-            <w:tcW w:w="6247" w:type="dxa"/>
+            <w:tcW w:w="6248" w:type="dxa"/>
             <w:tcBorders>
               <w:left w:val="single" w:sz="2" w:space="0" w:color="000000"/>
               <w:bottom w:val="single" w:sz="2" w:space="0" w:color="000000"/>
@@ -14923,7 +14764,7 @@
         <w:trPr/>
         <w:tc>
           <w:tcPr>
-            <w:tcW w:w="3399" w:type="dxa"/>
+            <w:tcW w:w="3398" w:type="dxa"/>
             <w:tcBorders>
               <w:left w:val="single" w:sz="2" w:space="0" w:color="000000"/>
               <w:bottom w:val="single" w:sz="2" w:space="0" w:color="000000"/>
@@ -14948,7 +14789,7 @@
         </w:tc>
         <w:tc>
           <w:tcPr>
-            <w:tcW w:w="6247" w:type="dxa"/>
+            <w:tcW w:w="6248" w:type="dxa"/>
             <w:tcBorders>
               <w:left w:val="single" w:sz="2" w:space="0" w:color="000000"/>
               <w:bottom w:val="single" w:sz="2" w:space="0" w:color="000000"/>
@@ -14978,7 +14819,7 @@
         <w:trPr/>
         <w:tc>
           <w:tcPr>
-            <w:tcW w:w="3399" w:type="dxa"/>
+            <w:tcW w:w="3398" w:type="dxa"/>
             <w:tcBorders>
               <w:left w:val="single" w:sz="2" w:space="0" w:color="000000"/>
               <w:bottom w:val="single" w:sz="2" w:space="0" w:color="000000"/>
@@ -15004,7 +14845,7 @@
         </w:tc>
         <w:tc>
           <w:tcPr>
-            <w:tcW w:w="6247" w:type="dxa"/>
+            <w:tcW w:w="6248" w:type="dxa"/>
             <w:tcBorders>
               <w:left w:val="single" w:sz="2" w:space="0" w:color="000000"/>
               <w:bottom w:val="single" w:sz="2" w:space="0" w:color="000000"/>
@@ -15034,7 +14875,7 @@
         <w:trPr/>
         <w:tc>
           <w:tcPr>
-            <w:tcW w:w="3399" w:type="dxa"/>
+            <w:tcW w:w="3398" w:type="dxa"/>
             <w:tcBorders>
               <w:left w:val="single" w:sz="2" w:space="0" w:color="000000"/>
               <w:bottom w:val="single" w:sz="2" w:space="0" w:color="000000"/>
@@ -15058,7 +14899,7 @@
         </w:tc>
         <w:tc>
           <w:tcPr>
-            <w:tcW w:w="6247" w:type="dxa"/>
+            <w:tcW w:w="6248" w:type="dxa"/>
             <w:tcBorders>
               <w:left w:val="single" w:sz="2" w:space="0" w:color="000000"/>
               <w:bottom w:val="single" w:sz="2" w:space="0" w:color="000000"/>
@@ -15086,7 +14927,7 @@
         <w:trPr/>
         <w:tc>
           <w:tcPr>
-            <w:tcW w:w="3399" w:type="dxa"/>
+            <w:tcW w:w="3398" w:type="dxa"/>
             <w:tcBorders>
               <w:left w:val="single" w:sz="2" w:space="0" w:color="000000"/>
               <w:bottom w:val="single" w:sz="2" w:space="0" w:color="000000"/>
@@ -15110,7 +14951,7 @@
         </w:tc>
         <w:tc>
           <w:tcPr>
-            <w:tcW w:w="6247" w:type="dxa"/>
+            <w:tcW w:w="6248" w:type="dxa"/>
             <w:tcBorders>
               <w:left w:val="single" w:sz="2" w:space="0" w:color="000000"/>
               <w:bottom w:val="single" w:sz="2" w:space="0" w:color="000000"/>
@@ -15136,7 +14977,7 @@
         <w:trPr/>
         <w:tc>
           <w:tcPr>
-            <w:tcW w:w="3399" w:type="dxa"/>
+            <w:tcW w:w="3398" w:type="dxa"/>
             <w:tcBorders>
               <w:left w:val="single" w:sz="2" w:space="0" w:color="000000"/>
               <w:bottom w:val="single" w:sz="2" w:space="0" w:color="000000"/>
@@ -15160,7 +15001,7 @@
         </w:tc>
         <w:tc>
           <w:tcPr>
-            <w:tcW w:w="6247" w:type="dxa"/>
+            <w:tcW w:w="6248" w:type="dxa"/>
             <w:tcBorders>
               <w:left w:val="single" w:sz="2" w:space="0" w:color="000000"/>
               <w:bottom w:val="single" w:sz="2" w:space="0" w:color="000000"/>
@@ -15199,7 +15040,7 @@
         <w:trPr/>
         <w:tc>
           <w:tcPr>
-            <w:tcW w:w="3399" w:type="dxa"/>
+            <w:tcW w:w="3398" w:type="dxa"/>
             <w:tcBorders>
               <w:left w:val="single" w:sz="2" w:space="0" w:color="000000"/>
               <w:bottom w:val="single" w:sz="2" w:space="0" w:color="000000"/>
@@ -15223,7 +15064,7 @@
         </w:tc>
         <w:tc>
           <w:tcPr>
-            <w:tcW w:w="6247" w:type="dxa"/>
+            <w:tcW w:w="6248" w:type="dxa"/>
             <w:tcBorders>
               <w:left w:val="single" w:sz="2" w:space="0" w:color="000000"/>
               <w:bottom w:val="single" w:sz="2" w:space="0" w:color="000000"/>
@@ -15262,7 +15103,7 @@
         <w:trPr/>
         <w:tc>
           <w:tcPr>
-            <w:tcW w:w="3399" w:type="dxa"/>
+            <w:tcW w:w="3398" w:type="dxa"/>
             <w:tcBorders>
               <w:left w:val="single" w:sz="2" w:space="0" w:color="000000"/>
               <w:bottom w:val="single" w:sz="2" w:space="0" w:color="000000"/>
@@ -15288,7 +15129,7 @@
         </w:tc>
         <w:tc>
           <w:tcPr>
-            <w:tcW w:w="6247" w:type="dxa"/>
+            <w:tcW w:w="6248" w:type="dxa"/>
             <w:tcBorders>
               <w:left w:val="single" w:sz="2" w:space="0" w:color="000000"/>
               <w:bottom w:val="single" w:sz="2" w:space="0" w:color="000000"/>
@@ -15318,7 +15159,7 @@
         <w:trPr/>
         <w:tc>
           <w:tcPr>
-            <w:tcW w:w="3399" w:type="dxa"/>
+            <w:tcW w:w="3398" w:type="dxa"/>
             <w:tcBorders>
               <w:left w:val="single" w:sz="2" w:space="0" w:color="000000"/>
               <w:bottom w:val="single" w:sz="2" w:space="0" w:color="000000"/>
@@ -15344,7 +15185,7 @@
         </w:tc>
         <w:tc>
           <w:tcPr>
-            <w:tcW w:w="6247" w:type="dxa"/>
+            <w:tcW w:w="6248" w:type="dxa"/>
             <w:tcBorders>
               <w:left w:val="single" w:sz="2" w:space="0" w:color="000000"/>
               <w:bottom w:val="single" w:sz="2" w:space="0" w:color="000000"/>
@@ -15374,7 +15215,7 @@
         <w:trPr/>
         <w:tc>
           <w:tcPr>
-            <w:tcW w:w="3399" w:type="dxa"/>
+            <w:tcW w:w="3398" w:type="dxa"/>
             <w:tcBorders>
               <w:left w:val="single" w:sz="2" w:space="0" w:color="000000"/>
               <w:bottom w:val="single" w:sz="2" w:space="0" w:color="000000"/>
@@ -15400,7 +15241,7 @@
         </w:tc>
         <w:tc>
           <w:tcPr>
-            <w:tcW w:w="6247" w:type="dxa"/>
+            <w:tcW w:w="6248" w:type="dxa"/>
             <w:tcBorders>
               <w:left w:val="single" w:sz="2" w:space="0" w:color="000000"/>
               <w:bottom w:val="single" w:sz="2" w:space="0" w:color="000000"/>
@@ -15430,7 +15271,7 @@
         <w:trPr/>
         <w:tc>
           <w:tcPr>
-            <w:tcW w:w="3399" w:type="dxa"/>
+            <w:tcW w:w="3398" w:type="dxa"/>
             <w:tcBorders>
               <w:left w:val="single" w:sz="2" w:space="0" w:color="000000"/>
               <w:bottom w:val="single" w:sz="2" w:space="0" w:color="000000"/>
@@ -15456,7 +15297,7 @@
         </w:tc>
         <w:tc>
           <w:tcPr>
-            <w:tcW w:w="6247" w:type="dxa"/>
+            <w:tcW w:w="6248" w:type="dxa"/>
             <w:tcBorders>
               <w:left w:val="single" w:sz="2" w:space="0" w:color="000000"/>
               <w:bottom w:val="single" w:sz="2" w:space="0" w:color="000000"/>
@@ -15486,7 +15327,7 @@
         <w:trPr/>
         <w:tc>
           <w:tcPr>
-            <w:tcW w:w="3399" w:type="dxa"/>
+            <w:tcW w:w="3398" w:type="dxa"/>
             <w:tcBorders>
               <w:left w:val="single" w:sz="2" w:space="0" w:color="000000"/>
               <w:bottom w:val="single" w:sz="2" w:space="0" w:color="000000"/>
@@ -15510,7 +15351,7 @@
         </w:tc>
         <w:tc>
           <w:tcPr>
-            <w:tcW w:w="6247" w:type="dxa"/>
+            <w:tcW w:w="6248" w:type="dxa"/>
             <w:tcBorders>
               <w:left w:val="single" w:sz="2" w:space="0" w:color="000000"/>
               <w:bottom w:val="single" w:sz="2" w:space="0" w:color="000000"/>
@@ -15538,7 +15379,7 @@
         <w:trPr/>
         <w:tc>
           <w:tcPr>
-            <w:tcW w:w="3399" w:type="dxa"/>
+            <w:tcW w:w="3398" w:type="dxa"/>
             <w:tcBorders>
               <w:left w:val="single" w:sz="2" w:space="0" w:color="000000"/>
               <w:bottom w:val="single" w:sz="2" w:space="0" w:color="000000"/>
@@ -15573,7 +15414,7 @@
         </w:tc>
         <w:tc>
           <w:tcPr>
-            <w:tcW w:w="6247" w:type="dxa"/>
+            <w:tcW w:w="6248" w:type="dxa"/>
             <w:tcBorders>
               <w:left w:val="single" w:sz="2" w:space="0" w:color="000000"/>
               <w:bottom w:val="single" w:sz="2" w:space="0" w:color="000000"/>
@@ -15601,7 +15442,7 @@
         <w:trPr/>
         <w:tc>
           <w:tcPr>
-            <w:tcW w:w="3399" w:type="dxa"/>
+            <w:tcW w:w="3398" w:type="dxa"/>
             <w:tcBorders>
               <w:left w:val="single" w:sz="2" w:space="0" w:color="000000"/>
               <w:bottom w:val="single" w:sz="2" w:space="0" w:color="000000"/>
@@ -15636,7 +15477,7 @@
         </w:tc>
         <w:tc>
           <w:tcPr>
-            <w:tcW w:w="6247" w:type="dxa"/>
+            <w:tcW w:w="6248" w:type="dxa"/>
             <w:tcBorders>
               <w:left w:val="single" w:sz="2" w:space="0" w:color="000000"/>
               <w:bottom w:val="single" w:sz="2" w:space="0" w:color="000000"/>
@@ -15662,7 +15503,7 @@
         <w:trPr/>
         <w:tc>
           <w:tcPr>
-            <w:tcW w:w="3399" w:type="dxa"/>
+            <w:tcW w:w="3398" w:type="dxa"/>
             <w:tcBorders>
               <w:left w:val="single" w:sz="2" w:space="0" w:color="000000"/>
               <w:bottom w:val="single" w:sz="2" w:space="0" w:color="000000"/>
@@ -15686,7 +15527,7 @@
         </w:tc>
         <w:tc>
           <w:tcPr>
-            <w:tcW w:w="6247" w:type="dxa"/>
+            <w:tcW w:w="6248" w:type="dxa"/>
             <w:tcBorders>
               <w:left w:val="single" w:sz="2" w:space="0" w:color="000000"/>
               <w:bottom w:val="single" w:sz="2" w:space="0" w:color="000000"/>
@@ -15714,7 +15555,7 @@
         <w:trPr/>
         <w:tc>
           <w:tcPr>
-            <w:tcW w:w="3399" w:type="dxa"/>
+            <w:tcW w:w="3398" w:type="dxa"/>
             <w:tcBorders>
               <w:left w:val="single" w:sz="2" w:space="0" w:color="000000"/>
               <w:bottom w:val="single" w:sz="2" w:space="0" w:color="000000"/>
@@ -15738,7 +15579,7 @@
         </w:tc>
         <w:tc>
           <w:tcPr>
-            <w:tcW w:w="6247" w:type="dxa"/>
+            <w:tcW w:w="6248" w:type="dxa"/>
             <w:tcBorders>
               <w:left w:val="single" w:sz="2" w:space="0" w:color="000000"/>
               <w:bottom w:val="single" w:sz="2" w:space="0" w:color="000000"/>
@@ -15766,7 +15607,7 @@
         <w:trPr/>
         <w:tc>
           <w:tcPr>
-            <w:tcW w:w="3399" w:type="dxa"/>
+            <w:tcW w:w="3398" w:type="dxa"/>
             <w:tcBorders>
               <w:left w:val="single" w:sz="2" w:space="0" w:color="000000"/>
               <w:bottom w:val="single" w:sz="2" w:space="0" w:color="000000"/>
@@ -15790,7 +15631,7 @@
         </w:tc>
         <w:tc>
           <w:tcPr>
-            <w:tcW w:w="6247" w:type="dxa"/>
+            <w:tcW w:w="6248" w:type="dxa"/>
             <w:tcBorders>
               <w:left w:val="single" w:sz="2" w:space="0" w:color="000000"/>
               <w:bottom w:val="single" w:sz="2" w:space="0" w:color="000000"/>
@@ -15816,7 +15657,7 @@
         <w:trPr/>
         <w:tc>
           <w:tcPr>
-            <w:tcW w:w="3399" w:type="dxa"/>
+            <w:tcW w:w="3398" w:type="dxa"/>
             <w:tcBorders>
               <w:left w:val="single" w:sz="2" w:space="0" w:color="000000"/>
               <w:bottom w:val="single" w:sz="2" w:space="0" w:color="000000"/>
@@ -15840,7 +15681,7 @@
         </w:tc>
         <w:tc>
           <w:tcPr>
-            <w:tcW w:w="6247" w:type="dxa"/>
+            <w:tcW w:w="6248" w:type="dxa"/>
             <w:tcBorders>
               <w:left w:val="single" w:sz="2" w:space="0" w:color="000000"/>
               <w:bottom w:val="single" w:sz="2" w:space="0" w:color="000000"/>
@@ -15868,7 +15709,7 @@
         <w:trPr/>
         <w:tc>
           <w:tcPr>
-            <w:tcW w:w="3399" w:type="dxa"/>
+            <w:tcW w:w="3398" w:type="dxa"/>
             <w:tcBorders>
               <w:left w:val="single" w:sz="2" w:space="0" w:color="000000"/>
               <w:bottom w:val="single" w:sz="2" w:space="0" w:color="000000"/>
@@ -15892,7 +15733,7 @@
         </w:tc>
         <w:tc>
           <w:tcPr>
-            <w:tcW w:w="6247" w:type="dxa"/>
+            <w:tcW w:w="6248" w:type="dxa"/>
             <w:tcBorders>
               <w:left w:val="single" w:sz="2" w:space="0" w:color="000000"/>
               <w:bottom w:val="single" w:sz="2" w:space="0" w:color="000000"/>
@@ -15920,7 +15761,7 @@
         <w:trPr/>
         <w:tc>
           <w:tcPr>
-            <w:tcW w:w="3399" w:type="dxa"/>
+            <w:tcW w:w="3398" w:type="dxa"/>
             <w:tcBorders>
               <w:left w:val="single" w:sz="2" w:space="0" w:color="000000"/>
               <w:bottom w:val="single" w:sz="2" w:space="0" w:color="000000"/>
@@ -15943,7 +15784,7 @@
         </w:tc>
         <w:tc>
           <w:tcPr>
-            <w:tcW w:w="6247" w:type="dxa"/>
+            <w:tcW w:w="6248" w:type="dxa"/>
             <w:tcBorders>
               <w:left w:val="single" w:sz="2" w:space="0" w:color="000000"/>
               <w:bottom w:val="single" w:sz="2" w:space="0" w:color="000000"/>
@@ -15973,7 +15814,7 @@
         <w:trPr/>
         <w:tc>
           <w:tcPr>
-            <w:tcW w:w="3399" w:type="dxa"/>
+            <w:tcW w:w="3398" w:type="dxa"/>
             <w:tcBorders>
               <w:left w:val="single" w:sz="2" w:space="0" w:color="000000"/>
               <w:bottom w:val="single" w:sz="2" w:space="0" w:color="000000"/>
@@ -15999,7 +15840,7 @@
         </w:tc>
         <w:tc>
           <w:tcPr>
-            <w:tcW w:w="6247" w:type="dxa"/>
+            <w:tcW w:w="6248" w:type="dxa"/>
             <w:tcBorders>
               <w:left w:val="single" w:sz="2" w:space="0" w:color="000000"/>
               <w:bottom w:val="single" w:sz="2" w:space="0" w:color="000000"/>
@@ -16071,14 +15912,14 @@
         </w:tblCellMar>
       </w:tblPr>
       <w:tblGrid>
-        <w:gridCol w:w="2877"/>
-        <w:gridCol w:w="6769"/>
+        <w:gridCol w:w="2876"/>
+        <w:gridCol w:w="6770"/>
       </w:tblGrid>
       <w:tr>
         <w:trPr/>
         <w:tc>
           <w:tcPr>
-            <w:tcW w:w="2877" w:type="dxa"/>
+            <w:tcW w:w="2876" w:type="dxa"/>
             <w:tcBorders>
               <w:top w:val="single" w:sz="2" w:space="0" w:color="000000"/>
               <w:left w:val="single" w:sz="2" w:space="0" w:color="000000"/>
@@ -16105,7 +15946,7 @@
         </w:tc>
         <w:tc>
           <w:tcPr>
-            <w:tcW w:w="6769" w:type="dxa"/>
+            <w:tcW w:w="6770" w:type="dxa"/>
             <w:tcBorders>
               <w:top w:val="single" w:sz="2" w:space="0" w:color="000000"/>
               <w:left w:val="single" w:sz="2" w:space="0" w:color="000000"/>
@@ -16136,7 +15977,7 @@
         <w:trPr/>
         <w:tc>
           <w:tcPr>
-            <w:tcW w:w="2877" w:type="dxa"/>
+            <w:tcW w:w="2876" w:type="dxa"/>
             <w:tcBorders>
               <w:left w:val="single" w:sz="2" w:space="0" w:color="000000"/>
               <w:bottom w:val="single" w:sz="2" w:space="0" w:color="000000"/>
@@ -16162,7 +16003,7 @@
         </w:tc>
         <w:tc>
           <w:tcPr>
-            <w:tcW w:w="6769" w:type="dxa"/>
+            <w:tcW w:w="6770" w:type="dxa"/>
             <w:tcBorders>
               <w:left w:val="single" w:sz="2" w:space="0" w:color="000000"/>
               <w:bottom w:val="single" w:sz="2" w:space="0" w:color="000000"/>
@@ -16201,7 +16042,7 @@
         <w:trPr/>
         <w:tc>
           <w:tcPr>
-            <w:tcW w:w="2877" w:type="dxa"/>
+            <w:tcW w:w="2876" w:type="dxa"/>
             <w:tcBorders>
               <w:left w:val="single" w:sz="2" w:space="0" w:color="000000"/>
               <w:bottom w:val="single" w:sz="2" w:space="0" w:color="000000"/>
@@ -16227,7 +16068,7 @@
         </w:tc>
         <w:tc>
           <w:tcPr>
-            <w:tcW w:w="6769" w:type="dxa"/>
+            <w:tcW w:w="6770" w:type="dxa"/>
             <w:tcBorders>
               <w:left w:val="single" w:sz="2" w:space="0" w:color="000000"/>
               <w:bottom w:val="single" w:sz="2" w:space="0" w:color="000000"/>
@@ -16266,7 +16107,7 @@
         <w:trPr/>
         <w:tc>
           <w:tcPr>
-            <w:tcW w:w="2877" w:type="dxa"/>
+            <w:tcW w:w="2876" w:type="dxa"/>
             <w:tcBorders>
               <w:left w:val="single" w:sz="2" w:space="0" w:color="000000"/>
               <w:bottom w:val="single" w:sz="2" w:space="0" w:color="000000"/>
@@ -16292,7 +16133,7 @@
         </w:tc>
         <w:tc>
           <w:tcPr>
-            <w:tcW w:w="6769" w:type="dxa"/>
+            <w:tcW w:w="6770" w:type="dxa"/>
             <w:tcBorders>
               <w:left w:val="single" w:sz="2" w:space="0" w:color="000000"/>
               <w:bottom w:val="single" w:sz="2" w:space="0" w:color="000000"/>
@@ -16331,7 +16172,7 @@
         <w:trPr/>
         <w:tc>
           <w:tcPr>
-            <w:tcW w:w="2877" w:type="dxa"/>
+            <w:tcW w:w="2876" w:type="dxa"/>
             <w:tcBorders>
               <w:left w:val="single" w:sz="2" w:space="0" w:color="000000"/>
               <w:bottom w:val="single" w:sz="2" w:space="0" w:color="000000"/>
@@ -16354,7 +16195,7 @@
         </w:tc>
         <w:tc>
           <w:tcPr>
-            <w:tcW w:w="6769" w:type="dxa"/>
+            <w:tcW w:w="6770" w:type="dxa"/>
             <w:tcBorders>
               <w:left w:val="single" w:sz="2" w:space="0" w:color="000000"/>
               <w:bottom w:val="single" w:sz="2" w:space="0" w:color="000000"/>
@@ -16406,7 +16247,7 @@
         <w:trPr/>
         <w:tc>
           <w:tcPr>
-            <w:tcW w:w="2877" w:type="dxa"/>
+            <w:tcW w:w="2876" w:type="dxa"/>
             <w:tcBorders>
               <w:left w:val="single" w:sz="2" w:space="0" w:color="000000"/>
               <w:bottom w:val="single" w:sz="2" w:space="0" w:color="000000"/>
@@ -16432,7 +16273,7 @@
         </w:tc>
         <w:tc>
           <w:tcPr>
-            <w:tcW w:w="6769" w:type="dxa"/>
+            <w:tcW w:w="6770" w:type="dxa"/>
             <w:tcBorders>
               <w:left w:val="single" w:sz="2" w:space="0" w:color="000000"/>
               <w:bottom w:val="single" w:sz="2" w:space="0" w:color="000000"/>
@@ -16471,7 +16312,7 @@
         <w:trPr/>
         <w:tc>
           <w:tcPr>
-            <w:tcW w:w="2877" w:type="dxa"/>
+            <w:tcW w:w="2876" w:type="dxa"/>
             <w:tcBorders>
               <w:left w:val="single" w:sz="2" w:space="0" w:color="000000"/>
               <w:bottom w:val="single" w:sz="2" w:space="0" w:color="000000"/>
@@ -16508,7 +16349,7 @@
         </w:tc>
         <w:tc>
           <w:tcPr>
-            <w:tcW w:w="6769" w:type="dxa"/>
+            <w:tcW w:w="6770" w:type="dxa"/>
             <w:tcBorders>
               <w:left w:val="single" w:sz="2" w:space="0" w:color="000000"/>
               <w:bottom w:val="single" w:sz="2" w:space="0" w:color="000000"/>
@@ -16547,7 +16388,7 @@
         <w:trPr/>
         <w:tc>
           <w:tcPr>
-            <w:tcW w:w="2877" w:type="dxa"/>
+            <w:tcW w:w="2876" w:type="dxa"/>
             <w:tcBorders>
               <w:left w:val="single" w:sz="2" w:space="0" w:color="000000"/>
               <w:bottom w:val="single" w:sz="2" w:space="0" w:color="000000"/>
@@ -16584,7 +16425,7 @@
         </w:tc>
         <w:tc>
           <w:tcPr>
-            <w:tcW w:w="6769" w:type="dxa"/>
+            <w:tcW w:w="6770" w:type="dxa"/>
             <w:tcBorders>
               <w:left w:val="single" w:sz="2" w:space="0" w:color="000000"/>
               <w:bottom w:val="single" w:sz="2" w:space="0" w:color="000000"/>
@@ -16623,7 +16464,7 @@
         <w:trPr/>
         <w:tc>
           <w:tcPr>
-            <w:tcW w:w="2877" w:type="dxa"/>
+            <w:tcW w:w="2876" w:type="dxa"/>
             <w:tcBorders>
               <w:left w:val="single" w:sz="2" w:space="0" w:color="000000"/>
               <w:bottom w:val="single" w:sz="2" w:space="0" w:color="000000"/>
@@ -16647,7 +16488,7 @@
         </w:tc>
         <w:tc>
           <w:tcPr>
-            <w:tcW w:w="6769" w:type="dxa"/>
+            <w:tcW w:w="6770" w:type="dxa"/>
             <w:tcBorders>
               <w:left w:val="single" w:sz="2" w:space="0" w:color="000000"/>
               <w:bottom w:val="single" w:sz="2" w:space="0" w:color="000000"/>
@@ -16675,7 +16516,7 @@
         <w:trPr/>
         <w:tc>
           <w:tcPr>
-            <w:tcW w:w="2877" w:type="dxa"/>
+            <w:tcW w:w="2876" w:type="dxa"/>
             <w:tcBorders>
               <w:left w:val="single" w:sz="2" w:space="0" w:color="000000"/>
               <w:bottom w:val="single" w:sz="2" w:space="0" w:color="000000"/>
@@ -16698,7 +16539,7 @@
         </w:tc>
         <w:tc>
           <w:tcPr>
-            <w:tcW w:w="6769" w:type="dxa"/>
+            <w:tcW w:w="6770" w:type="dxa"/>
             <w:tcBorders>
               <w:left w:val="single" w:sz="2" w:space="0" w:color="000000"/>
               <w:bottom w:val="single" w:sz="2" w:space="0" w:color="000000"/>
@@ -16726,7 +16567,7 @@
         <w:trPr/>
         <w:tc>
           <w:tcPr>
-            <w:tcW w:w="2877" w:type="dxa"/>
+            <w:tcW w:w="2876" w:type="dxa"/>
             <w:tcBorders>
               <w:left w:val="single" w:sz="2" w:space="0" w:color="000000"/>
             </w:tcBorders>
@@ -16751,7 +16592,7 @@
         </w:tc>
         <w:tc>
           <w:tcPr>
-            <w:tcW w:w="6769" w:type="dxa"/>
+            <w:tcW w:w="6770" w:type="dxa"/>
             <w:tcBorders>
               <w:left w:val="single" w:sz="2" w:space="0" w:color="000000"/>
               <w:right w:val="single" w:sz="2" w:space="0" w:color="000000"/>
@@ -16778,7 +16619,7 @@
         <w:trPr/>
         <w:tc>
           <w:tcPr>
-            <w:tcW w:w="2877" w:type="dxa"/>
+            <w:tcW w:w="2876" w:type="dxa"/>
             <w:tcBorders>
               <w:left w:val="single" w:sz="2" w:space="0" w:color="000000"/>
             </w:tcBorders>
@@ -16803,7 +16644,7 @@
         </w:tc>
         <w:tc>
           <w:tcPr>
-            <w:tcW w:w="6769" w:type="dxa"/>
+            <w:tcW w:w="6770" w:type="dxa"/>
             <w:tcBorders>
               <w:left w:val="single" w:sz="2" w:space="0" w:color="000000"/>
               <w:right w:val="single" w:sz="2" w:space="0" w:color="000000"/>
@@ -16828,7 +16669,7 @@
         <w:trPr/>
         <w:tc>
           <w:tcPr>
-            <w:tcW w:w="2877" w:type="dxa"/>
+            <w:tcW w:w="2876" w:type="dxa"/>
             <w:tcBorders>
               <w:left w:val="single" w:sz="2" w:space="0" w:color="000000"/>
               <w:bottom w:val="single" w:sz="2" w:space="0" w:color="000000"/>
@@ -16854,7 +16695,7 @@
         </w:tc>
         <w:tc>
           <w:tcPr>
-            <w:tcW w:w="6769" w:type="dxa"/>
+            <w:tcW w:w="6770" w:type="dxa"/>
             <w:tcBorders>
               <w:left w:val="single" w:sz="2" w:space="0" w:color="000000"/>
               <w:bottom w:val="single" w:sz="2" w:space="0" w:color="000000"/>
@@ -18747,7 +18588,7 @@
     <w:qFormat/>
     <w:pPr>
       <w:widowControl/>
-      <w:overflowPunct w:val="false"/>
+      <w:overflowPunct w:val="true"/>
       <w:bidi w:val="0"/>
       <w:jc w:val="left"/>
     </w:pPr>
@@ -19356,6 +19197,20 @@
       <w:szCs w:val="32"/>
     </w:rPr>
   </w:style>
+  <w:style w:type="paragraph" w:styleId="Indholdsfortegnelseoverskrift">
+    <w:name w:val="TOA Heading"/>
+    <w:basedOn w:val="Overskrift"/>
+    <w:pPr>
+      <w:suppressLineNumbers/>
+      <w:ind w:left="0" w:hanging="0"/>
+    </w:pPr>
+    <w:rPr>
+      <w:b/>
+      <w:bCs/>
+      <w:sz w:val="32"/>
+      <w:szCs w:val="32"/>
+    </w:rPr>
+  </w:style>
   <w:style w:type="numbering" w:styleId="WW8Num1">
     <w:name w:val="WW8Num1"/>
     <w:qFormat/>

</xml_diff>

<commit_message>
Removed "even for a sighted person" as requested by Corine
</commit_message>
<xml_diff>
--- a/Documentation/Official Documentation/Brugervejledning for IBOS Nodelæser version 4.0.0.0.docx
+++ b/Documentation/Official Documentation/Brugervejledning for IBOS Nodelæser version 4.0.0.0.docx
@@ -77,7 +77,7 @@
       <w:sdtContent>
         <w:p>
           <w:pPr>
-            <w:pStyle w:val="Indholdsfortegnelseoverskrift"/>
+            <w:pStyle w:val="TOAHeading"/>
             <w:suppressLineNumbers/>
             <w:ind w:left="0" w:hanging="0"/>
             <w:rPr>
@@ -2063,8 +2063,8 @@
       </w:tblPr>
       <w:tblGrid>
         <w:gridCol w:w="1585"/>
-        <w:gridCol w:w="5325"/>
-        <w:gridCol w:w="2737"/>
+        <w:gridCol w:w="5324"/>
+        <w:gridCol w:w="2738"/>
       </w:tblGrid>
       <w:tr>
         <w:trPr>
@@ -2132,7 +2132,7 @@
         </w:tc>
         <w:tc>
           <w:tcPr>
-            <w:tcW w:w="5325" w:type="dxa"/>
+            <w:tcW w:w="5324" w:type="dxa"/>
             <w:tcBorders>
               <w:top w:val="single" w:sz="2" w:space="0" w:color="000000"/>
               <w:left w:val="single" w:sz="2" w:space="0" w:color="000000"/>
@@ -2159,7 +2159,7 @@
         </w:tc>
         <w:tc>
           <w:tcPr>
-            <w:tcW w:w="2737" w:type="dxa"/>
+            <w:tcW w:w="2738" w:type="dxa"/>
             <w:tcBorders>
               <w:top w:val="single" w:sz="2" w:space="0" w:color="000000"/>
               <w:left w:val="single" w:sz="2" w:space="0" w:color="000000"/>
@@ -2216,7 +2216,7 @@
         </w:tc>
         <w:tc>
           <w:tcPr>
-            <w:tcW w:w="5325" w:type="dxa"/>
+            <w:tcW w:w="5324" w:type="dxa"/>
             <w:tcBorders>
               <w:left w:val="single" w:sz="2" w:space="0" w:color="000000"/>
               <w:bottom w:val="single" w:sz="2" w:space="0" w:color="000000"/>
@@ -2254,7 +2254,7 @@
         </w:tc>
         <w:tc>
           <w:tcPr>
-            <w:tcW w:w="2737" w:type="dxa"/>
+            <w:tcW w:w="2738" w:type="dxa"/>
             <w:tcBorders>
               <w:left w:val="single" w:sz="2" w:space="0" w:color="000000"/>
               <w:bottom w:val="single" w:sz="2" w:space="0" w:color="000000"/>
@@ -2308,7 +2308,7 @@
         </w:tc>
         <w:tc>
           <w:tcPr>
-            <w:tcW w:w="5325" w:type="dxa"/>
+            <w:tcW w:w="5324" w:type="dxa"/>
             <w:tcBorders>
               <w:left w:val="single" w:sz="2" w:space="0" w:color="000000"/>
               <w:bottom w:val="single" w:sz="2" w:space="0" w:color="000000"/>
@@ -2351,7 +2351,7 @@
         </w:tc>
         <w:tc>
           <w:tcPr>
-            <w:tcW w:w="2737" w:type="dxa"/>
+            <w:tcW w:w="2738" w:type="dxa"/>
             <w:tcBorders>
               <w:left w:val="single" w:sz="2" w:space="0" w:color="000000"/>
               <w:bottom w:val="single" w:sz="2" w:space="0" w:color="000000"/>
@@ -2405,7 +2405,7 @@
         </w:tc>
         <w:tc>
           <w:tcPr>
-            <w:tcW w:w="5325" w:type="dxa"/>
+            <w:tcW w:w="5324" w:type="dxa"/>
             <w:tcBorders>
               <w:left w:val="single" w:sz="2" w:space="0" w:color="000000"/>
               <w:bottom w:val="single" w:sz="2" w:space="0" w:color="000000"/>
@@ -2446,7 +2446,7 @@
         </w:tc>
         <w:tc>
           <w:tcPr>
-            <w:tcW w:w="2737" w:type="dxa"/>
+            <w:tcW w:w="2738" w:type="dxa"/>
             <w:tcBorders>
               <w:left w:val="single" w:sz="2" w:space="0" w:color="000000"/>
               <w:bottom w:val="single" w:sz="2" w:space="0" w:color="000000"/>
@@ -2517,7 +2517,7 @@
         </w:tc>
         <w:tc>
           <w:tcPr>
-            <w:tcW w:w="5325" w:type="dxa"/>
+            <w:tcW w:w="5324" w:type="dxa"/>
             <w:tcBorders>
               <w:left w:val="single" w:sz="2" w:space="0" w:color="000000"/>
               <w:bottom w:val="single" w:sz="2" w:space="0" w:color="000000"/>
@@ -2543,7 +2543,7 @@
         </w:tc>
         <w:tc>
           <w:tcPr>
-            <w:tcW w:w="2737" w:type="dxa"/>
+            <w:tcW w:w="2738" w:type="dxa"/>
             <w:tcBorders>
               <w:left w:val="single" w:sz="2" w:space="0" w:color="000000"/>
               <w:bottom w:val="single" w:sz="2" w:space="0" w:color="000000"/>
@@ -2599,7 +2599,7 @@
         </w:tc>
         <w:tc>
           <w:tcPr>
-            <w:tcW w:w="5325" w:type="dxa"/>
+            <w:tcW w:w="5324" w:type="dxa"/>
             <w:tcBorders>
               <w:left w:val="single" w:sz="2" w:space="0" w:color="000000"/>
               <w:bottom w:val="single" w:sz="2" w:space="0" w:color="000000"/>
@@ -2625,7 +2625,7 @@
         </w:tc>
         <w:tc>
           <w:tcPr>
-            <w:tcW w:w="2737" w:type="dxa"/>
+            <w:tcW w:w="2738" w:type="dxa"/>
             <w:tcBorders>
               <w:left w:val="single" w:sz="2" w:space="0" w:color="000000"/>
               <w:bottom w:val="single" w:sz="2" w:space="0" w:color="000000"/>
@@ -2681,7 +2681,7 @@
         </w:tc>
         <w:tc>
           <w:tcPr>
-            <w:tcW w:w="5325" w:type="dxa"/>
+            <w:tcW w:w="5324" w:type="dxa"/>
             <w:tcBorders>
               <w:left w:val="single" w:sz="2" w:space="0" w:color="000000"/>
               <w:bottom w:val="single" w:sz="2" w:space="0" w:color="000000"/>
@@ -2707,7 +2707,7 @@
         </w:tc>
         <w:tc>
           <w:tcPr>
-            <w:tcW w:w="2737" w:type="dxa"/>
+            <w:tcW w:w="2738" w:type="dxa"/>
             <w:tcBorders>
               <w:left w:val="single" w:sz="2" w:space="0" w:color="000000"/>
               <w:bottom w:val="single" w:sz="2" w:space="0" w:color="000000"/>
@@ -2763,7 +2763,7 @@
         </w:tc>
         <w:tc>
           <w:tcPr>
-            <w:tcW w:w="5325" w:type="dxa"/>
+            <w:tcW w:w="5324" w:type="dxa"/>
             <w:tcBorders>
               <w:left w:val="single" w:sz="2" w:space="0" w:color="000000"/>
               <w:bottom w:val="single" w:sz="2" w:space="0" w:color="000000"/>
@@ -2794,7 +2794,7 @@
         </w:tc>
         <w:tc>
           <w:tcPr>
-            <w:tcW w:w="2737" w:type="dxa"/>
+            <w:tcW w:w="2738" w:type="dxa"/>
             <w:tcBorders>
               <w:left w:val="single" w:sz="2" w:space="0" w:color="000000"/>
               <w:bottom w:val="single" w:sz="2" w:space="0" w:color="000000"/>
@@ -2854,7 +2854,7 @@
         </w:tc>
         <w:tc>
           <w:tcPr>
-            <w:tcW w:w="5325" w:type="dxa"/>
+            <w:tcW w:w="5324" w:type="dxa"/>
             <w:tcBorders>
               <w:left w:val="single" w:sz="2" w:space="0" w:color="000000"/>
               <w:bottom w:val="single" w:sz="2" w:space="0" w:color="000000"/>
@@ -2884,7 +2884,7 @@
         </w:tc>
         <w:tc>
           <w:tcPr>
-            <w:tcW w:w="2737" w:type="dxa"/>
+            <w:tcW w:w="2738" w:type="dxa"/>
             <w:tcBorders>
               <w:left w:val="single" w:sz="2" w:space="0" w:color="000000"/>
               <w:bottom w:val="single" w:sz="2" w:space="0" w:color="000000"/>
@@ -2948,7 +2948,7 @@
         </w:tc>
         <w:tc>
           <w:tcPr>
-            <w:tcW w:w="5325" w:type="dxa"/>
+            <w:tcW w:w="5324" w:type="dxa"/>
             <w:tcBorders>
               <w:left w:val="single" w:sz="2" w:space="0" w:color="000000"/>
               <w:bottom w:val="single" w:sz="2" w:space="0" w:color="000000"/>
@@ -2978,7 +2978,7 @@
         </w:tc>
         <w:tc>
           <w:tcPr>
-            <w:tcW w:w="2737" w:type="dxa"/>
+            <w:tcW w:w="2738" w:type="dxa"/>
             <w:tcBorders>
               <w:left w:val="single" w:sz="2" w:space="0" w:color="000000"/>
               <w:bottom w:val="single" w:sz="2" w:space="0" w:color="000000"/>
@@ -3042,7 +3042,7 @@
         </w:tc>
         <w:tc>
           <w:tcPr>
-            <w:tcW w:w="5325" w:type="dxa"/>
+            <w:tcW w:w="5324" w:type="dxa"/>
             <w:tcBorders>
               <w:left w:val="single" w:sz="2" w:space="0" w:color="000000"/>
               <w:bottom w:val="single" w:sz="2" w:space="0" w:color="000000"/>
@@ -3072,7 +3072,7 @@
         </w:tc>
         <w:tc>
           <w:tcPr>
-            <w:tcW w:w="2737" w:type="dxa"/>
+            <w:tcW w:w="2738" w:type="dxa"/>
             <w:tcBorders>
               <w:left w:val="single" w:sz="2" w:space="0" w:color="000000"/>
               <w:bottom w:val="single" w:sz="2" w:space="0" w:color="000000"/>
@@ -3135,7 +3135,7 @@
         </w:tc>
         <w:tc>
           <w:tcPr>
-            <w:tcW w:w="5325" w:type="dxa"/>
+            <w:tcW w:w="5324" w:type="dxa"/>
             <w:tcBorders>
               <w:left w:val="single" w:sz="2" w:space="0" w:color="000000"/>
               <w:bottom w:val="single" w:sz="2" w:space="0" w:color="000000"/>
@@ -3163,7 +3163,7 @@
         </w:tc>
         <w:tc>
           <w:tcPr>
-            <w:tcW w:w="2737" w:type="dxa"/>
+            <w:tcW w:w="2738" w:type="dxa"/>
             <w:tcBorders>
               <w:left w:val="single" w:sz="2" w:space="0" w:color="000000"/>
               <w:bottom w:val="single" w:sz="2" w:space="0" w:color="000000"/>
@@ -3221,7 +3221,7 @@
         </w:tc>
         <w:tc>
           <w:tcPr>
-            <w:tcW w:w="5325" w:type="dxa"/>
+            <w:tcW w:w="5324" w:type="dxa"/>
             <w:tcBorders>
               <w:left w:val="single" w:sz="2" w:space="0" w:color="000000"/>
               <w:bottom w:val="single" w:sz="2" w:space="0" w:color="000000"/>
@@ -3247,7 +3247,7 @@
         </w:tc>
         <w:tc>
           <w:tcPr>
-            <w:tcW w:w="2737" w:type="dxa"/>
+            <w:tcW w:w="2738" w:type="dxa"/>
             <w:tcBorders>
               <w:left w:val="single" w:sz="2" w:space="0" w:color="000000"/>
               <w:bottom w:val="single" w:sz="2" w:space="0" w:color="000000"/>
@@ -3303,7 +3303,7 @@
         </w:tc>
         <w:tc>
           <w:tcPr>
-            <w:tcW w:w="5325" w:type="dxa"/>
+            <w:tcW w:w="5324" w:type="dxa"/>
             <w:tcBorders>
               <w:left w:val="single" w:sz="2" w:space="0" w:color="000000"/>
               <w:bottom w:val="single" w:sz="2" w:space="0" w:color="000000"/>
@@ -3329,7 +3329,7 @@
         </w:tc>
         <w:tc>
           <w:tcPr>
-            <w:tcW w:w="2737" w:type="dxa"/>
+            <w:tcW w:w="2738" w:type="dxa"/>
             <w:tcBorders>
               <w:left w:val="single" w:sz="2" w:space="0" w:color="000000"/>
               <w:bottom w:val="single" w:sz="2" w:space="0" w:color="000000"/>
@@ -3385,7 +3385,7 @@
         </w:tc>
         <w:tc>
           <w:tcPr>
-            <w:tcW w:w="5325" w:type="dxa"/>
+            <w:tcW w:w="5324" w:type="dxa"/>
             <w:tcBorders>
               <w:left w:val="single" w:sz="2" w:space="0" w:color="000000"/>
               <w:bottom w:val="single" w:sz="2" w:space="0" w:color="000000"/>
@@ -3411,7 +3411,7 @@
         </w:tc>
         <w:tc>
           <w:tcPr>
-            <w:tcW w:w="2737" w:type="dxa"/>
+            <w:tcW w:w="2738" w:type="dxa"/>
             <w:tcBorders>
               <w:left w:val="single" w:sz="2" w:space="0" w:color="000000"/>
               <w:bottom w:val="single" w:sz="2" w:space="0" w:color="000000"/>
@@ -3467,7 +3467,7 @@
         </w:tc>
         <w:tc>
           <w:tcPr>
-            <w:tcW w:w="5325" w:type="dxa"/>
+            <w:tcW w:w="5324" w:type="dxa"/>
             <w:tcBorders>
               <w:left w:val="single" w:sz="2" w:space="0" w:color="000000"/>
               <w:bottom w:val="single" w:sz="2" w:space="0" w:color="000000"/>
@@ -3493,7 +3493,7 @@
         </w:tc>
         <w:tc>
           <w:tcPr>
-            <w:tcW w:w="2737" w:type="dxa"/>
+            <w:tcW w:w="2738" w:type="dxa"/>
             <w:tcBorders>
               <w:left w:val="single" w:sz="2" w:space="0" w:color="000000"/>
               <w:bottom w:val="single" w:sz="2" w:space="0" w:color="000000"/>
@@ -3549,7 +3549,7 @@
         </w:tc>
         <w:tc>
           <w:tcPr>
-            <w:tcW w:w="5325" w:type="dxa"/>
+            <w:tcW w:w="5324" w:type="dxa"/>
             <w:tcBorders>
               <w:left w:val="single" w:sz="2" w:space="0" w:color="000000"/>
               <w:bottom w:val="single" w:sz="2" w:space="0" w:color="000000"/>
@@ -3572,7 +3572,7 @@
         </w:tc>
         <w:tc>
           <w:tcPr>
-            <w:tcW w:w="2737" w:type="dxa"/>
+            <w:tcW w:w="2738" w:type="dxa"/>
             <w:tcBorders>
               <w:left w:val="single" w:sz="2" w:space="0" w:color="000000"/>
               <w:bottom w:val="single" w:sz="2" w:space="0" w:color="000000"/>
@@ -3628,7 +3628,7 @@
         </w:tc>
         <w:tc>
           <w:tcPr>
-            <w:tcW w:w="5325" w:type="dxa"/>
+            <w:tcW w:w="5324" w:type="dxa"/>
             <w:tcBorders>
               <w:left w:val="single" w:sz="2" w:space="0" w:color="000000"/>
               <w:bottom w:val="single" w:sz="2" w:space="0" w:color="000000"/>
@@ -3654,7 +3654,7 @@
         </w:tc>
         <w:tc>
           <w:tcPr>
-            <w:tcW w:w="2737" w:type="dxa"/>
+            <w:tcW w:w="2738" w:type="dxa"/>
             <w:tcBorders>
               <w:left w:val="single" w:sz="2" w:space="0" w:color="000000"/>
               <w:bottom w:val="single" w:sz="2" w:space="0" w:color="000000"/>
@@ -3710,7 +3710,7 @@
         </w:tc>
         <w:tc>
           <w:tcPr>
-            <w:tcW w:w="5325" w:type="dxa"/>
+            <w:tcW w:w="5324" w:type="dxa"/>
             <w:tcBorders>
               <w:left w:val="single" w:sz="2" w:space="0" w:color="000000"/>
               <w:bottom w:val="single" w:sz="2" w:space="0" w:color="000000"/>
@@ -3736,7 +3736,7 @@
         </w:tc>
         <w:tc>
           <w:tcPr>
-            <w:tcW w:w="2737" w:type="dxa"/>
+            <w:tcW w:w="2738" w:type="dxa"/>
             <w:tcBorders>
               <w:left w:val="single" w:sz="2" w:space="0" w:color="000000"/>
               <w:bottom w:val="single" w:sz="2" w:space="0" w:color="000000"/>
@@ -3792,7 +3792,7 @@
         </w:tc>
         <w:tc>
           <w:tcPr>
-            <w:tcW w:w="5325" w:type="dxa"/>
+            <w:tcW w:w="5324" w:type="dxa"/>
             <w:tcBorders>
               <w:left w:val="single" w:sz="2" w:space="0" w:color="000000"/>
               <w:bottom w:val="single" w:sz="2" w:space="0" w:color="000000"/>
@@ -3819,7 +3819,7 @@
         </w:tc>
         <w:tc>
           <w:tcPr>
-            <w:tcW w:w="2737" w:type="dxa"/>
+            <w:tcW w:w="2738" w:type="dxa"/>
             <w:tcBorders>
               <w:left w:val="single" w:sz="2" w:space="0" w:color="000000"/>
               <w:bottom w:val="single" w:sz="2" w:space="0" w:color="000000"/>
@@ -3876,7 +3876,7 @@
         </w:tc>
         <w:tc>
           <w:tcPr>
-            <w:tcW w:w="5325" w:type="dxa"/>
+            <w:tcW w:w="5324" w:type="dxa"/>
             <w:tcBorders>
               <w:left w:val="single" w:sz="2" w:space="0" w:color="000000"/>
               <w:bottom w:val="single" w:sz="2" w:space="0" w:color="000000"/>
@@ -3903,7 +3903,7 @@
         </w:tc>
         <w:tc>
           <w:tcPr>
-            <w:tcW w:w="2737" w:type="dxa"/>
+            <w:tcW w:w="2738" w:type="dxa"/>
             <w:tcBorders>
               <w:left w:val="single" w:sz="2" w:space="0" w:color="000000"/>
               <w:bottom w:val="single" w:sz="2" w:space="0" w:color="000000"/>
@@ -3960,7 +3960,7 @@
         </w:tc>
         <w:tc>
           <w:tcPr>
-            <w:tcW w:w="5325" w:type="dxa"/>
+            <w:tcW w:w="5324" w:type="dxa"/>
             <w:tcBorders>
               <w:left w:val="single" w:sz="2" w:space="0" w:color="000000"/>
               <w:bottom w:val="single" w:sz="2" w:space="0" w:color="000000"/>
@@ -3987,7 +3987,7 @@
         </w:tc>
         <w:tc>
           <w:tcPr>
-            <w:tcW w:w="2737" w:type="dxa"/>
+            <w:tcW w:w="2738" w:type="dxa"/>
             <w:tcBorders>
               <w:left w:val="single" w:sz="2" w:space="0" w:color="000000"/>
               <w:bottom w:val="single" w:sz="2" w:space="0" w:color="000000"/>
@@ -4041,7 +4041,7 @@
         </w:tc>
         <w:tc>
           <w:tcPr>
-            <w:tcW w:w="5325" w:type="dxa"/>
+            <w:tcW w:w="5324" w:type="dxa"/>
             <w:tcBorders>
               <w:left w:val="single" w:sz="2" w:space="0" w:color="000000"/>
               <w:bottom w:val="single" w:sz="2" w:space="0" w:color="000000"/>
@@ -4068,7 +4068,7 @@
         </w:tc>
         <w:tc>
           <w:tcPr>
-            <w:tcW w:w="2737" w:type="dxa"/>
+            <w:tcW w:w="2738" w:type="dxa"/>
             <w:tcBorders>
               <w:left w:val="single" w:sz="2" w:space="0" w:color="000000"/>
               <w:bottom w:val="single" w:sz="2" w:space="0" w:color="000000"/>
@@ -4125,7 +4125,7 @@
         </w:tc>
         <w:tc>
           <w:tcPr>
-            <w:tcW w:w="5325" w:type="dxa"/>
+            <w:tcW w:w="5324" w:type="dxa"/>
             <w:tcBorders>
               <w:left w:val="single" w:sz="2" w:space="0" w:color="000000"/>
               <w:bottom w:val="single" w:sz="2" w:space="0" w:color="000000"/>
@@ -4149,7 +4149,7 @@
         </w:tc>
         <w:tc>
           <w:tcPr>
-            <w:tcW w:w="2737" w:type="dxa"/>
+            <w:tcW w:w="2738" w:type="dxa"/>
             <w:tcBorders>
               <w:left w:val="single" w:sz="2" w:space="0" w:color="000000"/>
               <w:bottom w:val="single" w:sz="2" w:space="0" w:color="000000"/>
@@ -4208,7 +4208,7 @@
         </w:tc>
         <w:tc>
           <w:tcPr>
-            <w:tcW w:w="5325" w:type="dxa"/>
+            <w:tcW w:w="5324" w:type="dxa"/>
             <w:tcBorders>
               <w:left w:val="single" w:sz="2" w:space="0" w:color="000000"/>
               <w:bottom w:val="single" w:sz="2" w:space="0" w:color="000000"/>
@@ -4236,7 +4236,7 @@
         </w:tc>
         <w:tc>
           <w:tcPr>
-            <w:tcW w:w="2737" w:type="dxa"/>
+            <w:tcW w:w="2738" w:type="dxa"/>
             <w:tcBorders>
               <w:left w:val="single" w:sz="2" w:space="0" w:color="000000"/>
               <w:bottom w:val="single" w:sz="2" w:space="0" w:color="000000"/>
@@ -4294,7 +4294,7 @@
         </w:tc>
         <w:tc>
           <w:tcPr>
-            <w:tcW w:w="5325" w:type="dxa"/>
+            <w:tcW w:w="5324" w:type="dxa"/>
             <w:tcBorders>
               <w:left w:val="single" w:sz="2" w:space="0" w:color="000000"/>
               <w:bottom w:val="single" w:sz="2" w:space="0" w:color="000000"/>
@@ -4322,7 +4322,7 @@
         </w:tc>
         <w:tc>
           <w:tcPr>
-            <w:tcW w:w="2737" w:type="dxa"/>
+            <w:tcW w:w="2738" w:type="dxa"/>
             <w:tcBorders>
               <w:left w:val="single" w:sz="2" w:space="0" w:color="000000"/>
               <w:bottom w:val="single" w:sz="2" w:space="0" w:color="000000"/>
@@ -4384,7 +4384,7 @@
         </w:tc>
         <w:tc>
           <w:tcPr>
-            <w:tcW w:w="5325" w:type="dxa"/>
+            <w:tcW w:w="5324" w:type="dxa"/>
             <w:tcBorders>
               <w:left w:val="single" w:sz="2" w:space="0" w:color="000000"/>
               <w:bottom w:val="single" w:sz="2" w:space="0" w:color="000000"/>
@@ -4414,7 +4414,7 @@
         </w:tc>
         <w:tc>
           <w:tcPr>
-            <w:tcW w:w="2737" w:type="dxa"/>
+            <w:tcW w:w="2738" w:type="dxa"/>
             <w:tcBorders>
               <w:left w:val="single" w:sz="2" w:space="0" w:color="000000"/>
               <w:bottom w:val="single" w:sz="2" w:space="0" w:color="000000"/>
@@ -4479,7 +4479,7 @@
         </w:tc>
         <w:tc>
           <w:tcPr>
-            <w:tcW w:w="5325" w:type="dxa"/>
+            <w:tcW w:w="5324" w:type="dxa"/>
             <w:tcBorders>
               <w:left w:val="single" w:sz="2" w:space="0" w:color="000000"/>
               <w:bottom w:val="single" w:sz="2" w:space="0" w:color="000000"/>
@@ -4509,7 +4509,7 @@
         </w:tc>
         <w:tc>
           <w:tcPr>
-            <w:tcW w:w="2737" w:type="dxa"/>
+            <w:tcW w:w="2738" w:type="dxa"/>
             <w:tcBorders>
               <w:left w:val="single" w:sz="2" w:space="0" w:color="000000"/>
               <w:bottom w:val="single" w:sz="2" w:space="0" w:color="000000"/>
@@ -4574,7 +4574,7 @@
         </w:tc>
         <w:tc>
           <w:tcPr>
-            <w:tcW w:w="5325" w:type="dxa"/>
+            <w:tcW w:w="5324" w:type="dxa"/>
             <w:tcBorders>
               <w:left w:val="single" w:sz="2" w:space="0" w:color="000000"/>
               <w:bottom w:val="single" w:sz="2" w:space="0" w:color="000000"/>
@@ -4604,7 +4604,7 @@
         </w:tc>
         <w:tc>
           <w:tcPr>
-            <w:tcW w:w="2737" w:type="dxa"/>
+            <w:tcW w:w="2738" w:type="dxa"/>
             <w:tcBorders>
               <w:left w:val="single" w:sz="2" w:space="0" w:color="000000"/>
               <w:bottom w:val="single" w:sz="2" w:space="0" w:color="000000"/>
@@ -4669,7 +4669,7 @@
         </w:tc>
         <w:tc>
           <w:tcPr>
-            <w:tcW w:w="5325" w:type="dxa"/>
+            <w:tcW w:w="5324" w:type="dxa"/>
             <w:tcBorders>
               <w:left w:val="single" w:sz="2" w:space="0" w:color="000000"/>
               <w:bottom w:val="single" w:sz="2" w:space="0" w:color="000000"/>
@@ -4699,7 +4699,7 @@
         </w:tc>
         <w:tc>
           <w:tcPr>
-            <w:tcW w:w="2737" w:type="dxa"/>
+            <w:tcW w:w="2738" w:type="dxa"/>
             <w:tcBorders>
               <w:left w:val="single" w:sz="2" w:space="0" w:color="000000"/>
               <w:bottom w:val="single" w:sz="2" w:space="0" w:color="000000"/>
@@ -4764,7 +4764,7 @@
         </w:tc>
         <w:tc>
           <w:tcPr>
-            <w:tcW w:w="5325" w:type="dxa"/>
+            <w:tcW w:w="5324" w:type="dxa"/>
             <w:tcBorders>
               <w:left w:val="single" w:sz="2" w:space="0" w:color="000000"/>
               <w:bottom w:val="single" w:sz="2" w:space="0" w:color="000000"/>
@@ -4794,7 +4794,7 @@
         </w:tc>
         <w:tc>
           <w:tcPr>
-            <w:tcW w:w="2737" w:type="dxa"/>
+            <w:tcW w:w="2738" w:type="dxa"/>
             <w:tcBorders>
               <w:left w:val="single" w:sz="2" w:space="0" w:color="000000"/>
               <w:bottom w:val="single" w:sz="2" w:space="0" w:color="000000"/>
@@ -4855,7 +4855,7 @@
         </w:tc>
         <w:tc>
           <w:tcPr>
-            <w:tcW w:w="5325" w:type="dxa"/>
+            <w:tcW w:w="5324" w:type="dxa"/>
             <w:tcBorders>
               <w:left w:val="single" w:sz="2" w:space="0" w:color="000000"/>
               <w:bottom w:val="single" w:sz="2" w:space="0" w:color="000000"/>
@@ -4893,7 +4893,7 @@
         </w:tc>
         <w:tc>
           <w:tcPr>
-            <w:tcW w:w="2737" w:type="dxa"/>
+            <w:tcW w:w="2738" w:type="dxa"/>
             <w:tcBorders>
               <w:left w:val="single" w:sz="2" w:space="0" w:color="000000"/>
               <w:bottom w:val="single" w:sz="2" w:space="0" w:color="000000"/>
@@ -4952,7 +4952,7 @@
         </w:tc>
         <w:tc>
           <w:tcPr>
-            <w:tcW w:w="5325" w:type="dxa"/>
+            <w:tcW w:w="5324" w:type="dxa"/>
             <w:tcBorders>
               <w:left w:val="single" w:sz="2" w:space="0" w:color="000000"/>
               <w:bottom w:val="single" w:sz="2" w:space="0" w:color="000000"/>
@@ -4990,7 +4990,7 @@
         </w:tc>
         <w:tc>
           <w:tcPr>
-            <w:tcW w:w="2737" w:type="dxa"/>
+            <w:tcW w:w="2738" w:type="dxa"/>
             <w:tcBorders>
               <w:left w:val="single" w:sz="2" w:space="0" w:color="000000"/>
               <w:bottom w:val="single" w:sz="2" w:space="0" w:color="000000"/>
@@ -5049,7 +5049,7 @@
         </w:tc>
         <w:tc>
           <w:tcPr>
-            <w:tcW w:w="5325" w:type="dxa"/>
+            <w:tcW w:w="5324" w:type="dxa"/>
             <w:tcBorders>
               <w:left w:val="single" w:sz="2" w:space="0" w:color="000000"/>
               <w:bottom w:val="single" w:sz="2" w:space="0" w:color="000000"/>
@@ -5092,7 +5092,7 @@
         </w:tc>
         <w:tc>
           <w:tcPr>
-            <w:tcW w:w="2737" w:type="dxa"/>
+            <w:tcW w:w="2738" w:type="dxa"/>
             <w:tcBorders>
               <w:left w:val="single" w:sz="2" w:space="0" w:color="000000"/>
               <w:bottom w:val="single" w:sz="2" w:space="0" w:color="000000"/>
@@ -5151,7 +5151,7 @@
         </w:tc>
         <w:tc>
           <w:tcPr>
-            <w:tcW w:w="5325" w:type="dxa"/>
+            <w:tcW w:w="5324" w:type="dxa"/>
             <w:tcBorders>
               <w:left w:val="single" w:sz="2" w:space="0" w:color="000000"/>
               <w:bottom w:val="single" w:sz="2" w:space="0" w:color="000000"/>
@@ -5194,7 +5194,7 @@
         </w:tc>
         <w:tc>
           <w:tcPr>
-            <w:tcW w:w="2737" w:type="dxa"/>
+            <w:tcW w:w="2738" w:type="dxa"/>
             <w:tcBorders>
               <w:left w:val="single" w:sz="2" w:space="0" w:color="000000"/>
               <w:bottom w:val="single" w:sz="2" w:space="0" w:color="000000"/>
@@ -5253,7 +5253,7 @@
         </w:tc>
         <w:tc>
           <w:tcPr>
-            <w:tcW w:w="5325" w:type="dxa"/>
+            <w:tcW w:w="5324" w:type="dxa"/>
             <w:tcBorders>
               <w:left w:val="single" w:sz="2" w:space="0" w:color="000000"/>
               <w:bottom w:val="single" w:sz="2" w:space="0" w:color="000000"/>
@@ -5279,7 +5279,7 @@
         </w:tc>
         <w:tc>
           <w:tcPr>
-            <w:tcW w:w="2737" w:type="dxa"/>
+            <w:tcW w:w="2738" w:type="dxa"/>
             <w:tcBorders>
               <w:left w:val="single" w:sz="2" w:space="0" w:color="000000"/>
               <w:bottom w:val="single" w:sz="2" w:space="0" w:color="000000"/>
@@ -5335,7 +5335,7 @@
         </w:tc>
         <w:tc>
           <w:tcPr>
-            <w:tcW w:w="5325" w:type="dxa"/>
+            <w:tcW w:w="5324" w:type="dxa"/>
             <w:tcBorders>
               <w:left w:val="single" w:sz="2" w:space="0" w:color="000000"/>
               <w:bottom w:val="single" w:sz="2" w:space="0" w:color="000000"/>
@@ -5361,7 +5361,7 @@
         </w:tc>
         <w:tc>
           <w:tcPr>
-            <w:tcW w:w="2737" w:type="dxa"/>
+            <w:tcW w:w="2738" w:type="dxa"/>
             <w:tcBorders>
               <w:left w:val="single" w:sz="2" w:space="0" w:color="000000"/>
               <w:bottom w:val="single" w:sz="2" w:space="0" w:color="000000"/>
@@ -5417,7 +5417,7 @@
         </w:tc>
         <w:tc>
           <w:tcPr>
-            <w:tcW w:w="5325" w:type="dxa"/>
+            <w:tcW w:w="5324" w:type="dxa"/>
             <w:tcBorders>
               <w:left w:val="single" w:sz="2" w:space="0" w:color="000000"/>
               <w:bottom w:val="single" w:sz="2" w:space="0" w:color="000000"/>
@@ -5455,7 +5455,7 @@
         </w:tc>
         <w:tc>
           <w:tcPr>
-            <w:tcW w:w="2737" w:type="dxa"/>
+            <w:tcW w:w="2738" w:type="dxa"/>
             <w:tcBorders>
               <w:left w:val="single" w:sz="2" w:space="0" w:color="000000"/>
               <w:bottom w:val="single" w:sz="2" w:space="0" w:color="000000"/>
@@ -5515,7 +5515,7 @@
         </w:tc>
         <w:tc>
           <w:tcPr>
-            <w:tcW w:w="5325" w:type="dxa"/>
+            <w:tcW w:w="5324" w:type="dxa"/>
             <w:tcBorders>
               <w:left w:val="single" w:sz="2" w:space="0" w:color="000000"/>
               <w:bottom w:val="single" w:sz="2" w:space="0" w:color="000000"/>
@@ -5564,7 +5564,7 @@
         </w:tc>
         <w:tc>
           <w:tcPr>
-            <w:tcW w:w="2737" w:type="dxa"/>
+            <w:tcW w:w="2738" w:type="dxa"/>
             <w:tcBorders>
               <w:left w:val="single" w:sz="2" w:space="0" w:color="000000"/>
               <w:bottom w:val="single" w:sz="2" w:space="0" w:color="000000"/>
@@ -5624,7 +5624,7 @@
         </w:tc>
         <w:tc>
           <w:tcPr>
-            <w:tcW w:w="5325" w:type="dxa"/>
+            <w:tcW w:w="5324" w:type="dxa"/>
             <w:tcBorders>
               <w:left w:val="single" w:sz="2" w:space="0" w:color="000000"/>
               <w:bottom w:val="single" w:sz="2" w:space="0" w:color="000000"/>
@@ -5647,7 +5647,7 @@
         </w:tc>
         <w:tc>
           <w:tcPr>
-            <w:tcW w:w="2737" w:type="dxa"/>
+            <w:tcW w:w="2738" w:type="dxa"/>
             <w:tcBorders>
               <w:left w:val="single" w:sz="2" w:space="0" w:color="000000"/>
               <w:bottom w:val="single" w:sz="2" w:space="0" w:color="000000"/>
@@ -5703,7 +5703,7 @@
         </w:tc>
         <w:tc>
           <w:tcPr>
-            <w:tcW w:w="5325" w:type="dxa"/>
+            <w:tcW w:w="5324" w:type="dxa"/>
             <w:tcBorders>
               <w:left w:val="single" w:sz="2" w:space="0" w:color="000000"/>
               <w:bottom w:val="single" w:sz="2" w:space="0" w:color="000000"/>
@@ -5729,7 +5729,7 @@
         </w:tc>
         <w:tc>
           <w:tcPr>
-            <w:tcW w:w="2737" w:type="dxa"/>
+            <w:tcW w:w="2738" w:type="dxa"/>
             <w:tcBorders>
               <w:left w:val="single" w:sz="2" w:space="0" w:color="000000"/>
               <w:bottom w:val="single" w:sz="2" w:space="0" w:color="000000"/>
@@ -5785,7 +5785,7 @@
         </w:tc>
         <w:tc>
           <w:tcPr>
-            <w:tcW w:w="5325" w:type="dxa"/>
+            <w:tcW w:w="5324" w:type="dxa"/>
             <w:tcBorders>
               <w:left w:val="single" w:sz="2" w:space="0" w:color="000000"/>
               <w:bottom w:val="single" w:sz="2" w:space="0" w:color="000000"/>
@@ -5863,7 +5863,7 @@
         </w:tc>
         <w:tc>
           <w:tcPr>
-            <w:tcW w:w="2737" w:type="dxa"/>
+            <w:tcW w:w="2738" w:type="dxa"/>
             <w:tcBorders>
               <w:left w:val="single" w:sz="2" w:space="0" w:color="000000"/>
               <w:bottom w:val="single" w:sz="2" w:space="0" w:color="000000"/>
@@ -5919,7 +5919,7 @@
         </w:tc>
         <w:tc>
           <w:tcPr>
-            <w:tcW w:w="5325" w:type="dxa"/>
+            <w:tcW w:w="5324" w:type="dxa"/>
             <w:tcBorders>
               <w:left w:val="single" w:sz="2" w:space="0" w:color="000000"/>
               <w:bottom w:val="single" w:sz="2" w:space="0" w:color="000000"/>
@@ -5994,7 +5994,7 @@
         </w:tc>
         <w:tc>
           <w:tcPr>
-            <w:tcW w:w="2737" w:type="dxa"/>
+            <w:tcW w:w="2738" w:type="dxa"/>
             <w:tcBorders>
               <w:left w:val="single" w:sz="2" w:space="0" w:color="000000"/>
               <w:bottom w:val="single" w:sz="2" w:space="0" w:color="000000"/>
@@ -6293,7 +6293,10 @@
         </w:rPr>
       </w:pPr>
       <w:r>
-        <w:rPr/>
+        <w:rPr>
+          <w:rFonts w:cs="Verdana" w:ascii="Verdana" w:hAnsi="Verdana"/>
+          <w:lang w:val="da-DK"/>
+        </w:rPr>
       </w:r>
       <w:r>
         <w:br w:type="page"/>
@@ -6308,7 +6311,10 @@
         </w:rPr>
       </w:pPr>
       <w:r>
-        <w:rPr/>
+        <w:rPr>
+          <w:rFonts w:cs="Verdana" w:ascii="Verdana" w:hAnsi="Verdana"/>
+          <w:lang w:val="da-DK"/>
+        </w:rPr>
       </w:r>
     </w:p>
     <w:p>
@@ -7478,15 +7484,15 @@
         </w:tblCellMar>
       </w:tblPr>
       <w:tblGrid>
-        <w:gridCol w:w="3233"/>
+        <w:gridCol w:w="3232"/>
         <w:gridCol w:w="2309"/>
-        <w:gridCol w:w="4105"/>
+        <w:gridCol w:w="4106"/>
       </w:tblGrid>
       <w:tr>
         <w:trPr/>
         <w:tc>
           <w:tcPr>
-            <w:tcW w:w="3233" w:type="dxa"/>
+            <w:tcW w:w="3232" w:type="dxa"/>
             <w:tcBorders>
               <w:top w:val="single" w:sz="2" w:space="0" w:color="000000"/>
               <w:left w:val="single" w:sz="2" w:space="0" w:color="000000"/>
@@ -7536,7 +7542,7 @@
         </w:tc>
         <w:tc>
           <w:tcPr>
-            <w:tcW w:w="4105" w:type="dxa"/>
+            <w:tcW w:w="4106" w:type="dxa"/>
             <w:tcBorders>
               <w:top w:val="single" w:sz="2" w:space="0" w:color="000000"/>
               <w:left w:val="single" w:sz="2" w:space="0" w:color="000000"/>
@@ -7565,7 +7571,7 @@
         <w:trPr/>
         <w:tc>
           <w:tcPr>
-            <w:tcW w:w="3233" w:type="dxa"/>
+            <w:tcW w:w="3232" w:type="dxa"/>
             <w:tcBorders>
               <w:left w:val="single" w:sz="2" w:space="0" w:color="000000"/>
               <w:bottom w:val="single" w:sz="2" w:space="0" w:color="000000"/>
@@ -7627,7 +7633,7 @@
         </w:tc>
         <w:tc>
           <w:tcPr>
-            <w:tcW w:w="4105" w:type="dxa"/>
+            <w:tcW w:w="4106" w:type="dxa"/>
             <w:tcBorders>
               <w:left w:val="single" w:sz="2" w:space="0" w:color="000000"/>
               <w:bottom w:val="single" w:sz="2" w:space="0" w:color="000000"/>
@@ -7675,7 +7681,7 @@
         <w:trPr/>
         <w:tc>
           <w:tcPr>
-            <w:tcW w:w="3233" w:type="dxa"/>
+            <w:tcW w:w="3232" w:type="dxa"/>
             <w:tcBorders>
               <w:left w:val="single" w:sz="2" w:space="0" w:color="000000"/>
               <w:bottom w:val="single" w:sz="2" w:space="0" w:color="000000"/>
@@ -7748,7 +7754,7 @@
         </w:tc>
         <w:tc>
           <w:tcPr>
-            <w:tcW w:w="4105" w:type="dxa"/>
+            <w:tcW w:w="4106" w:type="dxa"/>
             <w:tcBorders>
               <w:left w:val="single" w:sz="2" w:space="0" w:color="000000"/>
               <w:bottom w:val="single" w:sz="2" w:space="0" w:color="000000"/>
@@ -7787,7 +7793,7 @@
         <w:trPr/>
         <w:tc>
           <w:tcPr>
-            <w:tcW w:w="3233" w:type="dxa"/>
+            <w:tcW w:w="3232" w:type="dxa"/>
             <w:tcBorders>
               <w:left w:val="single" w:sz="2" w:space="0" w:color="000000"/>
               <w:bottom w:val="single" w:sz="2" w:space="0" w:color="000000"/>
@@ -7837,7 +7843,7 @@
         </w:tc>
         <w:tc>
           <w:tcPr>
-            <w:tcW w:w="4105" w:type="dxa"/>
+            <w:tcW w:w="4106" w:type="dxa"/>
             <w:tcBorders>
               <w:left w:val="single" w:sz="2" w:space="0" w:color="000000"/>
               <w:bottom w:val="single" w:sz="2" w:space="0" w:color="000000"/>
@@ -7865,7 +7871,7 @@
         <w:trPr/>
         <w:tc>
           <w:tcPr>
-            <w:tcW w:w="3233" w:type="dxa"/>
+            <w:tcW w:w="3232" w:type="dxa"/>
             <w:tcBorders>
               <w:left w:val="single" w:sz="2" w:space="0" w:color="000000"/>
               <w:bottom w:val="single" w:sz="2" w:space="0" w:color="000000"/>
@@ -7915,7 +7921,7 @@
         </w:tc>
         <w:tc>
           <w:tcPr>
-            <w:tcW w:w="4105" w:type="dxa"/>
+            <w:tcW w:w="4106" w:type="dxa"/>
             <w:tcBorders>
               <w:left w:val="single" w:sz="2" w:space="0" w:color="000000"/>
               <w:bottom w:val="single" w:sz="2" w:space="0" w:color="000000"/>
@@ -7943,7 +7949,7 @@
         <w:trPr/>
         <w:tc>
           <w:tcPr>
-            <w:tcW w:w="3233" w:type="dxa"/>
+            <w:tcW w:w="3232" w:type="dxa"/>
             <w:tcBorders>
               <w:left w:val="single" w:sz="2" w:space="0" w:color="000000"/>
               <w:bottom w:val="single" w:sz="2" w:space="0" w:color="000000"/>
@@ -7991,7 +7997,7 @@
         </w:tc>
         <w:tc>
           <w:tcPr>
-            <w:tcW w:w="4105" w:type="dxa"/>
+            <w:tcW w:w="4106" w:type="dxa"/>
             <w:tcBorders>
               <w:left w:val="single" w:sz="2" w:space="0" w:color="000000"/>
               <w:bottom w:val="single" w:sz="2" w:space="0" w:color="000000"/>
@@ -8100,15 +8106,15 @@
         </w:tblCellMar>
       </w:tblPr>
       <w:tblGrid>
-        <w:gridCol w:w="3233"/>
+        <w:gridCol w:w="3232"/>
         <w:gridCol w:w="2338"/>
-        <w:gridCol w:w="4076"/>
+        <w:gridCol w:w="4077"/>
       </w:tblGrid>
       <w:tr>
         <w:trPr/>
         <w:tc>
           <w:tcPr>
-            <w:tcW w:w="3233" w:type="dxa"/>
+            <w:tcW w:w="3232" w:type="dxa"/>
             <w:tcBorders>
               <w:top w:val="single" w:sz="2" w:space="0" w:color="000000"/>
               <w:left w:val="single" w:sz="2" w:space="0" w:color="000000"/>
@@ -8158,7 +8164,7 @@
         </w:tc>
         <w:tc>
           <w:tcPr>
-            <w:tcW w:w="4076" w:type="dxa"/>
+            <w:tcW w:w="4077" w:type="dxa"/>
             <w:tcBorders>
               <w:top w:val="single" w:sz="2" w:space="0" w:color="000000"/>
               <w:left w:val="single" w:sz="2" w:space="0" w:color="000000"/>
@@ -8187,7 +8193,7 @@
         <w:trPr/>
         <w:tc>
           <w:tcPr>
-            <w:tcW w:w="3233" w:type="dxa"/>
+            <w:tcW w:w="3232" w:type="dxa"/>
             <w:tcBorders>
               <w:left w:val="single" w:sz="2" w:space="0" w:color="000000"/>
               <w:bottom w:val="single" w:sz="2" w:space="0" w:color="000000"/>
@@ -8233,7 +8239,7 @@
         </w:tc>
         <w:tc>
           <w:tcPr>
-            <w:tcW w:w="4076" w:type="dxa"/>
+            <w:tcW w:w="4077" w:type="dxa"/>
             <w:tcBorders>
               <w:left w:val="single" w:sz="2" w:space="0" w:color="000000"/>
               <w:bottom w:val="single" w:sz="2" w:space="0" w:color="000000"/>
@@ -8738,84 +8744,81 @@
     <w:p>
       <w:pPr>
         <w:pStyle w:val="Brdtekst"/>
-        <w:rPr>
+        <w:rPr/>
+      </w:pPr>
+      <w:r>
+        <w:rPr>
+          <w:rFonts w:cs="Verdana" w:ascii="Verdana" w:hAnsi="Verdana"/>
           <w:sz w:val="24"/>
           <w:szCs w:val="24"/>
         </w:rPr>
-      </w:pPr>
-      <w:r>
-        <w:rPr>
-          <w:rFonts w:cs="Verdana" w:ascii="Verdana" w:hAnsi="Verdana"/>
+        <w:t xml:space="preserve">Men selv med denne mulighed for at manøvrere i tid, enkelt-stemmer og enkelt-noder kan det hurtigt blive ganske kompliceret at finde rundt i et stort partitur - ligesom et stort orkesterpartitur meget hurtigt bliver ganske uoverskueligt. </w:t>
+      </w:r>
+    </w:p>
+    <w:p>
+      <w:pPr>
+        <w:pStyle w:val="Brdtekst"/>
+        <w:rPr>
           <w:sz w:val="24"/>
           <w:szCs w:val="24"/>
         </w:rPr>
-        <w:t>Men selv med denne mulighed for at manøvrere i tid, enkelt-stemmer og enkelt-noder kan det hurtigt blive ganske kompliceret at finde rundt i et stort partitur - ligesom et stort orkesterpartitur meget hurtigt bliver ganske uoverskueligt for en seende musiker!</w:t>
-      </w:r>
-    </w:p>
-    <w:p>
-      <w:pPr>
-        <w:pStyle w:val="Brdtekst"/>
-        <w:rPr>
+      </w:pPr>
+      <w:r>
+        <w:rPr>
+          <w:rFonts w:cs="Verdana" w:ascii="Verdana" w:hAnsi="Verdana"/>
           <w:sz w:val="24"/>
           <w:szCs w:val="24"/>
         </w:rPr>
-      </w:pPr>
+        <w:t>Heldigvis indeholder IBOS Nodelæser en mulighed for på detaljeret vis at vælge præcis</w:t>
+      </w:r>
       <w:r>
         <w:rPr>
           <w:rFonts w:cs="Verdana" w:ascii="Verdana" w:hAnsi="Verdana"/>
           <w:sz w:val="24"/>
           <w:szCs w:val="24"/>
-        </w:rPr>
-        <w:t>Heldigvis indeholder IBOS Nodelæser en mulighed for på detaljeret vis at vælge præcis</w:t>
+          <w:lang w:val="da-DK"/>
+        </w:rPr>
+        <w:t>,</w:t>
       </w:r>
       <w:r>
         <w:rPr>
           <w:rFonts w:cs="Verdana" w:ascii="Verdana" w:hAnsi="Verdana"/>
           <w:sz w:val="24"/>
           <w:szCs w:val="24"/>
-          <w:lang w:val="da-DK"/>
-        </w:rPr>
-        <w:t>,</w:t>
+        </w:rPr>
+        <w:t xml:space="preserve"> hvilke stemmer der skal vise</w:t>
       </w:r>
       <w:r>
         <w:rPr>
           <w:rFonts w:cs="Verdana" w:ascii="Verdana" w:hAnsi="Verdana"/>
           <w:sz w:val="24"/>
           <w:szCs w:val="24"/>
-        </w:rPr>
-        <w:t xml:space="preserve"> hvilke stemmer der skal vise</w:t>
+          <w:lang w:val="da-DK"/>
+        </w:rPr>
+        <w:t>s</w:t>
       </w:r>
       <w:r>
         <w:rPr>
           <w:rFonts w:cs="Verdana" w:ascii="Verdana" w:hAnsi="Verdana"/>
           <w:sz w:val="24"/>
           <w:szCs w:val="24"/>
-          <w:lang w:val="da-DK"/>
-        </w:rPr>
-        <w:t>s</w:t>
+        </w:rPr>
+        <w:t xml:space="preserve"> i nodelisten</w:t>
       </w:r>
       <w:r>
         <w:rPr>
           <w:rFonts w:cs="Verdana" w:ascii="Verdana" w:hAnsi="Verdana"/>
           <w:sz w:val="24"/>
           <w:szCs w:val="24"/>
-        </w:rPr>
-        <w:t xml:space="preserve"> i nodelisten</w:t>
+          <w:lang w:val="da-DK"/>
+        </w:rPr>
+        <w:t xml:space="preserve"> samt</w:t>
       </w:r>
       <w:r>
         <w:rPr>
           <w:rFonts w:cs="Verdana" w:ascii="Verdana" w:hAnsi="Verdana"/>
           <w:sz w:val="24"/>
           <w:szCs w:val="24"/>
-          <w:lang w:val="da-DK"/>
-        </w:rPr>
-        <w:t xml:space="preserve"> samt</w:t>
-      </w:r>
-      <w:r>
-        <w:rPr>
-          <w:rFonts w:cs="Verdana" w:ascii="Verdana" w:hAnsi="Verdana"/>
-          <w:sz w:val="24"/>
-          <w:szCs w:val="24"/>
         </w:rPr>
         <w:t xml:space="preserve"> grad af detaljering.</w:t>
       </w:r>
@@ -8840,7 +8843,9 @@
         </w:rPr>
       </w:pPr>
       <w:r>
-        <w:rPr/>
+        <w:rPr>
+          <w:rFonts w:cs="Verdana" w:ascii="Verdana" w:hAnsi="Verdana"/>
+        </w:rPr>
       </w:r>
     </w:p>
     <w:p>
@@ -8852,7 +8857,7 @@
           <w:numId w:val="0"/>
         </w:numPr>
         <w:suppressAutoHyphens w:val="true"/>
-        <w:overflowPunct w:val="false"/>
+        <w:overflowPunct w:val="true"/>
         <w:jc w:val="left"/>
         <w:outlineLvl w:val="1"/>
         <w:rPr>
@@ -8860,7 +8865,9 @@
         </w:rPr>
       </w:pPr>
       <w:r>
-        <w:rPr/>
+        <w:rPr>
+          <w:rFonts w:cs="Verdana" w:ascii="Verdana" w:hAnsi="Verdana"/>
+        </w:rPr>
       </w:r>
       <w:r>
         <w:br w:type="page"/>
@@ -10037,8 +10044,8 @@
         </w:tblCellMar>
       </w:tblPr>
       <w:tblGrid>
-        <w:gridCol w:w="2385"/>
-        <w:gridCol w:w="7261"/>
+        <w:gridCol w:w="2384"/>
+        <w:gridCol w:w="7262"/>
       </w:tblGrid>
       <w:tr>
         <w:trPr>
@@ -10046,7 +10053,7 @@
         </w:trPr>
         <w:tc>
           <w:tcPr>
-            <w:tcW w:w="2385" w:type="dxa"/>
+            <w:tcW w:w="2384" w:type="dxa"/>
             <w:tcBorders>
               <w:top w:val="single" w:sz="2" w:space="0" w:color="000000"/>
               <w:left w:val="single" w:sz="2" w:space="0" w:color="000000"/>
@@ -10073,7 +10080,7 @@
         </w:tc>
         <w:tc>
           <w:tcPr>
-            <w:tcW w:w="7261" w:type="dxa"/>
+            <w:tcW w:w="7262" w:type="dxa"/>
             <w:tcBorders>
               <w:top w:val="single" w:sz="2" w:space="0" w:color="000000"/>
               <w:left w:val="single" w:sz="2" w:space="0" w:color="000000"/>
@@ -10101,7 +10108,7 @@
         <w:trPr/>
         <w:tc>
           <w:tcPr>
-            <w:tcW w:w="2385" w:type="dxa"/>
+            <w:tcW w:w="2384" w:type="dxa"/>
             <w:tcBorders>
               <w:left w:val="single" w:sz="2" w:space="0" w:color="000000"/>
               <w:bottom w:val="single" w:sz="2" w:space="0" w:color="000000"/>
@@ -10126,7 +10133,7 @@
         </w:tc>
         <w:tc>
           <w:tcPr>
-            <w:tcW w:w="7261" w:type="dxa"/>
+            <w:tcW w:w="7262" w:type="dxa"/>
             <w:tcBorders>
               <w:left w:val="single" w:sz="2" w:space="0" w:color="000000"/>
               <w:bottom w:val="single" w:sz="2" w:space="0" w:color="000000"/>
@@ -10154,7 +10161,7 @@
         <w:trPr/>
         <w:tc>
           <w:tcPr>
-            <w:tcW w:w="2385" w:type="dxa"/>
+            <w:tcW w:w="2384" w:type="dxa"/>
             <w:tcBorders>
               <w:left w:val="single" w:sz="2" w:space="0" w:color="000000"/>
               <w:bottom w:val="single" w:sz="2" w:space="0" w:color="000000"/>
@@ -10179,7 +10186,7 @@
         </w:tc>
         <w:tc>
           <w:tcPr>
-            <w:tcW w:w="7261" w:type="dxa"/>
+            <w:tcW w:w="7262" w:type="dxa"/>
             <w:tcBorders>
               <w:left w:val="single" w:sz="2" w:space="0" w:color="000000"/>
               <w:bottom w:val="single" w:sz="2" w:space="0" w:color="000000"/>
@@ -10205,7 +10212,7 @@
         <w:trPr/>
         <w:tc>
           <w:tcPr>
-            <w:tcW w:w="2385" w:type="dxa"/>
+            <w:tcW w:w="2384" w:type="dxa"/>
             <w:tcBorders>
               <w:left w:val="single" w:sz="2" w:space="0" w:color="000000"/>
               <w:bottom w:val="single" w:sz="2" w:space="0" w:color="000000"/>
@@ -10230,7 +10237,7 @@
         </w:tc>
         <w:tc>
           <w:tcPr>
-            <w:tcW w:w="7261" w:type="dxa"/>
+            <w:tcW w:w="7262" w:type="dxa"/>
             <w:tcBorders>
               <w:left w:val="single" w:sz="2" w:space="0" w:color="000000"/>
               <w:bottom w:val="single" w:sz="2" w:space="0" w:color="000000"/>
@@ -10269,7 +10276,7 @@
         <w:trPr/>
         <w:tc>
           <w:tcPr>
-            <w:tcW w:w="2385" w:type="dxa"/>
+            <w:tcW w:w="2384" w:type="dxa"/>
             <w:tcBorders>
               <w:left w:val="single" w:sz="2" w:space="0" w:color="000000"/>
               <w:bottom w:val="single" w:sz="2" w:space="0" w:color="000000"/>
@@ -10294,7 +10301,7 @@
         </w:tc>
         <w:tc>
           <w:tcPr>
-            <w:tcW w:w="7261" w:type="dxa"/>
+            <w:tcW w:w="7262" w:type="dxa"/>
             <w:tcBorders>
               <w:left w:val="single" w:sz="2" w:space="0" w:color="000000"/>
               <w:bottom w:val="single" w:sz="2" w:space="0" w:color="000000"/>
@@ -10320,7 +10327,7 @@
         <w:trPr/>
         <w:tc>
           <w:tcPr>
-            <w:tcW w:w="2385" w:type="dxa"/>
+            <w:tcW w:w="2384" w:type="dxa"/>
             <w:tcBorders>
               <w:left w:val="single" w:sz="2" w:space="0" w:color="000000"/>
               <w:bottom w:val="single" w:sz="2" w:space="0" w:color="000000"/>
@@ -10345,7 +10352,7 @@
         </w:tc>
         <w:tc>
           <w:tcPr>
-            <w:tcW w:w="7261" w:type="dxa"/>
+            <w:tcW w:w="7262" w:type="dxa"/>
             <w:tcBorders>
               <w:left w:val="single" w:sz="2" w:space="0" w:color="000000"/>
               <w:bottom w:val="single" w:sz="2" w:space="0" w:color="000000"/>
@@ -10371,7 +10378,7 @@
         <w:trPr/>
         <w:tc>
           <w:tcPr>
-            <w:tcW w:w="2385" w:type="dxa"/>
+            <w:tcW w:w="2384" w:type="dxa"/>
             <w:tcBorders>
               <w:left w:val="single" w:sz="2" w:space="0" w:color="000000"/>
               <w:bottom w:val="single" w:sz="2" w:space="0" w:color="000000"/>
@@ -10396,7 +10403,7 @@
         </w:tc>
         <w:tc>
           <w:tcPr>
-            <w:tcW w:w="7261" w:type="dxa"/>
+            <w:tcW w:w="7262" w:type="dxa"/>
             <w:tcBorders>
               <w:left w:val="single" w:sz="2" w:space="0" w:color="000000"/>
               <w:bottom w:val="single" w:sz="2" w:space="0" w:color="000000"/>
@@ -10424,7 +10431,7 @@
         <w:trPr/>
         <w:tc>
           <w:tcPr>
-            <w:tcW w:w="2385" w:type="dxa"/>
+            <w:tcW w:w="2384" w:type="dxa"/>
             <w:tcBorders>
               <w:left w:val="single" w:sz="2" w:space="0" w:color="000000"/>
               <w:bottom w:val="single" w:sz="2" w:space="0" w:color="000000"/>
@@ -10449,7 +10456,7 @@
         </w:tc>
         <w:tc>
           <w:tcPr>
-            <w:tcW w:w="7261" w:type="dxa"/>
+            <w:tcW w:w="7262" w:type="dxa"/>
             <w:tcBorders>
               <w:left w:val="single" w:sz="2" w:space="0" w:color="000000"/>
               <w:bottom w:val="single" w:sz="2" w:space="0" w:color="000000"/>
@@ -10475,7 +10482,7 @@
         <w:trPr/>
         <w:tc>
           <w:tcPr>
-            <w:tcW w:w="2385" w:type="dxa"/>
+            <w:tcW w:w="2384" w:type="dxa"/>
             <w:tcBorders>
               <w:left w:val="single" w:sz="2" w:space="0" w:color="000000"/>
               <w:bottom w:val="single" w:sz="2" w:space="0" w:color="000000"/>
@@ -10496,21 +10503,13 @@
                 <w:sz w:val="24"/>
                 <w:szCs w:val="24"/>
               </w:rPr>
-              <w:t>Meta informat</w:t>
-            </w:r>
-            <w:r>
-              <w:rPr>
-                <w:rFonts w:cs="Verdana" w:ascii="Verdana" w:hAnsi="Verdana"/>
-                <w:sz w:val="24"/>
-                <w:szCs w:val="24"/>
-              </w:rPr>
-              <w:t>in</w:t>
-            </w:r>
-          </w:p>
-        </w:tc>
-        <w:tc>
-          <w:tcPr>
-            <w:tcW w:w="7261" w:type="dxa"/>
+              <w:t>Meta informatin</w:t>
+            </w:r>
+          </w:p>
+        </w:tc>
+        <w:tc>
+          <w:tcPr>
+            <w:tcW w:w="7262" w:type="dxa"/>
             <w:tcBorders>
               <w:left w:val="single" w:sz="2" w:space="0" w:color="000000"/>
               <w:bottom w:val="single" w:sz="2" w:space="0" w:color="000000"/>
@@ -12265,14 +12264,14 @@
         </w:tblCellMar>
       </w:tblPr>
       <w:tblGrid>
-        <w:gridCol w:w="2379"/>
-        <w:gridCol w:w="7271"/>
+        <w:gridCol w:w="2378"/>
+        <w:gridCol w:w="7272"/>
       </w:tblGrid>
       <w:tr>
         <w:trPr/>
         <w:tc>
           <w:tcPr>
-            <w:tcW w:w="2379" w:type="dxa"/>
+            <w:tcW w:w="2378" w:type="dxa"/>
             <w:tcBorders>
               <w:top w:val="single" w:sz="2" w:space="0" w:color="000000"/>
               <w:left w:val="single" w:sz="2" w:space="0" w:color="000000"/>
@@ -12308,7 +12307,7 @@
         </w:tc>
         <w:tc>
           <w:tcPr>
-            <w:tcW w:w="7271" w:type="dxa"/>
+            <w:tcW w:w="7272" w:type="dxa"/>
             <w:tcBorders>
               <w:top w:val="single" w:sz="2" w:space="0" w:color="000000"/>
               <w:left w:val="single" w:sz="2" w:space="0" w:color="000000"/>
@@ -12338,7 +12337,7 @@
         <w:trPr/>
         <w:tc>
           <w:tcPr>
-            <w:tcW w:w="2379" w:type="dxa"/>
+            <w:tcW w:w="2378" w:type="dxa"/>
             <w:tcBorders>
               <w:left w:val="single" w:sz="2" w:space="0" w:color="000000"/>
               <w:bottom w:val="single" w:sz="2" w:space="0" w:color="000000"/>
@@ -12373,7 +12372,7 @@
         </w:tc>
         <w:tc>
           <w:tcPr>
-            <w:tcW w:w="7271" w:type="dxa"/>
+            <w:tcW w:w="7272" w:type="dxa"/>
             <w:tcBorders>
               <w:left w:val="single" w:sz="2" w:space="0" w:color="000000"/>
               <w:bottom w:val="single" w:sz="2" w:space="0" w:color="000000"/>
@@ -13399,14 +13398,14 @@
         </w:tblCellMar>
       </w:tblPr>
       <w:tblGrid>
-        <w:gridCol w:w="1644"/>
-        <w:gridCol w:w="8006"/>
+        <w:gridCol w:w="1643"/>
+        <w:gridCol w:w="8007"/>
       </w:tblGrid>
       <w:tr>
         <w:trPr/>
         <w:tc>
           <w:tcPr>
-            <w:tcW w:w="1644" w:type="dxa"/>
+            <w:tcW w:w="1643" w:type="dxa"/>
             <w:tcBorders>
               <w:top w:val="single" w:sz="2" w:space="0" w:color="000000"/>
               <w:left w:val="single" w:sz="2" w:space="0" w:color="000000"/>
@@ -13454,7 +13453,7 @@
         </w:tc>
         <w:tc>
           <w:tcPr>
-            <w:tcW w:w="8006" w:type="dxa"/>
+            <w:tcW w:w="8007" w:type="dxa"/>
             <w:tcBorders>
               <w:top w:val="single" w:sz="2" w:space="0" w:color="000000"/>
               <w:left w:val="single" w:sz="2" w:space="0" w:color="000000"/>
@@ -13514,7 +13513,7 @@
         <w:trPr/>
         <w:tc>
           <w:tcPr>
-            <w:tcW w:w="1644" w:type="dxa"/>
+            <w:tcW w:w="1643" w:type="dxa"/>
             <w:tcBorders>
               <w:left w:val="single" w:sz="2" w:space="0" w:color="000000"/>
               <w:bottom w:val="single" w:sz="2" w:space="0" w:color="000000"/>
@@ -13554,7 +13553,7 @@
         </w:tc>
         <w:tc>
           <w:tcPr>
-            <w:tcW w:w="8006" w:type="dxa"/>
+            <w:tcW w:w="8007" w:type="dxa"/>
             <w:tcBorders>
               <w:left w:val="single" w:sz="2" w:space="0" w:color="000000"/>
               <w:bottom w:val="single" w:sz="2" w:space="0" w:color="000000"/>
@@ -13653,7 +13652,7 @@
           <w:numId w:val="3"/>
         </w:numPr>
         <w:suppressAutoHyphens w:val="true"/>
-        <w:overflowPunct w:val="false"/>
+        <w:overflowPunct w:val="true"/>
         <w:bidi w:val="0"/>
         <w:spacing w:before="200" w:after="120"/>
         <w:ind w:left="510" w:right="0" w:hanging="578"/>
@@ -14987,14 +14986,14 @@
         </w:tblCellMar>
       </w:tblPr>
       <w:tblGrid>
-        <w:gridCol w:w="3395"/>
-        <w:gridCol w:w="6251"/>
+        <w:gridCol w:w="3394"/>
+        <w:gridCol w:w="6252"/>
       </w:tblGrid>
       <w:tr>
         <w:trPr/>
         <w:tc>
           <w:tcPr>
-            <w:tcW w:w="3395" w:type="dxa"/>
+            <w:tcW w:w="3394" w:type="dxa"/>
             <w:tcBorders>
               <w:top w:val="single" w:sz="2" w:space="0" w:color="000000"/>
               <w:left w:val="single" w:sz="2" w:space="0" w:color="000000"/>
@@ -15021,7 +15020,7 @@
         </w:tc>
         <w:tc>
           <w:tcPr>
-            <w:tcW w:w="6251" w:type="dxa"/>
+            <w:tcW w:w="6252" w:type="dxa"/>
             <w:tcBorders>
               <w:top w:val="single" w:sz="2" w:space="0" w:color="000000"/>
               <w:left w:val="single" w:sz="2" w:space="0" w:color="000000"/>
@@ -15052,7 +15051,7 @@
         <w:trPr/>
         <w:tc>
           <w:tcPr>
-            <w:tcW w:w="3395" w:type="dxa"/>
+            <w:tcW w:w="3394" w:type="dxa"/>
             <w:tcBorders>
               <w:left w:val="single" w:sz="2" w:space="0" w:color="000000"/>
               <w:bottom w:val="single" w:sz="2" w:space="0" w:color="000000"/>
@@ -15076,7 +15075,7 @@
         </w:tc>
         <w:tc>
           <w:tcPr>
-            <w:tcW w:w="6251" w:type="dxa"/>
+            <w:tcW w:w="6252" w:type="dxa"/>
             <w:tcBorders>
               <w:left w:val="single" w:sz="2" w:space="0" w:color="000000"/>
               <w:bottom w:val="single" w:sz="2" w:space="0" w:color="000000"/>
@@ -15104,7 +15103,7 @@
         <w:trPr/>
         <w:tc>
           <w:tcPr>
-            <w:tcW w:w="3395" w:type="dxa"/>
+            <w:tcW w:w="3394" w:type="dxa"/>
             <w:tcBorders>
               <w:left w:val="single" w:sz="2" w:space="0" w:color="000000"/>
               <w:bottom w:val="single" w:sz="2" w:space="0" w:color="000000"/>
@@ -15128,7 +15127,7 @@
         </w:tc>
         <w:tc>
           <w:tcPr>
-            <w:tcW w:w="6251" w:type="dxa"/>
+            <w:tcW w:w="6252" w:type="dxa"/>
             <w:tcBorders>
               <w:left w:val="single" w:sz="2" w:space="0" w:color="000000"/>
               <w:bottom w:val="single" w:sz="2" w:space="0" w:color="000000"/>
@@ -15156,7 +15155,7 @@
         <w:trPr/>
         <w:tc>
           <w:tcPr>
-            <w:tcW w:w="3395" w:type="dxa"/>
+            <w:tcW w:w="3394" w:type="dxa"/>
             <w:tcBorders>
               <w:left w:val="single" w:sz="2" w:space="0" w:color="000000"/>
               <w:bottom w:val="single" w:sz="2" w:space="0" w:color="000000"/>
@@ -15181,7 +15180,7 @@
         </w:tc>
         <w:tc>
           <w:tcPr>
-            <w:tcW w:w="6251" w:type="dxa"/>
+            <w:tcW w:w="6252" w:type="dxa"/>
             <w:tcBorders>
               <w:left w:val="single" w:sz="2" w:space="0" w:color="000000"/>
               <w:bottom w:val="single" w:sz="2" w:space="0" w:color="000000"/>
@@ -15211,7 +15210,7 @@
         <w:trPr/>
         <w:tc>
           <w:tcPr>
-            <w:tcW w:w="3395" w:type="dxa"/>
+            <w:tcW w:w="3394" w:type="dxa"/>
             <w:tcBorders>
               <w:left w:val="single" w:sz="2" w:space="0" w:color="000000"/>
               <w:bottom w:val="single" w:sz="2" w:space="0" w:color="000000"/>
@@ -15237,7 +15236,7 @@
         </w:tc>
         <w:tc>
           <w:tcPr>
-            <w:tcW w:w="6251" w:type="dxa"/>
+            <w:tcW w:w="6252" w:type="dxa"/>
             <w:tcBorders>
               <w:left w:val="single" w:sz="2" w:space="0" w:color="000000"/>
               <w:bottom w:val="single" w:sz="2" w:space="0" w:color="000000"/>
@@ -15267,7 +15266,7 @@
         <w:trPr/>
         <w:tc>
           <w:tcPr>
-            <w:tcW w:w="3395" w:type="dxa"/>
+            <w:tcW w:w="3394" w:type="dxa"/>
             <w:tcBorders>
               <w:left w:val="single" w:sz="2" w:space="0" w:color="000000"/>
               <w:bottom w:val="single" w:sz="2" w:space="0" w:color="000000"/>
@@ -15291,7 +15290,7 @@
         </w:tc>
         <w:tc>
           <w:tcPr>
-            <w:tcW w:w="6251" w:type="dxa"/>
+            <w:tcW w:w="6252" w:type="dxa"/>
             <w:tcBorders>
               <w:left w:val="single" w:sz="2" w:space="0" w:color="000000"/>
               <w:bottom w:val="single" w:sz="2" w:space="0" w:color="000000"/>
@@ -15319,7 +15318,7 @@
         <w:trPr/>
         <w:tc>
           <w:tcPr>
-            <w:tcW w:w="3395" w:type="dxa"/>
+            <w:tcW w:w="3394" w:type="dxa"/>
             <w:tcBorders>
               <w:left w:val="single" w:sz="2" w:space="0" w:color="000000"/>
               <w:bottom w:val="single" w:sz="2" w:space="0" w:color="000000"/>
@@ -15343,7 +15342,7 @@
         </w:tc>
         <w:tc>
           <w:tcPr>
-            <w:tcW w:w="6251" w:type="dxa"/>
+            <w:tcW w:w="6252" w:type="dxa"/>
             <w:tcBorders>
               <w:left w:val="single" w:sz="2" w:space="0" w:color="000000"/>
               <w:bottom w:val="single" w:sz="2" w:space="0" w:color="000000"/>
@@ -15369,7 +15368,7 @@
         <w:trPr/>
         <w:tc>
           <w:tcPr>
-            <w:tcW w:w="3395" w:type="dxa"/>
+            <w:tcW w:w="3394" w:type="dxa"/>
             <w:tcBorders>
               <w:left w:val="single" w:sz="2" w:space="0" w:color="000000"/>
               <w:bottom w:val="single" w:sz="2" w:space="0" w:color="000000"/>
@@ -15393,7 +15392,7 @@
         </w:tc>
         <w:tc>
           <w:tcPr>
-            <w:tcW w:w="6251" w:type="dxa"/>
+            <w:tcW w:w="6252" w:type="dxa"/>
             <w:tcBorders>
               <w:left w:val="single" w:sz="2" w:space="0" w:color="000000"/>
               <w:bottom w:val="single" w:sz="2" w:space="0" w:color="000000"/>
@@ -15432,7 +15431,7 @@
         <w:trPr/>
         <w:tc>
           <w:tcPr>
-            <w:tcW w:w="3395" w:type="dxa"/>
+            <w:tcW w:w="3394" w:type="dxa"/>
             <w:tcBorders>
               <w:left w:val="single" w:sz="2" w:space="0" w:color="000000"/>
               <w:bottom w:val="single" w:sz="2" w:space="0" w:color="000000"/>
@@ -15456,7 +15455,7 @@
         </w:tc>
         <w:tc>
           <w:tcPr>
-            <w:tcW w:w="6251" w:type="dxa"/>
+            <w:tcW w:w="6252" w:type="dxa"/>
             <w:tcBorders>
               <w:left w:val="single" w:sz="2" w:space="0" w:color="000000"/>
               <w:bottom w:val="single" w:sz="2" w:space="0" w:color="000000"/>
@@ -15495,7 +15494,7 @@
         <w:trPr/>
         <w:tc>
           <w:tcPr>
-            <w:tcW w:w="3395" w:type="dxa"/>
+            <w:tcW w:w="3394" w:type="dxa"/>
             <w:tcBorders>
               <w:left w:val="single" w:sz="2" w:space="0" w:color="000000"/>
               <w:bottom w:val="single" w:sz="2" w:space="0" w:color="000000"/>
@@ -15521,7 +15520,7 @@
         </w:tc>
         <w:tc>
           <w:tcPr>
-            <w:tcW w:w="6251" w:type="dxa"/>
+            <w:tcW w:w="6252" w:type="dxa"/>
             <w:tcBorders>
               <w:left w:val="single" w:sz="2" w:space="0" w:color="000000"/>
               <w:bottom w:val="single" w:sz="2" w:space="0" w:color="000000"/>
@@ -15551,7 +15550,7 @@
         <w:trPr/>
         <w:tc>
           <w:tcPr>
-            <w:tcW w:w="3395" w:type="dxa"/>
+            <w:tcW w:w="3394" w:type="dxa"/>
             <w:tcBorders>
               <w:left w:val="single" w:sz="2" w:space="0" w:color="000000"/>
               <w:bottom w:val="single" w:sz="2" w:space="0" w:color="000000"/>
@@ -15577,7 +15576,7 @@
         </w:tc>
         <w:tc>
           <w:tcPr>
-            <w:tcW w:w="6251" w:type="dxa"/>
+            <w:tcW w:w="6252" w:type="dxa"/>
             <w:tcBorders>
               <w:left w:val="single" w:sz="2" w:space="0" w:color="000000"/>
               <w:bottom w:val="single" w:sz="2" w:space="0" w:color="000000"/>
@@ -15607,7 +15606,7 @@
         <w:trPr/>
         <w:tc>
           <w:tcPr>
-            <w:tcW w:w="3395" w:type="dxa"/>
+            <w:tcW w:w="3394" w:type="dxa"/>
             <w:tcBorders>
               <w:left w:val="single" w:sz="2" w:space="0" w:color="000000"/>
               <w:bottom w:val="single" w:sz="2" w:space="0" w:color="000000"/>
@@ -15633,7 +15632,7 @@
         </w:tc>
         <w:tc>
           <w:tcPr>
-            <w:tcW w:w="6251" w:type="dxa"/>
+            <w:tcW w:w="6252" w:type="dxa"/>
             <w:tcBorders>
               <w:left w:val="single" w:sz="2" w:space="0" w:color="000000"/>
               <w:bottom w:val="single" w:sz="2" w:space="0" w:color="000000"/>
@@ -15663,7 +15662,7 @@
         <w:trPr/>
         <w:tc>
           <w:tcPr>
-            <w:tcW w:w="3395" w:type="dxa"/>
+            <w:tcW w:w="3394" w:type="dxa"/>
             <w:tcBorders>
               <w:left w:val="single" w:sz="2" w:space="0" w:color="000000"/>
               <w:bottom w:val="single" w:sz="2" w:space="0" w:color="000000"/>
@@ -15689,7 +15688,7 @@
         </w:tc>
         <w:tc>
           <w:tcPr>
-            <w:tcW w:w="6251" w:type="dxa"/>
+            <w:tcW w:w="6252" w:type="dxa"/>
             <w:tcBorders>
               <w:left w:val="single" w:sz="2" w:space="0" w:color="000000"/>
               <w:bottom w:val="single" w:sz="2" w:space="0" w:color="000000"/>
@@ -15719,7 +15718,7 @@
         <w:trPr/>
         <w:tc>
           <w:tcPr>
-            <w:tcW w:w="3395" w:type="dxa"/>
+            <w:tcW w:w="3394" w:type="dxa"/>
             <w:tcBorders>
               <w:left w:val="single" w:sz="2" w:space="0" w:color="000000"/>
               <w:bottom w:val="single" w:sz="2" w:space="0" w:color="000000"/>
@@ -15743,7 +15742,7 @@
         </w:tc>
         <w:tc>
           <w:tcPr>
-            <w:tcW w:w="6251" w:type="dxa"/>
+            <w:tcW w:w="6252" w:type="dxa"/>
             <w:tcBorders>
               <w:left w:val="single" w:sz="2" w:space="0" w:color="000000"/>
               <w:bottom w:val="single" w:sz="2" w:space="0" w:color="000000"/>
@@ -15771,7 +15770,7 @@
         <w:trPr/>
         <w:tc>
           <w:tcPr>
-            <w:tcW w:w="3395" w:type="dxa"/>
+            <w:tcW w:w="3394" w:type="dxa"/>
             <w:tcBorders>
               <w:left w:val="single" w:sz="2" w:space="0" w:color="000000"/>
               <w:bottom w:val="single" w:sz="2" w:space="0" w:color="000000"/>
@@ -15806,7 +15805,7 @@
         </w:tc>
         <w:tc>
           <w:tcPr>
-            <w:tcW w:w="6251" w:type="dxa"/>
+            <w:tcW w:w="6252" w:type="dxa"/>
             <w:tcBorders>
               <w:left w:val="single" w:sz="2" w:space="0" w:color="000000"/>
               <w:bottom w:val="single" w:sz="2" w:space="0" w:color="000000"/>
@@ -15834,7 +15833,7 @@
         <w:trPr/>
         <w:tc>
           <w:tcPr>
-            <w:tcW w:w="3395" w:type="dxa"/>
+            <w:tcW w:w="3394" w:type="dxa"/>
             <w:tcBorders>
               <w:left w:val="single" w:sz="2" w:space="0" w:color="000000"/>
               <w:bottom w:val="single" w:sz="2" w:space="0" w:color="000000"/>
@@ -15869,7 +15868,7 @@
         </w:tc>
         <w:tc>
           <w:tcPr>
-            <w:tcW w:w="6251" w:type="dxa"/>
+            <w:tcW w:w="6252" w:type="dxa"/>
             <w:tcBorders>
               <w:left w:val="single" w:sz="2" w:space="0" w:color="000000"/>
               <w:bottom w:val="single" w:sz="2" w:space="0" w:color="000000"/>
@@ -15895,7 +15894,7 @@
         <w:trPr/>
         <w:tc>
           <w:tcPr>
-            <w:tcW w:w="3395" w:type="dxa"/>
+            <w:tcW w:w="3394" w:type="dxa"/>
             <w:tcBorders>
               <w:left w:val="single" w:sz="2" w:space="0" w:color="000000"/>
               <w:bottom w:val="single" w:sz="2" w:space="0" w:color="000000"/>
@@ -15919,7 +15918,7 @@
         </w:tc>
         <w:tc>
           <w:tcPr>
-            <w:tcW w:w="6251" w:type="dxa"/>
+            <w:tcW w:w="6252" w:type="dxa"/>
             <w:tcBorders>
               <w:left w:val="single" w:sz="2" w:space="0" w:color="000000"/>
               <w:bottom w:val="single" w:sz="2" w:space="0" w:color="000000"/>
@@ -15947,7 +15946,7 @@
         <w:trPr/>
         <w:tc>
           <w:tcPr>
-            <w:tcW w:w="3395" w:type="dxa"/>
+            <w:tcW w:w="3394" w:type="dxa"/>
             <w:tcBorders>
               <w:left w:val="single" w:sz="2" w:space="0" w:color="000000"/>
               <w:bottom w:val="single" w:sz="2" w:space="0" w:color="000000"/>
@@ -15971,7 +15970,7 @@
         </w:tc>
         <w:tc>
           <w:tcPr>
-            <w:tcW w:w="6251" w:type="dxa"/>
+            <w:tcW w:w="6252" w:type="dxa"/>
             <w:tcBorders>
               <w:left w:val="single" w:sz="2" w:space="0" w:color="000000"/>
               <w:bottom w:val="single" w:sz="2" w:space="0" w:color="000000"/>
@@ -15999,7 +15998,7 @@
         <w:trPr/>
         <w:tc>
           <w:tcPr>
-            <w:tcW w:w="3395" w:type="dxa"/>
+            <w:tcW w:w="3394" w:type="dxa"/>
             <w:tcBorders>
               <w:left w:val="single" w:sz="2" w:space="0" w:color="000000"/>
               <w:bottom w:val="single" w:sz="2" w:space="0" w:color="000000"/>
@@ -16023,7 +16022,7 @@
         </w:tc>
         <w:tc>
           <w:tcPr>
-            <w:tcW w:w="6251" w:type="dxa"/>
+            <w:tcW w:w="6252" w:type="dxa"/>
             <w:tcBorders>
               <w:left w:val="single" w:sz="2" w:space="0" w:color="000000"/>
               <w:bottom w:val="single" w:sz="2" w:space="0" w:color="000000"/>
@@ -16049,7 +16048,7 @@
         <w:trPr/>
         <w:tc>
           <w:tcPr>
-            <w:tcW w:w="3395" w:type="dxa"/>
+            <w:tcW w:w="3394" w:type="dxa"/>
             <w:tcBorders>
               <w:left w:val="single" w:sz="2" w:space="0" w:color="000000"/>
               <w:bottom w:val="single" w:sz="2" w:space="0" w:color="000000"/>
@@ -16073,7 +16072,7 @@
         </w:tc>
         <w:tc>
           <w:tcPr>
-            <w:tcW w:w="6251" w:type="dxa"/>
+            <w:tcW w:w="6252" w:type="dxa"/>
             <w:tcBorders>
               <w:left w:val="single" w:sz="2" w:space="0" w:color="000000"/>
               <w:bottom w:val="single" w:sz="2" w:space="0" w:color="000000"/>
@@ -16101,7 +16100,7 @@
         <w:trPr/>
         <w:tc>
           <w:tcPr>
-            <w:tcW w:w="3395" w:type="dxa"/>
+            <w:tcW w:w="3394" w:type="dxa"/>
             <w:tcBorders>
               <w:left w:val="single" w:sz="2" w:space="0" w:color="000000"/>
               <w:bottom w:val="single" w:sz="2" w:space="0" w:color="000000"/>
@@ -16125,7 +16124,7 @@
         </w:tc>
         <w:tc>
           <w:tcPr>
-            <w:tcW w:w="6251" w:type="dxa"/>
+            <w:tcW w:w="6252" w:type="dxa"/>
             <w:tcBorders>
               <w:left w:val="single" w:sz="2" w:space="0" w:color="000000"/>
               <w:bottom w:val="single" w:sz="2" w:space="0" w:color="000000"/>
@@ -16153,7 +16152,7 @@
         <w:trPr/>
         <w:tc>
           <w:tcPr>
-            <w:tcW w:w="3395" w:type="dxa"/>
+            <w:tcW w:w="3394" w:type="dxa"/>
             <w:tcBorders>
               <w:left w:val="single" w:sz="2" w:space="0" w:color="000000"/>
               <w:bottom w:val="single" w:sz="2" w:space="0" w:color="000000"/>
@@ -16176,7 +16175,7 @@
         </w:tc>
         <w:tc>
           <w:tcPr>
-            <w:tcW w:w="6251" w:type="dxa"/>
+            <w:tcW w:w="6252" w:type="dxa"/>
             <w:tcBorders>
               <w:left w:val="single" w:sz="2" w:space="0" w:color="000000"/>
               <w:bottom w:val="single" w:sz="2" w:space="0" w:color="000000"/>
@@ -16206,7 +16205,7 @@
         <w:trPr/>
         <w:tc>
           <w:tcPr>
-            <w:tcW w:w="3395" w:type="dxa"/>
+            <w:tcW w:w="3394" w:type="dxa"/>
             <w:tcBorders>
               <w:left w:val="single" w:sz="2" w:space="0" w:color="000000"/>
               <w:bottom w:val="single" w:sz="2" w:space="0" w:color="000000"/>
@@ -16232,7 +16231,7 @@
         </w:tc>
         <w:tc>
           <w:tcPr>
-            <w:tcW w:w="6251" w:type="dxa"/>
+            <w:tcW w:w="6252" w:type="dxa"/>
             <w:tcBorders>
               <w:left w:val="single" w:sz="2" w:space="0" w:color="000000"/>
               <w:bottom w:val="single" w:sz="2" w:space="0" w:color="000000"/>
@@ -16304,14 +16303,14 @@
         </w:tblCellMar>
       </w:tblPr>
       <w:tblGrid>
-        <w:gridCol w:w="2873"/>
-        <w:gridCol w:w="6773"/>
+        <w:gridCol w:w="2872"/>
+        <w:gridCol w:w="6774"/>
       </w:tblGrid>
       <w:tr>
         <w:trPr/>
         <w:tc>
           <w:tcPr>
-            <w:tcW w:w="2873" w:type="dxa"/>
+            <w:tcW w:w="2872" w:type="dxa"/>
             <w:tcBorders>
               <w:top w:val="single" w:sz="2" w:space="0" w:color="000000"/>
               <w:left w:val="single" w:sz="2" w:space="0" w:color="000000"/>
@@ -16338,7 +16337,7 @@
         </w:tc>
         <w:tc>
           <w:tcPr>
-            <w:tcW w:w="6773" w:type="dxa"/>
+            <w:tcW w:w="6774" w:type="dxa"/>
             <w:tcBorders>
               <w:top w:val="single" w:sz="2" w:space="0" w:color="000000"/>
               <w:left w:val="single" w:sz="2" w:space="0" w:color="000000"/>
@@ -16369,7 +16368,7 @@
         <w:trPr/>
         <w:tc>
           <w:tcPr>
-            <w:tcW w:w="2873" w:type="dxa"/>
+            <w:tcW w:w="2872" w:type="dxa"/>
             <w:tcBorders>
               <w:left w:val="single" w:sz="2" w:space="0" w:color="000000"/>
               <w:bottom w:val="single" w:sz="2" w:space="0" w:color="000000"/>
@@ -16395,7 +16394,7 @@
         </w:tc>
         <w:tc>
           <w:tcPr>
-            <w:tcW w:w="6773" w:type="dxa"/>
+            <w:tcW w:w="6774" w:type="dxa"/>
             <w:tcBorders>
               <w:left w:val="single" w:sz="2" w:space="0" w:color="000000"/>
               <w:bottom w:val="single" w:sz="2" w:space="0" w:color="000000"/>
@@ -16434,7 +16433,7 @@
         <w:trPr/>
         <w:tc>
           <w:tcPr>
-            <w:tcW w:w="2873" w:type="dxa"/>
+            <w:tcW w:w="2872" w:type="dxa"/>
             <w:tcBorders>
               <w:left w:val="single" w:sz="2" w:space="0" w:color="000000"/>
               <w:bottom w:val="single" w:sz="2" w:space="0" w:color="000000"/>
@@ -16460,7 +16459,7 @@
         </w:tc>
         <w:tc>
           <w:tcPr>
-            <w:tcW w:w="6773" w:type="dxa"/>
+            <w:tcW w:w="6774" w:type="dxa"/>
             <w:tcBorders>
               <w:left w:val="single" w:sz="2" w:space="0" w:color="000000"/>
               <w:bottom w:val="single" w:sz="2" w:space="0" w:color="000000"/>
@@ -16499,7 +16498,7 @@
         <w:trPr/>
         <w:tc>
           <w:tcPr>
-            <w:tcW w:w="2873" w:type="dxa"/>
+            <w:tcW w:w="2872" w:type="dxa"/>
             <w:tcBorders>
               <w:left w:val="single" w:sz="2" w:space="0" w:color="000000"/>
               <w:bottom w:val="single" w:sz="2" w:space="0" w:color="000000"/>
@@ -16525,7 +16524,7 @@
         </w:tc>
         <w:tc>
           <w:tcPr>
-            <w:tcW w:w="6773" w:type="dxa"/>
+            <w:tcW w:w="6774" w:type="dxa"/>
             <w:tcBorders>
               <w:left w:val="single" w:sz="2" w:space="0" w:color="000000"/>
               <w:bottom w:val="single" w:sz="2" w:space="0" w:color="000000"/>
@@ -16564,7 +16563,7 @@
         <w:trPr/>
         <w:tc>
           <w:tcPr>
-            <w:tcW w:w="2873" w:type="dxa"/>
+            <w:tcW w:w="2872" w:type="dxa"/>
             <w:tcBorders>
               <w:left w:val="single" w:sz="2" w:space="0" w:color="000000"/>
               <w:bottom w:val="single" w:sz="2" w:space="0" w:color="000000"/>
@@ -16587,7 +16586,7 @@
         </w:tc>
         <w:tc>
           <w:tcPr>
-            <w:tcW w:w="6773" w:type="dxa"/>
+            <w:tcW w:w="6774" w:type="dxa"/>
             <w:tcBorders>
               <w:left w:val="single" w:sz="2" w:space="0" w:color="000000"/>
               <w:bottom w:val="single" w:sz="2" w:space="0" w:color="000000"/>
@@ -16639,7 +16638,7 @@
         <w:trPr/>
         <w:tc>
           <w:tcPr>
-            <w:tcW w:w="2873" w:type="dxa"/>
+            <w:tcW w:w="2872" w:type="dxa"/>
             <w:tcBorders>
               <w:left w:val="single" w:sz="2" w:space="0" w:color="000000"/>
               <w:bottom w:val="single" w:sz="2" w:space="0" w:color="000000"/>
@@ -16665,7 +16664,7 @@
         </w:tc>
         <w:tc>
           <w:tcPr>
-            <w:tcW w:w="6773" w:type="dxa"/>
+            <w:tcW w:w="6774" w:type="dxa"/>
             <w:tcBorders>
               <w:left w:val="single" w:sz="2" w:space="0" w:color="000000"/>
               <w:bottom w:val="single" w:sz="2" w:space="0" w:color="000000"/>
@@ -16704,7 +16703,7 @@
         <w:trPr/>
         <w:tc>
           <w:tcPr>
-            <w:tcW w:w="2873" w:type="dxa"/>
+            <w:tcW w:w="2872" w:type="dxa"/>
             <w:tcBorders>
               <w:left w:val="single" w:sz="2" w:space="0" w:color="000000"/>
               <w:bottom w:val="single" w:sz="2" w:space="0" w:color="000000"/>
@@ -16741,7 +16740,7 @@
         </w:tc>
         <w:tc>
           <w:tcPr>
-            <w:tcW w:w="6773" w:type="dxa"/>
+            <w:tcW w:w="6774" w:type="dxa"/>
             <w:tcBorders>
               <w:left w:val="single" w:sz="2" w:space="0" w:color="000000"/>
               <w:bottom w:val="single" w:sz="2" w:space="0" w:color="000000"/>
@@ -16780,7 +16779,7 @@
         <w:trPr/>
         <w:tc>
           <w:tcPr>
-            <w:tcW w:w="2873" w:type="dxa"/>
+            <w:tcW w:w="2872" w:type="dxa"/>
             <w:tcBorders>
               <w:left w:val="single" w:sz="2" w:space="0" w:color="000000"/>
               <w:bottom w:val="single" w:sz="2" w:space="0" w:color="000000"/>
@@ -16817,7 +16816,7 @@
         </w:tc>
         <w:tc>
           <w:tcPr>
-            <w:tcW w:w="6773" w:type="dxa"/>
+            <w:tcW w:w="6774" w:type="dxa"/>
             <w:tcBorders>
               <w:left w:val="single" w:sz="2" w:space="0" w:color="000000"/>
               <w:bottom w:val="single" w:sz="2" w:space="0" w:color="000000"/>
@@ -16856,7 +16855,7 @@
         <w:trPr/>
         <w:tc>
           <w:tcPr>
-            <w:tcW w:w="2873" w:type="dxa"/>
+            <w:tcW w:w="2872" w:type="dxa"/>
             <w:tcBorders>
               <w:left w:val="single" w:sz="2" w:space="0" w:color="000000"/>
               <w:bottom w:val="single" w:sz="2" w:space="0" w:color="000000"/>
@@ -16880,7 +16879,7 @@
         </w:tc>
         <w:tc>
           <w:tcPr>
-            <w:tcW w:w="6773" w:type="dxa"/>
+            <w:tcW w:w="6774" w:type="dxa"/>
             <w:tcBorders>
               <w:left w:val="single" w:sz="2" w:space="0" w:color="000000"/>
               <w:bottom w:val="single" w:sz="2" w:space="0" w:color="000000"/>
@@ -16908,7 +16907,7 @@
         <w:trPr/>
         <w:tc>
           <w:tcPr>
-            <w:tcW w:w="2873" w:type="dxa"/>
+            <w:tcW w:w="2872" w:type="dxa"/>
             <w:tcBorders>
               <w:left w:val="single" w:sz="2" w:space="0" w:color="000000"/>
               <w:bottom w:val="single" w:sz="2" w:space="0" w:color="000000"/>
@@ -16931,7 +16930,7 @@
         </w:tc>
         <w:tc>
           <w:tcPr>
-            <w:tcW w:w="6773" w:type="dxa"/>
+            <w:tcW w:w="6774" w:type="dxa"/>
             <w:tcBorders>
               <w:left w:val="single" w:sz="2" w:space="0" w:color="000000"/>
               <w:bottom w:val="single" w:sz="2" w:space="0" w:color="000000"/>
@@ -16959,7 +16958,7 @@
         <w:trPr/>
         <w:tc>
           <w:tcPr>
-            <w:tcW w:w="2873" w:type="dxa"/>
+            <w:tcW w:w="2872" w:type="dxa"/>
             <w:tcBorders>
               <w:left w:val="single" w:sz="2" w:space="0" w:color="000000"/>
             </w:tcBorders>
@@ -16984,7 +16983,7 @@
         </w:tc>
         <w:tc>
           <w:tcPr>
-            <w:tcW w:w="6773" w:type="dxa"/>
+            <w:tcW w:w="6774" w:type="dxa"/>
             <w:tcBorders>
               <w:left w:val="single" w:sz="2" w:space="0" w:color="000000"/>
               <w:right w:val="single" w:sz="2" w:space="0" w:color="000000"/>
@@ -17011,7 +17010,7 @@
         <w:trPr/>
         <w:tc>
           <w:tcPr>
-            <w:tcW w:w="2873" w:type="dxa"/>
+            <w:tcW w:w="2872" w:type="dxa"/>
             <w:tcBorders>
               <w:left w:val="single" w:sz="2" w:space="0" w:color="000000"/>
             </w:tcBorders>
@@ -17036,7 +17035,7 @@
         </w:tc>
         <w:tc>
           <w:tcPr>
-            <w:tcW w:w="6773" w:type="dxa"/>
+            <w:tcW w:w="6774" w:type="dxa"/>
             <w:tcBorders>
               <w:left w:val="single" w:sz="2" w:space="0" w:color="000000"/>
               <w:right w:val="single" w:sz="2" w:space="0" w:color="000000"/>
@@ -17061,7 +17060,7 @@
         <w:trPr/>
         <w:tc>
           <w:tcPr>
-            <w:tcW w:w="2873" w:type="dxa"/>
+            <w:tcW w:w="2872" w:type="dxa"/>
             <w:tcBorders>
               <w:left w:val="single" w:sz="2" w:space="0" w:color="000000"/>
               <w:bottom w:val="single" w:sz="2" w:space="0" w:color="000000"/>
@@ -17087,7 +17086,7 @@
         </w:tc>
         <w:tc>
           <w:tcPr>
-            <w:tcW w:w="6773" w:type="dxa"/>
+            <w:tcW w:w="6774" w:type="dxa"/>
             <w:tcBorders>
               <w:left w:val="single" w:sz="2" w:space="0" w:color="000000"/>
               <w:bottom w:val="single" w:sz="2" w:space="0" w:color="000000"/>
@@ -17672,7 +17671,7 @@
     </w:r>
     <w:r>
       <w:rPr/>
-      <w:t>26</w:t>
+      <w:t>11</w:t>
     </w:r>
     <w:r>
       <w:rPr/>
@@ -18742,6 +18741,8 @@
         <w:ind w:left="720" w:hanging="360"/>
       </w:pPr>
       <w:rPr>
+        <w:sz w:val="24"/>
+        <w:rFonts w:ascii="Verdana" w:hAnsi="Verdana"/>
         <w:lang w:val="da-DK"/>
       </w:rPr>
     </w:lvl>
@@ -19009,7 +19010,7 @@
     <w:qFormat/>
     <w:pPr>
       <w:widowControl/>
-      <w:overflowPunct w:val="false"/>
+      <w:overflowPunct w:val="true"/>
       <w:bidi w:val="0"/>
       <w:jc w:val="left"/>
     </w:pPr>
@@ -19618,20 +19619,6 @@
       <w:szCs w:val="32"/>
     </w:rPr>
   </w:style>
-  <w:style w:type="paragraph" w:styleId="Indholdsfortegnelseoverskrift">
-    <w:name w:val="TOA Heading"/>
-    <w:basedOn w:val="Overskrift"/>
-    <w:pPr>
-      <w:suppressLineNumbers/>
-      <w:ind w:left="0" w:hanging="0"/>
-    </w:pPr>
-    <w:rPr>
-      <w:b/>
-      <w:bCs/>
-      <w:sz w:val="32"/>
-      <w:szCs w:val="32"/>
-    </w:rPr>
-  </w:style>
   <w:style w:type="numbering" w:styleId="WW8Num1">
     <w:name w:val="WW8Num1"/>
     <w:qFormat/>

</xml_diff>

<commit_message>
Fixed typo in documnetation
</commit_message>
<xml_diff>
--- a/Documentation/Official Documentation/Brugervejledning for IBOS Nodelæser version 4.0.0.0.docx
+++ b/Documentation/Official Documentation/Brugervejledning for IBOS Nodelæser version 4.0.0.0.docx
@@ -2063,8 +2063,8 @@
       </w:tblPr>
       <w:tblGrid>
         <w:gridCol w:w="1585"/>
-        <w:gridCol w:w="5324"/>
-        <w:gridCol w:w="2738"/>
+        <w:gridCol w:w="5323"/>
+        <w:gridCol w:w="2739"/>
       </w:tblGrid>
       <w:tr>
         <w:trPr>
@@ -2132,7 +2132,7 @@
         </w:tc>
         <w:tc>
           <w:tcPr>
-            <w:tcW w:w="5324" w:type="dxa"/>
+            <w:tcW w:w="5323" w:type="dxa"/>
             <w:tcBorders>
               <w:top w:val="single" w:sz="2" w:space="0" w:color="000000"/>
               <w:left w:val="single" w:sz="2" w:space="0" w:color="000000"/>
@@ -2159,7 +2159,7 @@
         </w:tc>
         <w:tc>
           <w:tcPr>
-            <w:tcW w:w="2738" w:type="dxa"/>
+            <w:tcW w:w="2739" w:type="dxa"/>
             <w:tcBorders>
               <w:top w:val="single" w:sz="2" w:space="0" w:color="000000"/>
               <w:left w:val="single" w:sz="2" w:space="0" w:color="000000"/>
@@ -2216,7 +2216,7 @@
         </w:tc>
         <w:tc>
           <w:tcPr>
-            <w:tcW w:w="5324" w:type="dxa"/>
+            <w:tcW w:w="5323" w:type="dxa"/>
             <w:tcBorders>
               <w:left w:val="single" w:sz="2" w:space="0" w:color="000000"/>
               <w:bottom w:val="single" w:sz="2" w:space="0" w:color="000000"/>
@@ -2254,7 +2254,7 @@
         </w:tc>
         <w:tc>
           <w:tcPr>
-            <w:tcW w:w="2738" w:type="dxa"/>
+            <w:tcW w:w="2739" w:type="dxa"/>
             <w:tcBorders>
               <w:left w:val="single" w:sz="2" w:space="0" w:color="000000"/>
               <w:bottom w:val="single" w:sz="2" w:space="0" w:color="000000"/>
@@ -2308,7 +2308,7 @@
         </w:tc>
         <w:tc>
           <w:tcPr>
-            <w:tcW w:w="5324" w:type="dxa"/>
+            <w:tcW w:w="5323" w:type="dxa"/>
             <w:tcBorders>
               <w:left w:val="single" w:sz="2" w:space="0" w:color="000000"/>
               <w:bottom w:val="single" w:sz="2" w:space="0" w:color="000000"/>
@@ -2351,7 +2351,7 @@
         </w:tc>
         <w:tc>
           <w:tcPr>
-            <w:tcW w:w="2738" w:type="dxa"/>
+            <w:tcW w:w="2739" w:type="dxa"/>
             <w:tcBorders>
               <w:left w:val="single" w:sz="2" w:space="0" w:color="000000"/>
               <w:bottom w:val="single" w:sz="2" w:space="0" w:color="000000"/>
@@ -2405,7 +2405,7 @@
         </w:tc>
         <w:tc>
           <w:tcPr>
-            <w:tcW w:w="5324" w:type="dxa"/>
+            <w:tcW w:w="5323" w:type="dxa"/>
             <w:tcBorders>
               <w:left w:val="single" w:sz="2" w:space="0" w:color="000000"/>
               <w:bottom w:val="single" w:sz="2" w:space="0" w:color="000000"/>
@@ -2446,7 +2446,7 @@
         </w:tc>
         <w:tc>
           <w:tcPr>
-            <w:tcW w:w="2738" w:type="dxa"/>
+            <w:tcW w:w="2739" w:type="dxa"/>
             <w:tcBorders>
               <w:left w:val="single" w:sz="2" w:space="0" w:color="000000"/>
               <w:bottom w:val="single" w:sz="2" w:space="0" w:color="000000"/>
@@ -2517,7 +2517,7 @@
         </w:tc>
         <w:tc>
           <w:tcPr>
-            <w:tcW w:w="5324" w:type="dxa"/>
+            <w:tcW w:w="5323" w:type="dxa"/>
             <w:tcBorders>
               <w:left w:val="single" w:sz="2" w:space="0" w:color="000000"/>
               <w:bottom w:val="single" w:sz="2" w:space="0" w:color="000000"/>
@@ -2543,7 +2543,7 @@
         </w:tc>
         <w:tc>
           <w:tcPr>
-            <w:tcW w:w="2738" w:type="dxa"/>
+            <w:tcW w:w="2739" w:type="dxa"/>
             <w:tcBorders>
               <w:left w:val="single" w:sz="2" w:space="0" w:color="000000"/>
               <w:bottom w:val="single" w:sz="2" w:space="0" w:color="000000"/>
@@ -2599,7 +2599,7 @@
         </w:tc>
         <w:tc>
           <w:tcPr>
-            <w:tcW w:w="5324" w:type="dxa"/>
+            <w:tcW w:w="5323" w:type="dxa"/>
             <w:tcBorders>
               <w:left w:val="single" w:sz="2" w:space="0" w:color="000000"/>
               <w:bottom w:val="single" w:sz="2" w:space="0" w:color="000000"/>
@@ -2625,7 +2625,7 @@
         </w:tc>
         <w:tc>
           <w:tcPr>
-            <w:tcW w:w="2738" w:type="dxa"/>
+            <w:tcW w:w="2739" w:type="dxa"/>
             <w:tcBorders>
               <w:left w:val="single" w:sz="2" w:space="0" w:color="000000"/>
               <w:bottom w:val="single" w:sz="2" w:space="0" w:color="000000"/>
@@ -2681,7 +2681,7 @@
         </w:tc>
         <w:tc>
           <w:tcPr>
-            <w:tcW w:w="5324" w:type="dxa"/>
+            <w:tcW w:w="5323" w:type="dxa"/>
             <w:tcBorders>
               <w:left w:val="single" w:sz="2" w:space="0" w:color="000000"/>
               <w:bottom w:val="single" w:sz="2" w:space="0" w:color="000000"/>
@@ -2707,7 +2707,7 @@
         </w:tc>
         <w:tc>
           <w:tcPr>
-            <w:tcW w:w="2738" w:type="dxa"/>
+            <w:tcW w:w="2739" w:type="dxa"/>
             <w:tcBorders>
               <w:left w:val="single" w:sz="2" w:space="0" w:color="000000"/>
               <w:bottom w:val="single" w:sz="2" w:space="0" w:color="000000"/>
@@ -2763,7 +2763,7 @@
         </w:tc>
         <w:tc>
           <w:tcPr>
-            <w:tcW w:w="5324" w:type="dxa"/>
+            <w:tcW w:w="5323" w:type="dxa"/>
             <w:tcBorders>
               <w:left w:val="single" w:sz="2" w:space="0" w:color="000000"/>
               <w:bottom w:val="single" w:sz="2" w:space="0" w:color="000000"/>
@@ -2794,7 +2794,7 @@
         </w:tc>
         <w:tc>
           <w:tcPr>
-            <w:tcW w:w="2738" w:type="dxa"/>
+            <w:tcW w:w="2739" w:type="dxa"/>
             <w:tcBorders>
               <w:left w:val="single" w:sz="2" w:space="0" w:color="000000"/>
               <w:bottom w:val="single" w:sz="2" w:space="0" w:color="000000"/>
@@ -2854,7 +2854,7 @@
         </w:tc>
         <w:tc>
           <w:tcPr>
-            <w:tcW w:w="5324" w:type="dxa"/>
+            <w:tcW w:w="5323" w:type="dxa"/>
             <w:tcBorders>
               <w:left w:val="single" w:sz="2" w:space="0" w:color="000000"/>
               <w:bottom w:val="single" w:sz="2" w:space="0" w:color="000000"/>
@@ -2884,7 +2884,7 @@
         </w:tc>
         <w:tc>
           <w:tcPr>
-            <w:tcW w:w="2738" w:type="dxa"/>
+            <w:tcW w:w="2739" w:type="dxa"/>
             <w:tcBorders>
               <w:left w:val="single" w:sz="2" w:space="0" w:color="000000"/>
               <w:bottom w:val="single" w:sz="2" w:space="0" w:color="000000"/>
@@ -2948,7 +2948,7 @@
         </w:tc>
         <w:tc>
           <w:tcPr>
-            <w:tcW w:w="5324" w:type="dxa"/>
+            <w:tcW w:w="5323" w:type="dxa"/>
             <w:tcBorders>
               <w:left w:val="single" w:sz="2" w:space="0" w:color="000000"/>
               <w:bottom w:val="single" w:sz="2" w:space="0" w:color="000000"/>
@@ -2978,7 +2978,7 @@
         </w:tc>
         <w:tc>
           <w:tcPr>
-            <w:tcW w:w="2738" w:type="dxa"/>
+            <w:tcW w:w="2739" w:type="dxa"/>
             <w:tcBorders>
               <w:left w:val="single" w:sz="2" w:space="0" w:color="000000"/>
               <w:bottom w:val="single" w:sz="2" w:space="0" w:color="000000"/>
@@ -3042,7 +3042,7 @@
         </w:tc>
         <w:tc>
           <w:tcPr>
-            <w:tcW w:w="5324" w:type="dxa"/>
+            <w:tcW w:w="5323" w:type="dxa"/>
             <w:tcBorders>
               <w:left w:val="single" w:sz="2" w:space="0" w:color="000000"/>
               <w:bottom w:val="single" w:sz="2" w:space="0" w:color="000000"/>
@@ -3072,7 +3072,7 @@
         </w:tc>
         <w:tc>
           <w:tcPr>
-            <w:tcW w:w="2738" w:type="dxa"/>
+            <w:tcW w:w="2739" w:type="dxa"/>
             <w:tcBorders>
               <w:left w:val="single" w:sz="2" w:space="0" w:color="000000"/>
               <w:bottom w:val="single" w:sz="2" w:space="0" w:color="000000"/>
@@ -3135,7 +3135,7 @@
         </w:tc>
         <w:tc>
           <w:tcPr>
-            <w:tcW w:w="5324" w:type="dxa"/>
+            <w:tcW w:w="5323" w:type="dxa"/>
             <w:tcBorders>
               <w:left w:val="single" w:sz="2" w:space="0" w:color="000000"/>
               <w:bottom w:val="single" w:sz="2" w:space="0" w:color="000000"/>
@@ -3163,7 +3163,7 @@
         </w:tc>
         <w:tc>
           <w:tcPr>
-            <w:tcW w:w="2738" w:type="dxa"/>
+            <w:tcW w:w="2739" w:type="dxa"/>
             <w:tcBorders>
               <w:left w:val="single" w:sz="2" w:space="0" w:color="000000"/>
               <w:bottom w:val="single" w:sz="2" w:space="0" w:color="000000"/>
@@ -3221,7 +3221,7 @@
         </w:tc>
         <w:tc>
           <w:tcPr>
-            <w:tcW w:w="5324" w:type="dxa"/>
+            <w:tcW w:w="5323" w:type="dxa"/>
             <w:tcBorders>
               <w:left w:val="single" w:sz="2" w:space="0" w:color="000000"/>
               <w:bottom w:val="single" w:sz="2" w:space="0" w:color="000000"/>
@@ -3247,7 +3247,7 @@
         </w:tc>
         <w:tc>
           <w:tcPr>
-            <w:tcW w:w="2738" w:type="dxa"/>
+            <w:tcW w:w="2739" w:type="dxa"/>
             <w:tcBorders>
               <w:left w:val="single" w:sz="2" w:space="0" w:color="000000"/>
               <w:bottom w:val="single" w:sz="2" w:space="0" w:color="000000"/>
@@ -3303,7 +3303,7 @@
         </w:tc>
         <w:tc>
           <w:tcPr>
-            <w:tcW w:w="5324" w:type="dxa"/>
+            <w:tcW w:w="5323" w:type="dxa"/>
             <w:tcBorders>
               <w:left w:val="single" w:sz="2" w:space="0" w:color="000000"/>
               <w:bottom w:val="single" w:sz="2" w:space="0" w:color="000000"/>
@@ -3329,7 +3329,7 @@
         </w:tc>
         <w:tc>
           <w:tcPr>
-            <w:tcW w:w="2738" w:type="dxa"/>
+            <w:tcW w:w="2739" w:type="dxa"/>
             <w:tcBorders>
               <w:left w:val="single" w:sz="2" w:space="0" w:color="000000"/>
               <w:bottom w:val="single" w:sz="2" w:space="0" w:color="000000"/>
@@ -3385,7 +3385,7 @@
         </w:tc>
         <w:tc>
           <w:tcPr>
-            <w:tcW w:w="5324" w:type="dxa"/>
+            <w:tcW w:w="5323" w:type="dxa"/>
             <w:tcBorders>
               <w:left w:val="single" w:sz="2" w:space="0" w:color="000000"/>
               <w:bottom w:val="single" w:sz="2" w:space="0" w:color="000000"/>
@@ -3411,7 +3411,7 @@
         </w:tc>
         <w:tc>
           <w:tcPr>
-            <w:tcW w:w="2738" w:type="dxa"/>
+            <w:tcW w:w="2739" w:type="dxa"/>
             <w:tcBorders>
               <w:left w:val="single" w:sz="2" w:space="0" w:color="000000"/>
               <w:bottom w:val="single" w:sz="2" w:space="0" w:color="000000"/>
@@ -3467,7 +3467,7 @@
         </w:tc>
         <w:tc>
           <w:tcPr>
-            <w:tcW w:w="5324" w:type="dxa"/>
+            <w:tcW w:w="5323" w:type="dxa"/>
             <w:tcBorders>
               <w:left w:val="single" w:sz="2" w:space="0" w:color="000000"/>
               <w:bottom w:val="single" w:sz="2" w:space="0" w:color="000000"/>
@@ -3493,7 +3493,7 @@
         </w:tc>
         <w:tc>
           <w:tcPr>
-            <w:tcW w:w="2738" w:type="dxa"/>
+            <w:tcW w:w="2739" w:type="dxa"/>
             <w:tcBorders>
               <w:left w:val="single" w:sz="2" w:space="0" w:color="000000"/>
               <w:bottom w:val="single" w:sz="2" w:space="0" w:color="000000"/>
@@ -3549,7 +3549,7 @@
         </w:tc>
         <w:tc>
           <w:tcPr>
-            <w:tcW w:w="5324" w:type="dxa"/>
+            <w:tcW w:w="5323" w:type="dxa"/>
             <w:tcBorders>
               <w:left w:val="single" w:sz="2" w:space="0" w:color="000000"/>
               <w:bottom w:val="single" w:sz="2" w:space="0" w:color="000000"/>
@@ -3572,7 +3572,7 @@
         </w:tc>
         <w:tc>
           <w:tcPr>
-            <w:tcW w:w="2738" w:type="dxa"/>
+            <w:tcW w:w="2739" w:type="dxa"/>
             <w:tcBorders>
               <w:left w:val="single" w:sz="2" w:space="0" w:color="000000"/>
               <w:bottom w:val="single" w:sz="2" w:space="0" w:color="000000"/>
@@ -3628,7 +3628,7 @@
         </w:tc>
         <w:tc>
           <w:tcPr>
-            <w:tcW w:w="5324" w:type="dxa"/>
+            <w:tcW w:w="5323" w:type="dxa"/>
             <w:tcBorders>
               <w:left w:val="single" w:sz="2" w:space="0" w:color="000000"/>
               <w:bottom w:val="single" w:sz="2" w:space="0" w:color="000000"/>
@@ -3654,7 +3654,7 @@
         </w:tc>
         <w:tc>
           <w:tcPr>
-            <w:tcW w:w="2738" w:type="dxa"/>
+            <w:tcW w:w="2739" w:type="dxa"/>
             <w:tcBorders>
               <w:left w:val="single" w:sz="2" w:space="0" w:color="000000"/>
               <w:bottom w:val="single" w:sz="2" w:space="0" w:color="000000"/>
@@ -3710,7 +3710,7 @@
         </w:tc>
         <w:tc>
           <w:tcPr>
-            <w:tcW w:w="5324" w:type="dxa"/>
+            <w:tcW w:w="5323" w:type="dxa"/>
             <w:tcBorders>
               <w:left w:val="single" w:sz="2" w:space="0" w:color="000000"/>
               <w:bottom w:val="single" w:sz="2" w:space="0" w:color="000000"/>
@@ -3736,7 +3736,7 @@
         </w:tc>
         <w:tc>
           <w:tcPr>
-            <w:tcW w:w="2738" w:type="dxa"/>
+            <w:tcW w:w="2739" w:type="dxa"/>
             <w:tcBorders>
               <w:left w:val="single" w:sz="2" w:space="0" w:color="000000"/>
               <w:bottom w:val="single" w:sz="2" w:space="0" w:color="000000"/>
@@ -3792,7 +3792,7 @@
         </w:tc>
         <w:tc>
           <w:tcPr>
-            <w:tcW w:w="5324" w:type="dxa"/>
+            <w:tcW w:w="5323" w:type="dxa"/>
             <w:tcBorders>
               <w:left w:val="single" w:sz="2" w:space="0" w:color="000000"/>
               <w:bottom w:val="single" w:sz="2" w:space="0" w:color="000000"/>
@@ -3819,7 +3819,7 @@
         </w:tc>
         <w:tc>
           <w:tcPr>
-            <w:tcW w:w="2738" w:type="dxa"/>
+            <w:tcW w:w="2739" w:type="dxa"/>
             <w:tcBorders>
               <w:left w:val="single" w:sz="2" w:space="0" w:color="000000"/>
               <w:bottom w:val="single" w:sz="2" w:space="0" w:color="000000"/>
@@ -3876,7 +3876,7 @@
         </w:tc>
         <w:tc>
           <w:tcPr>
-            <w:tcW w:w="5324" w:type="dxa"/>
+            <w:tcW w:w="5323" w:type="dxa"/>
             <w:tcBorders>
               <w:left w:val="single" w:sz="2" w:space="0" w:color="000000"/>
               <w:bottom w:val="single" w:sz="2" w:space="0" w:color="000000"/>
@@ -3903,7 +3903,7 @@
         </w:tc>
         <w:tc>
           <w:tcPr>
-            <w:tcW w:w="2738" w:type="dxa"/>
+            <w:tcW w:w="2739" w:type="dxa"/>
             <w:tcBorders>
               <w:left w:val="single" w:sz="2" w:space="0" w:color="000000"/>
               <w:bottom w:val="single" w:sz="2" w:space="0" w:color="000000"/>
@@ -3960,7 +3960,7 @@
         </w:tc>
         <w:tc>
           <w:tcPr>
-            <w:tcW w:w="5324" w:type="dxa"/>
+            <w:tcW w:w="5323" w:type="dxa"/>
             <w:tcBorders>
               <w:left w:val="single" w:sz="2" w:space="0" w:color="000000"/>
               <w:bottom w:val="single" w:sz="2" w:space="0" w:color="000000"/>
@@ -3987,7 +3987,7 @@
         </w:tc>
         <w:tc>
           <w:tcPr>
-            <w:tcW w:w="2738" w:type="dxa"/>
+            <w:tcW w:w="2739" w:type="dxa"/>
             <w:tcBorders>
               <w:left w:val="single" w:sz="2" w:space="0" w:color="000000"/>
               <w:bottom w:val="single" w:sz="2" w:space="0" w:color="000000"/>
@@ -4041,7 +4041,7 @@
         </w:tc>
         <w:tc>
           <w:tcPr>
-            <w:tcW w:w="5324" w:type="dxa"/>
+            <w:tcW w:w="5323" w:type="dxa"/>
             <w:tcBorders>
               <w:left w:val="single" w:sz="2" w:space="0" w:color="000000"/>
               <w:bottom w:val="single" w:sz="2" w:space="0" w:color="000000"/>
@@ -4068,7 +4068,7 @@
         </w:tc>
         <w:tc>
           <w:tcPr>
-            <w:tcW w:w="2738" w:type="dxa"/>
+            <w:tcW w:w="2739" w:type="dxa"/>
             <w:tcBorders>
               <w:left w:val="single" w:sz="2" w:space="0" w:color="000000"/>
               <w:bottom w:val="single" w:sz="2" w:space="0" w:color="000000"/>
@@ -4125,7 +4125,7 @@
         </w:tc>
         <w:tc>
           <w:tcPr>
-            <w:tcW w:w="5324" w:type="dxa"/>
+            <w:tcW w:w="5323" w:type="dxa"/>
             <w:tcBorders>
               <w:left w:val="single" w:sz="2" w:space="0" w:color="000000"/>
               <w:bottom w:val="single" w:sz="2" w:space="0" w:color="000000"/>
@@ -4149,7 +4149,7 @@
         </w:tc>
         <w:tc>
           <w:tcPr>
-            <w:tcW w:w="2738" w:type="dxa"/>
+            <w:tcW w:w="2739" w:type="dxa"/>
             <w:tcBorders>
               <w:left w:val="single" w:sz="2" w:space="0" w:color="000000"/>
               <w:bottom w:val="single" w:sz="2" w:space="0" w:color="000000"/>
@@ -4208,7 +4208,7 @@
         </w:tc>
         <w:tc>
           <w:tcPr>
-            <w:tcW w:w="5324" w:type="dxa"/>
+            <w:tcW w:w="5323" w:type="dxa"/>
             <w:tcBorders>
               <w:left w:val="single" w:sz="2" w:space="0" w:color="000000"/>
               <w:bottom w:val="single" w:sz="2" w:space="0" w:color="000000"/>
@@ -4236,7 +4236,7 @@
         </w:tc>
         <w:tc>
           <w:tcPr>
-            <w:tcW w:w="2738" w:type="dxa"/>
+            <w:tcW w:w="2739" w:type="dxa"/>
             <w:tcBorders>
               <w:left w:val="single" w:sz="2" w:space="0" w:color="000000"/>
               <w:bottom w:val="single" w:sz="2" w:space="0" w:color="000000"/>
@@ -4294,7 +4294,7 @@
         </w:tc>
         <w:tc>
           <w:tcPr>
-            <w:tcW w:w="5324" w:type="dxa"/>
+            <w:tcW w:w="5323" w:type="dxa"/>
             <w:tcBorders>
               <w:left w:val="single" w:sz="2" w:space="0" w:color="000000"/>
               <w:bottom w:val="single" w:sz="2" w:space="0" w:color="000000"/>
@@ -4322,7 +4322,7 @@
         </w:tc>
         <w:tc>
           <w:tcPr>
-            <w:tcW w:w="2738" w:type="dxa"/>
+            <w:tcW w:w="2739" w:type="dxa"/>
             <w:tcBorders>
               <w:left w:val="single" w:sz="2" w:space="0" w:color="000000"/>
               <w:bottom w:val="single" w:sz="2" w:space="0" w:color="000000"/>
@@ -4384,7 +4384,7 @@
         </w:tc>
         <w:tc>
           <w:tcPr>
-            <w:tcW w:w="5324" w:type="dxa"/>
+            <w:tcW w:w="5323" w:type="dxa"/>
             <w:tcBorders>
               <w:left w:val="single" w:sz="2" w:space="0" w:color="000000"/>
               <w:bottom w:val="single" w:sz="2" w:space="0" w:color="000000"/>
@@ -4414,7 +4414,7 @@
         </w:tc>
         <w:tc>
           <w:tcPr>
-            <w:tcW w:w="2738" w:type="dxa"/>
+            <w:tcW w:w="2739" w:type="dxa"/>
             <w:tcBorders>
               <w:left w:val="single" w:sz="2" w:space="0" w:color="000000"/>
               <w:bottom w:val="single" w:sz="2" w:space="0" w:color="000000"/>
@@ -4479,7 +4479,7 @@
         </w:tc>
         <w:tc>
           <w:tcPr>
-            <w:tcW w:w="5324" w:type="dxa"/>
+            <w:tcW w:w="5323" w:type="dxa"/>
             <w:tcBorders>
               <w:left w:val="single" w:sz="2" w:space="0" w:color="000000"/>
               <w:bottom w:val="single" w:sz="2" w:space="0" w:color="000000"/>
@@ -4509,7 +4509,7 @@
         </w:tc>
         <w:tc>
           <w:tcPr>
-            <w:tcW w:w="2738" w:type="dxa"/>
+            <w:tcW w:w="2739" w:type="dxa"/>
             <w:tcBorders>
               <w:left w:val="single" w:sz="2" w:space="0" w:color="000000"/>
               <w:bottom w:val="single" w:sz="2" w:space="0" w:color="000000"/>
@@ -4574,7 +4574,7 @@
         </w:tc>
         <w:tc>
           <w:tcPr>
-            <w:tcW w:w="5324" w:type="dxa"/>
+            <w:tcW w:w="5323" w:type="dxa"/>
             <w:tcBorders>
               <w:left w:val="single" w:sz="2" w:space="0" w:color="000000"/>
               <w:bottom w:val="single" w:sz="2" w:space="0" w:color="000000"/>
@@ -4604,7 +4604,7 @@
         </w:tc>
         <w:tc>
           <w:tcPr>
-            <w:tcW w:w="2738" w:type="dxa"/>
+            <w:tcW w:w="2739" w:type="dxa"/>
             <w:tcBorders>
               <w:left w:val="single" w:sz="2" w:space="0" w:color="000000"/>
               <w:bottom w:val="single" w:sz="2" w:space="0" w:color="000000"/>
@@ -4669,7 +4669,7 @@
         </w:tc>
         <w:tc>
           <w:tcPr>
-            <w:tcW w:w="5324" w:type="dxa"/>
+            <w:tcW w:w="5323" w:type="dxa"/>
             <w:tcBorders>
               <w:left w:val="single" w:sz="2" w:space="0" w:color="000000"/>
               <w:bottom w:val="single" w:sz="2" w:space="0" w:color="000000"/>
@@ -4699,7 +4699,7 @@
         </w:tc>
         <w:tc>
           <w:tcPr>
-            <w:tcW w:w="2738" w:type="dxa"/>
+            <w:tcW w:w="2739" w:type="dxa"/>
             <w:tcBorders>
               <w:left w:val="single" w:sz="2" w:space="0" w:color="000000"/>
               <w:bottom w:val="single" w:sz="2" w:space="0" w:color="000000"/>
@@ -4764,7 +4764,7 @@
         </w:tc>
         <w:tc>
           <w:tcPr>
-            <w:tcW w:w="5324" w:type="dxa"/>
+            <w:tcW w:w="5323" w:type="dxa"/>
             <w:tcBorders>
               <w:left w:val="single" w:sz="2" w:space="0" w:color="000000"/>
               <w:bottom w:val="single" w:sz="2" w:space="0" w:color="000000"/>
@@ -4794,7 +4794,7 @@
         </w:tc>
         <w:tc>
           <w:tcPr>
-            <w:tcW w:w="2738" w:type="dxa"/>
+            <w:tcW w:w="2739" w:type="dxa"/>
             <w:tcBorders>
               <w:left w:val="single" w:sz="2" w:space="0" w:color="000000"/>
               <w:bottom w:val="single" w:sz="2" w:space="0" w:color="000000"/>
@@ -4855,7 +4855,7 @@
         </w:tc>
         <w:tc>
           <w:tcPr>
-            <w:tcW w:w="5324" w:type="dxa"/>
+            <w:tcW w:w="5323" w:type="dxa"/>
             <w:tcBorders>
               <w:left w:val="single" w:sz="2" w:space="0" w:color="000000"/>
               <w:bottom w:val="single" w:sz="2" w:space="0" w:color="000000"/>
@@ -4893,7 +4893,7 @@
         </w:tc>
         <w:tc>
           <w:tcPr>
-            <w:tcW w:w="2738" w:type="dxa"/>
+            <w:tcW w:w="2739" w:type="dxa"/>
             <w:tcBorders>
               <w:left w:val="single" w:sz="2" w:space="0" w:color="000000"/>
               <w:bottom w:val="single" w:sz="2" w:space="0" w:color="000000"/>
@@ -4952,7 +4952,7 @@
         </w:tc>
         <w:tc>
           <w:tcPr>
-            <w:tcW w:w="5324" w:type="dxa"/>
+            <w:tcW w:w="5323" w:type="dxa"/>
             <w:tcBorders>
               <w:left w:val="single" w:sz="2" w:space="0" w:color="000000"/>
               <w:bottom w:val="single" w:sz="2" w:space="0" w:color="000000"/>
@@ -4990,7 +4990,7 @@
         </w:tc>
         <w:tc>
           <w:tcPr>
-            <w:tcW w:w="2738" w:type="dxa"/>
+            <w:tcW w:w="2739" w:type="dxa"/>
             <w:tcBorders>
               <w:left w:val="single" w:sz="2" w:space="0" w:color="000000"/>
               <w:bottom w:val="single" w:sz="2" w:space="0" w:color="000000"/>
@@ -5049,7 +5049,7 @@
         </w:tc>
         <w:tc>
           <w:tcPr>
-            <w:tcW w:w="5324" w:type="dxa"/>
+            <w:tcW w:w="5323" w:type="dxa"/>
             <w:tcBorders>
               <w:left w:val="single" w:sz="2" w:space="0" w:color="000000"/>
               <w:bottom w:val="single" w:sz="2" w:space="0" w:color="000000"/>
@@ -5092,7 +5092,7 @@
         </w:tc>
         <w:tc>
           <w:tcPr>
-            <w:tcW w:w="2738" w:type="dxa"/>
+            <w:tcW w:w="2739" w:type="dxa"/>
             <w:tcBorders>
               <w:left w:val="single" w:sz="2" w:space="0" w:color="000000"/>
               <w:bottom w:val="single" w:sz="2" w:space="0" w:color="000000"/>
@@ -5151,7 +5151,7 @@
         </w:tc>
         <w:tc>
           <w:tcPr>
-            <w:tcW w:w="5324" w:type="dxa"/>
+            <w:tcW w:w="5323" w:type="dxa"/>
             <w:tcBorders>
               <w:left w:val="single" w:sz="2" w:space="0" w:color="000000"/>
               <w:bottom w:val="single" w:sz="2" w:space="0" w:color="000000"/>
@@ -5194,7 +5194,7 @@
         </w:tc>
         <w:tc>
           <w:tcPr>
-            <w:tcW w:w="2738" w:type="dxa"/>
+            <w:tcW w:w="2739" w:type="dxa"/>
             <w:tcBorders>
               <w:left w:val="single" w:sz="2" w:space="0" w:color="000000"/>
               <w:bottom w:val="single" w:sz="2" w:space="0" w:color="000000"/>
@@ -5253,7 +5253,7 @@
         </w:tc>
         <w:tc>
           <w:tcPr>
-            <w:tcW w:w="5324" w:type="dxa"/>
+            <w:tcW w:w="5323" w:type="dxa"/>
             <w:tcBorders>
               <w:left w:val="single" w:sz="2" w:space="0" w:color="000000"/>
               <w:bottom w:val="single" w:sz="2" w:space="0" w:color="000000"/>
@@ -5279,7 +5279,7 @@
         </w:tc>
         <w:tc>
           <w:tcPr>
-            <w:tcW w:w="2738" w:type="dxa"/>
+            <w:tcW w:w="2739" w:type="dxa"/>
             <w:tcBorders>
               <w:left w:val="single" w:sz="2" w:space="0" w:color="000000"/>
               <w:bottom w:val="single" w:sz="2" w:space="0" w:color="000000"/>
@@ -5335,7 +5335,7 @@
         </w:tc>
         <w:tc>
           <w:tcPr>
-            <w:tcW w:w="5324" w:type="dxa"/>
+            <w:tcW w:w="5323" w:type="dxa"/>
             <w:tcBorders>
               <w:left w:val="single" w:sz="2" w:space="0" w:color="000000"/>
               <w:bottom w:val="single" w:sz="2" w:space="0" w:color="000000"/>
@@ -5361,7 +5361,7 @@
         </w:tc>
         <w:tc>
           <w:tcPr>
-            <w:tcW w:w="2738" w:type="dxa"/>
+            <w:tcW w:w="2739" w:type="dxa"/>
             <w:tcBorders>
               <w:left w:val="single" w:sz="2" w:space="0" w:color="000000"/>
               <w:bottom w:val="single" w:sz="2" w:space="0" w:color="000000"/>
@@ -5417,7 +5417,7 @@
         </w:tc>
         <w:tc>
           <w:tcPr>
-            <w:tcW w:w="5324" w:type="dxa"/>
+            <w:tcW w:w="5323" w:type="dxa"/>
             <w:tcBorders>
               <w:left w:val="single" w:sz="2" w:space="0" w:color="000000"/>
               <w:bottom w:val="single" w:sz="2" w:space="0" w:color="000000"/>
@@ -5455,7 +5455,7 @@
         </w:tc>
         <w:tc>
           <w:tcPr>
-            <w:tcW w:w="2738" w:type="dxa"/>
+            <w:tcW w:w="2739" w:type="dxa"/>
             <w:tcBorders>
               <w:left w:val="single" w:sz="2" w:space="0" w:color="000000"/>
               <w:bottom w:val="single" w:sz="2" w:space="0" w:color="000000"/>
@@ -5515,7 +5515,7 @@
         </w:tc>
         <w:tc>
           <w:tcPr>
-            <w:tcW w:w="5324" w:type="dxa"/>
+            <w:tcW w:w="5323" w:type="dxa"/>
             <w:tcBorders>
               <w:left w:val="single" w:sz="2" w:space="0" w:color="000000"/>
               <w:bottom w:val="single" w:sz="2" w:space="0" w:color="000000"/>
@@ -5564,7 +5564,7 @@
         </w:tc>
         <w:tc>
           <w:tcPr>
-            <w:tcW w:w="2738" w:type="dxa"/>
+            <w:tcW w:w="2739" w:type="dxa"/>
             <w:tcBorders>
               <w:left w:val="single" w:sz="2" w:space="0" w:color="000000"/>
               <w:bottom w:val="single" w:sz="2" w:space="0" w:color="000000"/>
@@ -5624,7 +5624,7 @@
         </w:tc>
         <w:tc>
           <w:tcPr>
-            <w:tcW w:w="5324" w:type="dxa"/>
+            <w:tcW w:w="5323" w:type="dxa"/>
             <w:tcBorders>
               <w:left w:val="single" w:sz="2" w:space="0" w:color="000000"/>
               <w:bottom w:val="single" w:sz="2" w:space="0" w:color="000000"/>
@@ -5647,7 +5647,7 @@
         </w:tc>
         <w:tc>
           <w:tcPr>
-            <w:tcW w:w="2738" w:type="dxa"/>
+            <w:tcW w:w="2739" w:type="dxa"/>
             <w:tcBorders>
               <w:left w:val="single" w:sz="2" w:space="0" w:color="000000"/>
               <w:bottom w:val="single" w:sz="2" w:space="0" w:color="000000"/>
@@ -5703,7 +5703,7 @@
         </w:tc>
         <w:tc>
           <w:tcPr>
-            <w:tcW w:w="5324" w:type="dxa"/>
+            <w:tcW w:w="5323" w:type="dxa"/>
             <w:tcBorders>
               <w:left w:val="single" w:sz="2" w:space="0" w:color="000000"/>
               <w:bottom w:val="single" w:sz="2" w:space="0" w:color="000000"/>
@@ -5729,7 +5729,7 @@
         </w:tc>
         <w:tc>
           <w:tcPr>
-            <w:tcW w:w="2738" w:type="dxa"/>
+            <w:tcW w:w="2739" w:type="dxa"/>
             <w:tcBorders>
               <w:left w:val="single" w:sz="2" w:space="0" w:color="000000"/>
               <w:bottom w:val="single" w:sz="2" w:space="0" w:color="000000"/>
@@ -5785,7 +5785,7 @@
         </w:tc>
         <w:tc>
           <w:tcPr>
-            <w:tcW w:w="5324" w:type="dxa"/>
+            <w:tcW w:w="5323" w:type="dxa"/>
             <w:tcBorders>
               <w:left w:val="single" w:sz="2" w:space="0" w:color="000000"/>
               <w:bottom w:val="single" w:sz="2" w:space="0" w:color="000000"/>
@@ -5863,7 +5863,7 @@
         </w:tc>
         <w:tc>
           <w:tcPr>
-            <w:tcW w:w="2738" w:type="dxa"/>
+            <w:tcW w:w="2739" w:type="dxa"/>
             <w:tcBorders>
               <w:left w:val="single" w:sz="2" w:space="0" w:color="000000"/>
               <w:bottom w:val="single" w:sz="2" w:space="0" w:color="000000"/>
@@ -5919,7 +5919,7 @@
         </w:tc>
         <w:tc>
           <w:tcPr>
-            <w:tcW w:w="5324" w:type="dxa"/>
+            <w:tcW w:w="5323" w:type="dxa"/>
             <w:tcBorders>
               <w:left w:val="single" w:sz="2" w:space="0" w:color="000000"/>
               <w:bottom w:val="single" w:sz="2" w:space="0" w:color="000000"/>
@@ -5994,7 +5994,7 @@
         </w:tc>
         <w:tc>
           <w:tcPr>
-            <w:tcW w:w="2738" w:type="dxa"/>
+            <w:tcW w:w="2739" w:type="dxa"/>
             <w:tcBorders>
               <w:left w:val="single" w:sz="2" w:space="0" w:color="000000"/>
               <w:bottom w:val="single" w:sz="2" w:space="0" w:color="000000"/>
@@ -7484,15 +7484,15 @@
         </w:tblCellMar>
       </w:tblPr>
       <w:tblGrid>
-        <w:gridCol w:w="3232"/>
+        <w:gridCol w:w="3231"/>
         <w:gridCol w:w="2309"/>
-        <w:gridCol w:w="4106"/>
+        <w:gridCol w:w="4107"/>
       </w:tblGrid>
       <w:tr>
         <w:trPr/>
         <w:tc>
           <w:tcPr>
-            <w:tcW w:w="3232" w:type="dxa"/>
+            <w:tcW w:w="3231" w:type="dxa"/>
             <w:tcBorders>
               <w:top w:val="single" w:sz="2" w:space="0" w:color="000000"/>
               <w:left w:val="single" w:sz="2" w:space="0" w:color="000000"/>
@@ -7542,7 +7542,7 @@
         </w:tc>
         <w:tc>
           <w:tcPr>
-            <w:tcW w:w="4106" w:type="dxa"/>
+            <w:tcW w:w="4107" w:type="dxa"/>
             <w:tcBorders>
               <w:top w:val="single" w:sz="2" w:space="0" w:color="000000"/>
               <w:left w:val="single" w:sz="2" w:space="0" w:color="000000"/>
@@ -7571,7 +7571,7 @@
         <w:trPr/>
         <w:tc>
           <w:tcPr>
-            <w:tcW w:w="3232" w:type="dxa"/>
+            <w:tcW w:w="3231" w:type="dxa"/>
             <w:tcBorders>
               <w:left w:val="single" w:sz="2" w:space="0" w:color="000000"/>
               <w:bottom w:val="single" w:sz="2" w:space="0" w:color="000000"/>
@@ -7633,7 +7633,7 @@
         </w:tc>
         <w:tc>
           <w:tcPr>
-            <w:tcW w:w="4106" w:type="dxa"/>
+            <w:tcW w:w="4107" w:type="dxa"/>
             <w:tcBorders>
               <w:left w:val="single" w:sz="2" w:space="0" w:color="000000"/>
               <w:bottom w:val="single" w:sz="2" w:space="0" w:color="000000"/>
@@ -7681,7 +7681,7 @@
         <w:trPr/>
         <w:tc>
           <w:tcPr>
-            <w:tcW w:w="3232" w:type="dxa"/>
+            <w:tcW w:w="3231" w:type="dxa"/>
             <w:tcBorders>
               <w:left w:val="single" w:sz="2" w:space="0" w:color="000000"/>
               <w:bottom w:val="single" w:sz="2" w:space="0" w:color="000000"/>
@@ -7754,7 +7754,7 @@
         </w:tc>
         <w:tc>
           <w:tcPr>
-            <w:tcW w:w="4106" w:type="dxa"/>
+            <w:tcW w:w="4107" w:type="dxa"/>
             <w:tcBorders>
               <w:left w:val="single" w:sz="2" w:space="0" w:color="000000"/>
               <w:bottom w:val="single" w:sz="2" w:space="0" w:color="000000"/>
@@ -7793,7 +7793,7 @@
         <w:trPr/>
         <w:tc>
           <w:tcPr>
-            <w:tcW w:w="3232" w:type="dxa"/>
+            <w:tcW w:w="3231" w:type="dxa"/>
             <w:tcBorders>
               <w:left w:val="single" w:sz="2" w:space="0" w:color="000000"/>
               <w:bottom w:val="single" w:sz="2" w:space="0" w:color="000000"/>
@@ -7843,7 +7843,7 @@
         </w:tc>
         <w:tc>
           <w:tcPr>
-            <w:tcW w:w="4106" w:type="dxa"/>
+            <w:tcW w:w="4107" w:type="dxa"/>
             <w:tcBorders>
               <w:left w:val="single" w:sz="2" w:space="0" w:color="000000"/>
               <w:bottom w:val="single" w:sz="2" w:space="0" w:color="000000"/>
@@ -7871,7 +7871,7 @@
         <w:trPr/>
         <w:tc>
           <w:tcPr>
-            <w:tcW w:w="3232" w:type="dxa"/>
+            <w:tcW w:w="3231" w:type="dxa"/>
             <w:tcBorders>
               <w:left w:val="single" w:sz="2" w:space="0" w:color="000000"/>
               <w:bottom w:val="single" w:sz="2" w:space="0" w:color="000000"/>
@@ -7921,7 +7921,7 @@
         </w:tc>
         <w:tc>
           <w:tcPr>
-            <w:tcW w:w="4106" w:type="dxa"/>
+            <w:tcW w:w="4107" w:type="dxa"/>
             <w:tcBorders>
               <w:left w:val="single" w:sz="2" w:space="0" w:color="000000"/>
               <w:bottom w:val="single" w:sz="2" w:space="0" w:color="000000"/>
@@ -7949,7 +7949,7 @@
         <w:trPr/>
         <w:tc>
           <w:tcPr>
-            <w:tcW w:w="3232" w:type="dxa"/>
+            <w:tcW w:w="3231" w:type="dxa"/>
             <w:tcBorders>
               <w:left w:val="single" w:sz="2" w:space="0" w:color="000000"/>
               <w:bottom w:val="single" w:sz="2" w:space="0" w:color="000000"/>
@@ -7997,7 +7997,7 @@
         </w:tc>
         <w:tc>
           <w:tcPr>
-            <w:tcW w:w="4106" w:type="dxa"/>
+            <w:tcW w:w="4107" w:type="dxa"/>
             <w:tcBorders>
               <w:left w:val="single" w:sz="2" w:space="0" w:color="000000"/>
               <w:bottom w:val="single" w:sz="2" w:space="0" w:color="000000"/>
@@ -8106,15 +8106,15 @@
         </w:tblCellMar>
       </w:tblPr>
       <w:tblGrid>
-        <w:gridCol w:w="3232"/>
+        <w:gridCol w:w="3231"/>
         <w:gridCol w:w="2338"/>
-        <w:gridCol w:w="4077"/>
+        <w:gridCol w:w="4078"/>
       </w:tblGrid>
       <w:tr>
         <w:trPr/>
         <w:tc>
           <w:tcPr>
-            <w:tcW w:w="3232" w:type="dxa"/>
+            <w:tcW w:w="3231" w:type="dxa"/>
             <w:tcBorders>
               <w:top w:val="single" w:sz="2" w:space="0" w:color="000000"/>
               <w:left w:val="single" w:sz="2" w:space="0" w:color="000000"/>
@@ -8164,7 +8164,7 @@
         </w:tc>
         <w:tc>
           <w:tcPr>
-            <w:tcW w:w="4077" w:type="dxa"/>
+            <w:tcW w:w="4078" w:type="dxa"/>
             <w:tcBorders>
               <w:top w:val="single" w:sz="2" w:space="0" w:color="000000"/>
               <w:left w:val="single" w:sz="2" w:space="0" w:color="000000"/>
@@ -8193,7 +8193,7 @@
         <w:trPr/>
         <w:tc>
           <w:tcPr>
-            <w:tcW w:w="3232" w:type="dxa"/>
+            <w:tcW w:w="3231" w:type="dxa"/>
             <w:tcBorders>
               <w:left w:val="single" w:sz="2" w:space="0" w:color="000000"/>
               <w:bottom w:val="single" w:sz="2" w:space="0" w:color="000000"/>
@@ -8239,7 +8239,7 @@
         </w:tc>
         <w:tc>
           <w:tcPr>
-            <w:tcW w:w="4077" w:type="dxa"/>
+            <w:tcW w:w="4078" w:type="dxa"/>
             <w:tcBorders>
               <w:left w:val="single" w:sz="2" w:space="0" w:color="000000"/>
               <w:bottom w:val="single" w:sz="2" w:space="0" w:color="000000"/>
@@ -8857,7 +8857,7 @@
           <w:numId w:val="0"/>
         </w:numPr>
         <w:suppressAutoHyphens w:val="true"/>
-        <w:overflowPunct w:val="true"/>
+        <w:overflowPunct w:val="false"/>
         <w:jc w:val="left"/>
         <w:outlineLvl w:val="1"/>
         <w:rPr>
@@ -10044,8 +10044,8 @@
         </w:tblCellMar>
       </w:tblPr>
       <w:tblGrid>
-        <w:gridCol w:w="2384"/>
-        <w:gridCol w:w="7262"/>
+        <w:gridCol w:w="2383"/>
+        <w:gridCol w:w="7263"/>
       </w:tblGrid>
       <w:tr>
         <w:trPr>
@@ -10053,7 +10053,7 @@
         </w:trPr>
         <w:tc>
           <w:tcPr>
-            <w:tcW w:w="2384" w:type="dxa"/>
+            <w:tcW w:w="2383" w:type="dxa"/>
             <w:tcBorders>
               <w:top w:val="single" w:sz="2" w:space="0" w:color="000000"/>
               <w:left w:val="single" w:sz="2" w:space="0" w:color="000000"/>
@@ -10080,7 +10080,7 @@
         </w:tc>
         <w:tc>
           <w:tcPr>
-            <w:tcW w:w="7262" w:type="dxa"/>
+            <w:tcW w:w="7263" w:type="dxa"/>
             <w:tcBorders>
               <w:top w:val="single" w:sz="2" w:space="0" w:color="000000"/>
               <w:left w:val="single" w:sz="2" w:space="0" w:color="000000"/>
@@ -10108,7 +10108,7 @@
         <w:trPr/>
         <w:tc>
           <w:tcPr>
-            <w:tcW w:w="2384" w:type="dxa"/>
+            <w:tcW w:w="2383" w:type="dxa"/>
             <w:tcBorders>
               <w:left w:val="single" w:sz="2" w:space="0" w:color="000000"/>
               <w:bottom w:val="single" w:sz="2" w:space="0" w:color="000000"/>
@@ -10133,7 +10133,7 @@
         </w:tc>
         <w:tc>
           <w:tcPr>
-            <w:tcW w:w="7262" w:type="dxa"/>
+            <w:tcW w:w="7263" w:type="dxa"/>
             <w:tcBorders>
               <w:left w:val="single" w:sz="2" w:space="0" w:color="000000"/>
               <w:bottom w:val="single" w:sz="2" w:space="0" w:color="000000"/>
@@ -10161,7 +10161,7 @@
         <w:trPr/>
         <w:tc>
           <w:tcPr>
-            <w:tcW w:w="2384" w:type="dxa"/>
+            <w:tcW w:w="2383" w:type="dxa"/>
             <w:tcBorders>
               <w:left w:val="single" w:sz="2" w:space="0" w:color="000000"/>
               <w:bottom w:val="single" w:sz="2" w:space="0" w:color="000000"/>
@@ -10186,7 +10186,7 @@
         </w:tc>
         <w:tc>
           <w:tcPr>
-            <w:tcW w:w="7262" w:type="dxa"/>
+            <w:tcW w:w="7263" w:type="dxa"/>
             <w:tcBorders>
               <w:left w:val="single" w:sz="2" w:space="0" w:color="000000"/>
               <w:bottom w:val="single" w:sz="2" w:space="0" w:color="000000"/>
@@ -10212,7 +10212,7 @@
         <w:trPr/>
         <w:tc>
           <w:tcPr>
-            <w:tcW w:w="2384" w:type="dxa"/>
+            <w:tcW w:w="2383" w:type="dxa"/>
             <w:tcBorders>
               <w:left w:val="single" w:sz="2" w:space="0" w:color="000000"/>
               <w:bottom w:val="single" w:sz="2" w:space="0" w:color="000000"/>
@@ -10237,7 +10237,7 @@
         </w:tc>
         <w:tc>
           <w:tcPr>
-            <w:tcW w:w="7262" w:type="dxa"/>
+            <w:tcW w:w="7263" w:type="dxa"/>
             <w:tcBorders>
               <w:left w:val="single" w:sz="2" w:space="0" w:color="000000"/>
               <w:bottom w:val="single" w:sz="2" w:space="0" w:color="000000"/>
@@ -10276,7 +10276,7 @@
         <w:trPr/>
         <w:tc>
           <w:tcPr>
-            <w:tcW w:w="2384" w:type="dxa"/>
+            <w:tcW w:w="2383" w:type="dxa"/>
             <w:tcBorders>
               <w:left w:val="single" w:sz="2" w:space="0" w:color="000000"/>
               <w:bottom w:val="single" w:sz="2" w:space="0" w:color="000000"/>
@@ -10301,7 +10301,7 @@
         </w:tc>
         <w:tc>
           <w:tcPr>
-            <w:tcW w:w="7262" w:type="dxa"/>
+            <w:tcW w:w="7263" w:type="dxa"/>
             <w:tcBorders>
               <w:left w:val="single" w:sz="2" w:space="0" w:color="000000"/>
               <w:bottom w:val="single" w:sz="2" w:space="0" w:color="000000"/>
@@ -10327,7 +10327,7 @@
         <w:trPr/>
         <w:tc>
           <w:tcPr>
-            <w:tcW w:w="2384" w:type="dxa"/>
+            <w:tcW w:w="2383" w:type="dxa"/>
             <w:tcBorders>
               <w:left w:val="single" w:sz="2" w:space="0" w:color="000000"/>
               <w:bottom w:val="single" w:sz="2" w:space="0" w:color="000000"/>
@@ -10352,7 +10352,7 @@
         </w:tc>
         <w:tc>
           <w:tcPr>
-            <w:tcW w:w="7262" w:type="dxa"/>
+            <w:tcW w:w="7263" w:type="dxa"/>
             <w:tcBorders>
               <w:left w:val="single" w:sz="2" w:space="0" w:color="000000"/>
               <w:bottom w:val="single" w:sz="2" w:space="0" w:color="000000"/>
@@ -10378,7 +10378,7 @@
         <w:trPr/>
         <w:tc>
           <w:tcPr>
-            <w:tcW w:w="2384" w:type="dxa"/>
+            <w:tcW w:w="2383" w:type="dxa"/>
             <w:tcBorders>
               <w:left w:val="single" w:sz="2" w:space="0" w:color="000000"/>
               <w:bottom w:val="single" w:sz="2" w:space="0" w:color="000000"/>
@@ -10403,7 +10403,7 @@
         </w:tc>
         <w:tc>
           <w:tcPr>
-            <w:tcW w:w="7262" w:type="dxa"/>
+            <w:tcW w:w="7263" w:type="dxa"/>
             <w:tcBorders>
               <w:left w:val="single" w:sz="2" w:space="0" w:color="000000"/>
               <w:bottom w:val="single" w:sz="2" w:space="0" w:color="000000"/>
@@ -10431,7 +10431,7 @@
         <w:trPr/>
         <w:tc>
           <w:tcPr>
-            <w:tcW w:w="2384" w:type="dxa"/>
+            <w:tcW w:w="2383" w:type="dxa"/>
             <w:tcBorders>
               <w:left w:val="single" w:sz="2" w:space="0" w:color="000000"/>
               <w:bottom w:val="single" w:sz="2" w:space="0" w:color="000000"/>
@@ -10456,7 +10456,7 @@
         </w:tc>
         <w:tc>
           <w:tcPr>
-            <w:tcW w:w="7262" w:type="dxa"/>
+            <w:tcW w:w="7263" w:type="dxa"/>
             <w:tcBorders>
               <w:left w:val="single" w:sz="2" w:space="0" w:color="000000"/>
               <w:bottom w:val="single" w:sz="2" w:space="0" w:color="000000"/>
@@ -10482,7 +10482,7 @@
         <w:trPr/>
         <w:tc>
           <w:tcPr>
-            <w:tcW w:w="2384" w:type="dxa"/>
+            <w:tcW w:w="2383" w:type="dxa"/>
             <w:tcBorders>
               <w:left w:val="single" w:sz="2" w:space="0" w:color="000000"/>
               <w:bottom w:val="single" w:sz="2" w:space="0" w:color="000000"/>
@@ -10509,7 +10509,7 @@
         </w:tc>
         <w:tc>
           <w:tcPr>
-            <w:tcW w:w="7262" w:type="dxa"/>
+            <w:tcW w:w="7263" w:type="dxa"/>
             <w:tcBorders>
               <w:left w:val="single" w:sz="2" w:space="0" w:color="000000"/>
               <w:bottom w:val="single" w:sz="2" w:space="0" w:color="000000"/>
@@ -12500,7 +12500,23 @@
           <w:color w:val="C9211E"/>
           <w:lang w:val="da-DK"/>
         </w:rPr>
-        <w:t>Version 3.2 understøtter ”ASCII”, ”OctoBraille 1252” og ”Unicode”.</w:t>
+        <w:t xml:space="preserve">Version </w:t>
+      </w:r>
+      <w:r>
+        <w:rPr>
+          <w:rFonts w:cs="Verdana" w:ascii="Verdana" w:hAnsi="Verdana"/>
+          <w:color w:val="C9211E"/>
+          <w:lang w:val="da-DK"/>
+        </w:rPr>
+        <w:t>4.0</w:t>
+      </w:r>
+      <w:r>
+        <w:rPr>
+          <w:rFonts w:cs="Verdana" w:ascii="Verdana" w:hAnsi="Verdana"/>
+          <w:color w:val="C9211E"/>
+          <w:lang w:val="da-DK"/>
+        </w:rPr>
+        <w:t xml:space="preserve"> understøtter ”ASCII”, ”OctoBraille 1252” og ”Unicode”.</w:t>
       </w:r>
     </w:p>
     <w:p>
@@ -13398,14 +13414,14 @@
         </w:tblCellMar>
       </w:tblPr>
       <w:tblGrid>
-        <w:gridCol w:w="1643"/>
-        <w:gridCol w:w="8007"/>
+        <w:gridCol w:w="1642"/>
+        <w:gridCol w:w="8008"/>
       </w:tblGrid>
       <w:tr>
         <w:trPr/>
         <w:tc>
           <w:tcPr>
-            <w:tcW w:w="1643" w:type="dxa"/>
+            <w:tcW w:w="1642" w:type="dxa"/>
             <w:tcBorders>
               <w:top w:val="single" w:sz="2" w:space="0" w:color="000000"/>
               <w:left w:val="single" w:sz="2" w:space="0" w:color="000000"/>
@@ -13453,7 +13469,7 @@
         </w:tc>
         <w:tc>
           <w:tcPr>
-            <w:tcW w:w="8007" w:type="dxa"/>
+            <w:tcW w:w="8008" w:type="dxa"/>
             <w:tcBorders>
               <w:top w:val="single" w:sz="2" w:space="0" w:color="000000"/>
               <w:left w:val="single" w:sz="2" w:space="0" w:color="000000"/>
@@ -13513,7 +13529,7 @@
         <w:trPr/>
         <w:tc>
           <w:tcPr>
-            <w:tcW w:w="1643" w:type="dxa"/>
+            <w:tcW w:w="1642" w:type="dxa"/>
             <w:tcBorders>
               <w:left w:val="single" w:sz="2" w:space="0" w:color="000000"/>
               <w:bottom w:val="single" w:sz="2" w:space="0" w:color="000000"/>
@@ -13553,7 +13569,7 @@
         </w:tc>
         <w:tc>
           <w:tcPr>
-            <w:tcW w:w="8007" w:type="dxa"/>
+            <w:tcW w:w="8008" w:type="dxa"/>
             <w:tcBorders>
               <w:left w:val="single" w:sz="2" w:space="0" w:color="000000"/>
               <w:bottom w:val="single" w:sz="2" w:space="0" w:color="000000"/>
@@ -13652,7 +13668,7 @@
           <w:numId w:val="3"/>
         </w:numPr>
         <w:suppressAutoHyphens w:val="true"/>
-        <w:overflowPunct w:val="true"/>
+        <w:overflowPunct w:val="false"/>
         <w:bidi w:val="0"/>
         <w:spacing w:before="200" w:after="120"/>
         <w:ind w:left="510" w:right="0" w:hanging="578"/>
@@ -14986,14 +15002,14 @@
         </w:tblCellMar>
       </w:tblPr>
       <w:tblGrid>
-        <w:gridCol w:w="3394"/>
-        <w:gridCol w:w="6252"/>
+        <w:gridCol w:w="3393"/>
+        <w:gridCol w:w="6253"/>
       </w:tblGrid>
       <w:tr>
         <w:trPr/>
         <w:tc>
           <w:tcPr>
-            <w:tcW w:w="3394" w:type="dxa"/>
+            <w:tcW w:w="3393" w:type="dxa"/>
             <w:tcBorders>
               <w:top w:val="single" w:sz="2" w:space="0" w:color="000000"/>
               <w:left w:val="single" w:sz="2" w:space="0" w:color="000000"/>
@@ -15020,7 +15036,7 @@
         </w:tc>
         <w:tc>
           <w:tcPr>
-            <w:tcW w:w="6252" w:type="dxa"/>
+            <w:tcW w:w="6253" w:type="dxa"/>
             <w:tcBorders>
               <w:top w:val="single" w:sz="2" w:space="0" w:color="000000"/>
               <w:left w:val="single" w:sz="2" w:space="0" w:color="000000"/>
@@ -15051,7 +15067,7 @@
         <w:trPr/>
         <w:tc>
           <w:tcPr>
-            <w:tcW w:w="3394" w:type="dxa"/>
+            <w:tcW w:w="3393" w:type="dxa"/>
             <w:tcBorders>
               <w:left w:val="single" w:sz="2" w:space="0" w:color="000000"/>
               <w:bottom w:val="single" w:sz="2" w:space="0" w:color="000000"/>
@@ -15075,7 +15091,7 @@
         </w:tc>
         <w:tc>
           <w:tcPr>
-            <w:tcW w:w="6252" w:type="dxa"/>
+            <w:tcW w:w="6253" w:type="dxa"/>
             <w:tcBorders>
               <w:left w:val="single" w:sz="2" w:space="0" w:color="000000"/>
               <w:bottom w:val="single" w:sz="2" w:space="0" w:color="000000"/>
@@ -15103,7 +15119,7 @@
         <w:trPr/>
         <w:tc>
           <w:tcPr>
-            <w:tcW w:w="3394" w:type="dxa"/>
+            <w:tcW w:w="3393" w:type="dxa"/>
             <w:tcBorders>
               <w:left w:val="single" w:sz="2" w:space="0" w:color="000000"/>
               <w:bottom w:val="single" w:sz="2" w:space="0" w:color="000000"/>
@@ -15127,7 +15143,7 @@
         </w:tc>
         <w:tc>
           <w:tcPr>
-            <w:tcW w:w="6252" w:type="dxa"/>
+            <w:tcW w:w="6253" w:type="dxa"/>
             <w:tcBorders>
               <w:left w:val="single" w:sz="2" w:space="0" w:color="000000"/>
               <w:bottom w:val="single" w:sz="2" w:space="0" w:color="000000"/>
@@ -15155,7 +15171,7 @@
         <w:trPr/>
         <w:tc>
           <w:tcPr>
-            <w:tcW w:w="3394" w:type="dxa"/>
+            <w:tcW w:w="3393" w:type="dxa"/>
             <w:tcBorders>
               <w:left w:val="single" w:sz="2" w:space="0" w:color="000000"/>
               <w:bottom w:val="single" w:sz="2" w:space="0" w:color="000000"/>
@@ -15180,7 +15196,7 @@
         </w:tc>
         <w:tc>
           <w:tcPr>
-            <w:tcW w:w="6252" w:type="dxa"/>
+            <w:tcW w:w="6253" w:type="dxa"/>
             <w:tcBorders>
               <w:left w:val="single" w:sz="2" w:space="0" w:color="000000"/>
               <w:bottom w:val="single" w:sz="2" w:space="0" w:color="000000"/>
@@ -15210,7 +15226,7 @@
         <w:trPr/>
         <w:tc>
           <w:tcPr>
-            <w:tcW w:w="3394" w:type="dxa"/>
+            <w:tcW w:w="3393" w:type="dxa"/>
             <w:tcBorders>
               <w:left w:val="single" w:sz="2" w:space="0" w:color="000000"/>
               <w:bottom w:val="single" w:sz="2" w:space="0" w:color="000000"/>
@@ -15236,7 +15252,7 @@
         </w:tc>
         <w:tc>
           <w:tcPr>
-            <w:tcW w:w="6252" w:type="dxa"/>
+            <w:tcW w:w="6253" w:type="dxa"/>
             <w:tcBorders>
               <w:left w:val="single" w:sz="2" w:space="0" w:color="000000"/>
               <w:bottom w:val="single" w:sz="2" w:space="0" w:color="000000"/>
@@ -15266,7 +15282,7 @@
         <w:trPr/>
         <w:tc>
           <w:tcPr>
-            <w:tcW w:w="3394" w:type="dxa"/>
+            <w:tcW w:w="3393" w:type="dxa"/>
             <w:tcBorders>
               <w:left w:val="single" w:sz="2" w:space="0" w:color="000000"/>
               <w:bottom w:val="single" w:sz="2" w:space="0" w:color="000000"/>
@@ -15290,7 +15306,7 @@
         </w:tc>
         <w:tc>
           <w:tcPr>
-            <w:tcW w:w="6252" w:type="dxa"/>
+            <w:tcW w:w="6253" w:type="dxa"/>
             <w:tcBorders>
               <w:left w:val="single" w:sz="2" w:space="0" w:color="000000"/>
               <w:bottom w:val="single" w:sz="2" w:space="0" w:color="000000"/>
@@ -15318,7 +15334,7 @@
         <w:trPr/>
         <w:tc>
           <w:tcPr>
-            <w:tcW w:w="3394" w:type="dxa"/>
+            <w:tcW w:w="3393" w:type="dxa"/>
             <w:tcBorders>
               <w:left w:val="single" w:sz="2" w:space="0" w:color="000000"/>
               <w:bottom w:val="single" w:sz="2" w:space="0" w:color="000000"/>
@@ -15342,7 +15358,7 @@
         </w:tc>
         <w:tc>
           <w:tcPr>
-            <w:tcW w:w="6252" w:type="dxa"/>
+            <w:tcW w:w="6253" w:type="dxa"/>
             <w:tcBorders>
               <w:left w:val="single" w:sz="2" w:space="0" w:color="000000"/>
               <w:bottom w:val="single" w:sz="2" w:space="0" w:color="000000"/>
@@ -15368,7 +15384,7 @@
         <w:trPr/>
         <w:tc>
           <w:tcPr>
-            <w:tcW w:w="3394" w:type="dxa"/>
+            <w:tcW w:w="3393" w:type="dxa"/>
             <w:tcBorders>
               <w:left w:val="single" w:sz="2" w:space="0" w:color="000000"/>
               <w:bottom w:val="single" w:sz="2" w:space="0" w:color="000000"/>
@@ -15392,7 +15408,7 @@
         </w:tc>
         <w:tc>
           <w:tcPr>
-            <w:tcW w:w="6252" w:type="dxa"/>
+            <w:tcW w:w="6253" w:type="dxa"/>
             <w:tcBorders>
               <w:left w:val="single" w:sz="2" w:space="0" w:color="000000"/>
               <w:bottom w:val="single" w:sz="2" w:space="0" w:color="000000"/>
@@ -15431,7 +15447,7 @@
         <w:trPr/>
         <w:tc>
           <w:tcPr>
-            <w:tcW w:w="3394" w:type="dxa"/>
+            <w:tcW w:w="3393" w:type="dxa"/>
             <w:tcBorders>
               <w:left w:val="single" w:sz="2" w:space="0" w:color="000000"/>
               <w:bottom w:val="single" w:sz="2" w:space="0" w:color="000000"/>
@@ -15455,7 +15471,7 @@
         </w:tc>
         <w:tc>
           <w:tcPr>
-            <w:tcW w:w="6252" w:type="dxa"/>
+            <w:tcW w:w="6253" w:type="dxa"/>
             <w:tcBorders>
               <w:left w:val="single" w:sz="2" w:space="0" w:color="000000"/>
               <w:bottom w:val="single" w:sz="2" w:space="0" w:color="000000"/>
@@ -15494,7 +15510,7 @@
         <w:trPr/>
         <w:tc>
           <w:tcPr>
-            <w:tcW w:w="3394" w:type="dxa"/>
+            <w:tcW w:w="3393" w:type="dxa"/>
             <w:tcBorders>
               <w:left w:val="single" w:sz="2" w:space="0" w:color="000000"/>
               <w:bottom w:val="single" w:sz="2" w:space="0" w:color="000000"/>
@@ -15520,7 +15536,7 @@
         </w:tc>
         <w:tc>
           <w:tcPr>
-            <w:tcW w:w="6252" w:type="dxa"/>
+            <w:tcW w:w="6253" w:type="dxa"/>
             <w:tcBorders>
               <w:left w:val="single" w:sz="2" w:space="0" w:color="000000"/>
               <w:bottom w:val="single" w:sz="2" w:space="0" w:color="000000"/>
@@ -15550,7 +15566,7 @@
         <w:trPr/>
         <w:tc>
           <w:tcPr>
-            <w:tcW w:w="3394" w:type="dxa"/>
+            <w:tcW w:w="3393" w:type="dxa"/>
             <w:tcBorders>
               <w:left w:val="single" w:sz="2" w:space="0" w:color="000000"/>
               <w:bottom w:val="single" w:sz="2" w:space="0" w:color="000000"/>
@@ -15576,7 +15592,7 @@
         </w:tc>
         <w:tc>
           <w:tcPr>
-            <w:tcW w:w="6252" w:type="dxa"/>
+            <w:tcW w:w="6253" w:type="dxa"/>
             <w:tcBorders>
               <w:left w:val="single" w:sz="2" w:space="0" w:color="000000"/>
               <w:bottom w:val="single" w:sz="2" w:space="0" w:color="000000"/>
@@ -15606,7 +15622,7 @@
         <w:trPr/>
         <w:tc>
           <w:tcPr>
-            <w:tcW w:w="3394" w:type="dxa"/>
+            <w:tcW w:w="3393" w:type="dxa"/>
             <w:tcBorders>
               <w:left w:val="single" w:sz="2" w:space="0" w:color="000000"/>
               <w:bottom w:val="single" w:sz="2" w:space="0" w:color="000000"/>
@@ -15632,7 +15648,7 @@
         </w:tc>
         <w:tc>
           <w:tcPr>
-            <w:tcW w:w="6252" w:type="dxa"/>
+            <w:tcW w:w="6253" w:type="dxa"/>
             <w:tcBorders>
               <w:left w:val="single" w:sz="2" w:space="0" w:color="000000"/>
               <w:bottom w:val="single" w:sz="2" w:space="0" w:color="000000"/>
@@ -15662,7 +15678,7 @@
         <w:trPr/>
         <w:tc>
           <w:tcPr>
-            <w:tcW w:w="3394" w:type="dxa"/>
+            <w:tcW w:w="3393" w:type="dxa"/>
             <w:tcBorders>
               <w:left w:val="single" w:sz="2" w:space="0" w:color="000000"/>
               <w:bottom w:val="single" w:sz="2" w:space="0" w:color="000000"/>
@@ -15688,7 +15704,7 @@
         </w:tc>
         <w:tc>
           <w:tcPr>
-            <w:tcW w:w="6252" w:type="dxa"/>
+            <w:tcW w:w="6253" w:type="dxa"/>
             <w:tcBorders>
               <w:left w:val="single" w:sz="2" w:space="0" w:color="000000"/>
               <w:bottom w:val="single" w:sz="2" w:space="0" w:color="000000"/>
@@ -15718,7 +15734,7 @@
         <w:trPr/>
         <w:tc>
           <w:tcPr>
-            <w:tcW w:w="3394" w:type="dxa"/>
+            <w:tcW w:w="3393" w:type="dxa"/>
             <w:tcBorders>
               <w:left w:val="single" w:sz="2" w:space="0" w:color="000000"/>
               <w:bottom w:val="single" w:sz="2" w:space="0" w:color="000000"/>
@@ -15742,7 +15758,7 @@
         </w:tc>
         <w:tc>
           <w:tcPr>
-            <w:tcW w:w="6252" w:type="dxa"/>
+            <w:tcW w:w="6253" w:type="dxa"/>
             <w:tcBorders>
               <w:left w:val="single" w:sz="2" w:space="0" w:color="000000"/>
               <w:bottom w:val="single" w:sz="2" w:space="0" w:color="000000"/>
@@ -15770,7 +15786,7 @@
         <w:trPr/>
         <w:tc>
           <w:tcPr>
-            <w:tcW w:w="3394" w:type="dxa"/>
+            <w:tcW w:w="3393" w:type="dxa"/>
             <w:tcBorders>
               <w:left w:val="single" w:sz="2" w:space="0" w:color="000000"/>
               <w:bottom w:val="single" w:sz="2" w:space="0" w:color="000000"/>
@@ -15805,7 +15821,7 @@
         </w:tc>
         <w:tc>
           <w:tcPr>
-            <w:tcW w:w="6252" w:type="dxa"/>
+            <w:tcW w:w="6253" w:type="dxa"/>
             <w:tcBorders>
               <w:left w:val="single" w:sz="2" w:space="0" w:color="000000"/>
               <w:bottom w:val="single" w:sz="2" w:space="0" w:color="000000"/>
@@ -15833,7 +15849,7 @@
         <w:trPr/>
         <w:tc>
           <w:tcPr>
-            <w:tcW w:w="3394" w:type="dxa"/>
+            <w:tcW w:w="3393" w:type="dxa"/>
             <w:tcBorders>
               <w:left w:val="single" w:sz="2" w:space="0" w:color="000000"/>
               <w:bottom w:val="single" w:sz="2" w:space="0" w:color="000000"/>
@@ -15868,7 +15884,7 @@
         </w:tc>
         <w:tc>
           <w:tcPr>
-            <w:tcW w:w="6252" w:type="dxa"/>
+            <w:tcW w:w="6253" w:type="dxa"/>
             <w:tcBorders>
               <w:left w:val="single" w:sz="2" w:space="0" w:color="000000"/>
               <w:bottom w:val="single" w:sz="2" w:space="0" w:color="000000"/>
@@ -15894,7 +15910,7 @@
         <w:trPr/>
         <w:tc>
           <w:tcPr>
-            <w:tcW w:w="3394" w:type="dxa"/>
+            <w:tcW w:w="3393" w:type="dxa"/>
             <w:tcBorders>
               <w:left w:val="single" w:sz="2" w:space="0" w:color="000000"/>
               <w:bottom w:val="single" w:sz="2" w:space="0" w:color="000000"/>
@@ -15918,7 +15934,7 @@
         </w:tc>
         <w:tc>
           <w:tcPr>
-            <w:tcW w:w="6252" w:type="dxa"/>
+            <w:tcW w:w="6253" w:type="dxa"/>
             <w:tcBorders>
               <w:left w:val="single" w:sz="2" w:space="0" w:color="000000"/>
               <w:bottom w:val="single" w:sz="2" w:space="0" w:color="000000"/>
@@ -15946,7 +15962,7 @@
         <w:trPr/>
         <w:tc>
           <w:tcPr>
-            <w:tcW w:w="3394" w:type="dxa"/>
+            <w:tcW w:w="3393" w:type="dxa"/>
             <w:tcBorders>
               <w:left w:val="single" w:sz="2" w:space="0" w:color="000000"/>
               <w:bottom w:val="single" w:sz="2" w:space="0" w:color="000000"/>
@@ -15970,7 +15986,7 @@
         </w:tc>
         <w:tc>
           <w:tcPr>
-            <w:tcW w:w="6252" w:type="dxa"/>
+            <w:tcW w:w="6253" w:type="dxa"/>
             <w:tcBorders>
               <w:left w:val="single" w:sz="2" w:space="0" w:color="000000"/>
               <w:bottom w:val="single" w:sz="2" w:space="0" w:color="000000"/>
@@ -15998,7 +16014,7 @@
         <w:trPr/>
         <w:tc>
           <w:tcPr>
-            <w:tcW w:w="3394" w:type="dxa"/>
+            <w:tcW w:w="3393" w:type="dxa"/>
             <w:tcBorders>
               <w:left w:val="single" w:sz="2" w:space="0" w:color="000000"/>
               <w:bottom w:val="single" w:sz="2" w:space="0" w:color="000000"/>
@@ -16022,7 +16038,7 @@
         </w:tc>
         <w:tc>
           <w:tcPr>
-            <w:tcW w:w="6252" w:type="dxa"/>
+            <w:tcW w:w="6253" w:type="dxa"/>
             <w:tcBorders>
               <w:left w:val="single" w:sz="2" w:space="0" w:color="000000"/>
               <w:bottom w:val="single" w:sz="2" w:space="0" w:color="000000"/>
@@ -16048,7 +16064,7 @@
         <w:trPr/>
         <w:tc>
           <w:tcPr>
-            <w:tcW w:w="3394" w:type="dxa"/>
+            <w:tcW w:w="3393" w:type="dxa"/>
             <w:tcBorders>
               <w:left w:val="single" w:sz="2" w:space="0" w:color="000000"/>
               <w:bottom w:val="single" w:sz="2" w:space="0" w:color="000000"/>
@@ -16072,7 +16088,7 @@
         </w:tc>
         <w:tc>
           <w:tcPr>
-            <w:tcW w:w="6252" w:type="dxa"/>
+            <w:tcW w:w="6253" w:type="dxa"/>
             <w:tcBorders>
               <w:left w:val="single" w:sz="2" w:space="0" w:color="000000"/>
               <w:bottom w:val="single" w:sz="2" w:space="0" w:color="000000"/>
@@ -16100,7 +16116,7 @@
         <w:trPr/>
         <w:tc>
           <w:tcPr>
-            <w:tcW w:w="3394" w:type="dxa"/>
+            <w:tcW w:w="3393" w:type="dxa"/>
             <w:tcBorders>
               <w:left w:val="single" w:sz="2" w:space="0" w:color="000000"/>
               <w:bottom w:val="single" w:sz="2" w:space="0" w:color="000000"/>
@@ -16124,7 +16140,7 @@
         </w:tc>
         <w:tc>
           <w:tcPr>
-            <w:tcW w:w="6252" w:type="dxa"/>
+            <w:tcW w:w="6253" w:type="dxa"/>
             <w:tcBorders>
               <w:left w:val="single" w:sz="2" w:space="0" w:color="000000"/>
               <w:bottom w:val="single" w:sz="2" w:space="0" w:color="000000"/>
@@ -16152,7 +16168,7 @@
         <w:trPr/>
         <w:tc>
           <w:tcPr>
-            <w:tcW w:w="3394" w:type="dxa"/>
+            <w:tcW w:w="3393" w:type="dxa"/>
             <w:tcBorders>
               <w:left w:val="single" w:sz="2" w:space="0" w:color="000000"/>
               <w:bottom w:val="single" w:sz="2" w:space="0" w:color="000000"/>
@@ -16175,7 +16191,7 @@
         </w:tc>
         <w:tc>
           <w:tcPr>
-            <w:tcW w:w="6252" w:type="dxa"/>
+            <w:tcW w:w="6253" w:type="dxa"/>
             <w:tcBorders>
               <w:left w:val="single" w:sz="2" w:space="0" w:color="000000"/>
               <w:bottom w:val="single" w:sz="2" w:space="0" w:color="000000"/>
@@ -16205,7 +16221,7 @@
         <w:trPr/>
         <w:tc>
           <w:tcPr>
-            <w:tcW w:w="3394" w:type="dxa"/>
+            <w:tcW w:w="3393" w:type="dxa"/>
             <w:tcBorders>
               <w:left w:val="single" w:sz="2" w:space="0" w:color="000000"/>
               <w:bottom w:val="single" w:sz="2" w:space="0" w:color="000000"/>
@@ -16231,7 +16247,7 @@
         </w:tc>
         <w:tc>
           <w:tcPr>
-            <w:tcW w:w="6252" w:type="dxa"/>
+            <w:tcW w:w="6253" w:type="dxa"/>
             <w:tcBorders>
               <w:left w:val="single" w:sz="2" w:space="0" w:color="000000"/>
               <w:bottom w:val="single" w:sz="2" w:space="0" w:color="000000"/>
@@ -16303,14 +16319,14 @@
         </w:tblCellMar>
       </w:tblPr>
       <w:tblGrid>
-        <w:gridCol w:w="2872"/>
-        <w:gridCol w:w="6774"/>
+        <w:gridCol w:w="2871"/>
+        <w:gridCol w:w="6775"/>
       </w:tblGrid>
       <w:tr>
         <w:trPr/>
         <w:tc>
           <w:tcPr>
-            <w:tcW w:w="2872" w:type="dxa"/>
+            <w:tcW w:w="2871" w:type="dxa"/>
             <w:tcBorders>
               <w:top w:val="single" w:sz="2" w:space="0" w:color="000000"/>
               <w:left w:val="single" w:sz="2" w:space="0" w:color="000000"/>
@@ -16337,7 +16353,7 @@
         </w:tc>
         <w:tc>
           <w:tcPr>
-            <w:tcW w:w="6774" w:type="dxa"/>
+            <w:tcW w:w="6775" w:type="dxa"/>
             <w:tcBorders>
               <w:top w:val="single" w:sz="2" w:space="0" w:color="000000"/>
               <w:left w:val="single" w:sz="2" w:space="0" w:color="000000"/>
@@ -16368,7 +16384,7 @@
         <w:trPr/>
         <w:tc>
           <w:tcPr>
-            <w:tcW w:w="2872" w:type="dxa"/>
+            <w:tcW w:w="2871" w:type="dxa"/>
             <w:tcBorders>
               <w:left w:val="single" w:sz="2" w:space="0" w:color="000000"/>
               <w:bottom w:val="single" w:sz="2" w:space="0" w:color="000000"/>
@@ -16394,7 +16410,7 @@
         </w:tc>
         <w:tc>
           <w:tcPr>
-            <w:tcW w:w="6774" w:type="dxa"/>
+            <w:tcW w:w="6775" w:type="dxa"/>
             <w:tcBorders>
               <w:left w:val="single" w:sz="2" w:space="0" w:color="000000"/>
               <w:bottom w:val="single" w:sz="2" w:space="0" w:color="000000"/>
@@ -16433,7 +16449,7 @@
         <w:trPr/>
         <w:tc>
           <w:tcPr>
-            <w:tcW w:w="2872" w:type="dxa"/>
+            <w:tcW w:w="2871" w:type="dxa"/>
             <w:tcBorders>
               <w:left w:val="single" w:sz="2" w:space="0" w:color="000000"/>
               <w:bottom w:val="single" w:sz="2" w:space="0" w:color="000000"/>
@@ -16459,7 +16475,7 @@
         </w:tc>
         <w:tc>
           <w:tcPr>
-            <w:tcW w:w="6774" w:type="dxa"/>
+            <w:tcW w:w="6775" w:type="dxa"/>
             <w:tcBorders>
               <w:left w:val="single" w:sz="2" w:space="0" w:color="000000"/>
               <w:bottom w:val="single" w:sz="2" w:space="0" w:color="000000"/>
@@ -16498,7 +16514,7 @@
         <w:trPr/>
         <w:tc>
           <w:tcPr>
-            <w:tcW w:w="2872" w:type="dxa"/>
+            <w:tcW w:w="2871" w:type="dxa"/>
             <w:tcBorders>
               <w:left w:val="single" w:sz="2" w:space="0" w:color="000000"/>
               <w:bottom w:val="single" w:sz="2" w:space="0" w:color="000000"/>
@@ -16524,7 +16540,7 @@
         </w:tc>
         <w:tc>
           <w:tcPr>
-            <w:tcW w:w="6774" w:type="dxa"/>
+            <w:tcW w:w="6775" w:type="dxa"/>
             <w:tcBorders>
               <w:left w:val="single" w:sz="2" w:space="0" w:color="000000"/>
               <w:bottom w:val="single" w:sz="2" w:space="0" w:color="000000"/>
@@ -16563,7 +16579,7 @@
         <w:trPr/>
         <w:tc>
           <w:tcPr>
-            <w:tcW w:w="2872" w:type="dxa"/>
+            <w:tcW w:w="2871" w:type="dxa"/>
             <w:tcBorders>
               <w:left w:val="single" w:sz="2" w:space="0" w:color="000000"/>
               <w:bottom w:val="single" w:sz="2" w:space="0" w:color="000000"/>
@@ -16586,7 +16602,7 @@
         </w:tc>
         <w:tc>
           <w:tcPr>
-            <w:tcW w:w="6774" w:type="dxa"/>
+            <w:tcW w:w="6775" w:type="dxa"/>
             <w:tcBorders>
               <w:left w:val="single" w:sz="2" w:space="0" w:color="000000"/>
               <w:bottom w:val="single" w:sz="2" w:space="0" w:color="000000"/>
@@ -16638,7 +16654,7 @@
         <w:trPr/>
         <w:tc>
           <w:tcPr>
-            <w:tcW w:w="2872" w:type="dxa"/>
+            <w:tcW w:w="2871" w:type="dxa"/>
             <w:tcBorders>
               <w:left w:val="single" w:sz="2" w:space="0" w:color="000000"/>
               <w:bottom w:val="single" w:sz="2" w:space="0" w:color="000000"/>
@@ -16664,7 +16680,7 @@
         </w:tc>
         <w:tc>
           <w:tcPr>
-            <w:tcW w:w="6774" w:type="dxa"/>
+            <w:tcW w:w="6775" w:type="dxa"/>
             <w:tcBorders>
               <w:left w:val="single" w:sz="2" w:space="0" w:color="000000"/>
               <w:bottom w:val="single" w:sz="2" w:space="0" w:color="000000"/>
@@ -16703,7 +16719,7 @@
         <w:trPr/>
         <w:tc>
           <w:tcPr>
-            <w:tcW w:w="2872" w:type="dxa"/>
+            <w:tcW w:w="2871" w:type="dxa"/>
             <w:tcBorders>
               <w:left w:val="single" w:sz="2" w:space="0" w:color="000000"/>
               <w:bottom w:val="single" w:sz="2" w:space="0" w:color="000000"/>
@@ -16740,7 +16756,7 @@
         </w:tc>
         <w:tc>
           <w:tcPr>
-            <w:tcW w:w="6774" w:type="dxa"/>
+            <w:tcW w:w="6775" w:type="dxa"/>
             <w:tcBorders>
               <w:left w:val="single" w:sz="2" w:space="0" w:color="000000"/>
               <w:bottom w:val="single" w:sz="2" w:space="0" w:color="000000"/>
@@ -16779,7 +16795,7 @@
         <w:trPr/>
         <w:tc>
           <w:tcPr>
-            <w:tcW w:w="2872" w:type="dxa"/>
+            <w:tcW w:w="2871" w:type="dxa"/>
             <w:tcBorders>
               <w:left w:val="single" w:sz="2" w:space="0" w:color="000000"/>
               <w:bottom w:val="single" w:sz="2" w:space="0" w:color="000000"/>
@@ -16816,7 +16832,7 @@
         </w:tc>
         <w:tc>
           <w:tcPr>
-            <w:tcW w:w="6774" w:type="dxa"/>
+            <w:tcW w:w="6775" w:type="dxa"/>
             <w:tcBorders>
               <w:left w:val="single" w:sz="2" w:space="0" w:color="000000"/>
               <w:bottom w:val="single" w:sz="2" w:space="0" w:color="000000"/>
@@ -16855,7 +16871,7 @@
         <w:trPr/>
         <w:tc>
           <w:tcPr>
-            <w:tcW w:w="2872" w:type="dxa"/>
+            <w:tcW w:w="2871" w:type="dxa"/>
             <w:tcBorders>
               <w:left w:val="single" w:sz="2" w:space="0" w:color="000000"/>
               <w:bottom w:val="single" w:sz="2" w:space="0" w:color="000000"/>
@@ -16879,7 +16895,7 @@
         </w:tc>
         <w:tc>
           <w:tcPr>
-            <w:tcW w:w="6774" w:type="dxa"/>
+            <w:tcW w:w="6775" w:type="dxa"/>
             <w:tcBorders>
               <w:left w:val="single" w:sz="2" w:space="0" w:color="000000"/>
               <w:bottom w:val="single" w:sz="2" w:space="0" w:color="000000"/>
@@ -16907,7 +16923,7 @@
         <w:trPr/>
         <w:tc>
           <w:tcPr>
-            <w:tcW w:w="2872" w:type="dxa"/>
+            <w:tcW w:w="2871" w:type="dxa"/>
             <w:tcBorders>
               <w:left w:val="single" w:sz="2" w:space="0" w:color="000000"/>
               <w:bottom w:val="single" w:sz="2" w:space="0" w:color="000000"/>
@@ -16930,7 +16946,7 @@
         </w:tc>
         <w:tc>
           <w:tcPr>
-            <w:tcW w:w="6774" w:type="dxa"/>
+            <w:tcW w:w="6775" w:type="dxa"/>
             <w:tcBorders>
               <w:left w:val="single" w:sz="2" w:space="0" w:color="000000"/>
               <w:bottom w:val="single" w:sz="2" w:space="0" w:color="000000"/>
@@ -16958,7 +16974,7 @@
         <w:trPr/>
         <w:tc>
           <w:tcPr>
-            <w:tcW w:w="2872" w:type="dxa"/>
+            <w:tcW w:w="2871" w:type="dxa"/>
             <w:tcBorders>
               <w:left w:val="single" w:sz="2" w:space="0" w:color="000000"/>
             </w:tcBorders>
@@ -16983,7 +16999,7 @@
         </w:tc>
         <w:tc>
           <w:tcPr>
-            <w:tcW w:w="6774" w:type="dxa"/>
+            <w:tcW w:w="6775" w:type="dxa"/>
             <w:tcBorders>
               <w:left w:val="single" w:sz="2" w:space="0" w:color="000000"/>
               <w:right w:val="single" w:sz="2" w:space="0" w:color="000000"/>
@@ -17010,7 +17026,7 @@
         <w:trPr/>
         <w:tc>
           <w:tcPr>
-            <w:tcW w:w="2872" w:type="dxa"/>
+            <w:tcW w:w="2871" w:type="dxa"/>
             <w:tcBorders>
               <w:left w:val="single" w:sz="2" w:space="0" w:color="000000"/>
             </w:tcBorders>
@@ -17035,7 +17051,7 @@
         </w:tc>
         <w:tc>
           <w:tcPr>
-            <w:tcW w:w="6774" w:type="dxa"/>
+            <w:tcW w:w="6775" w:type="dxa"/>
             <w:tcBorders>
               <w:left w:val="single" w:sz="2" w:space="0" w:color="000000"/>
               <w:right w:val="single" w:sz="2" w:space="0" w:color="000000"/>
@@ -17060,7 +17076,7 @@
         <w:trPr/>
         <w:tc>
           <w:tcPr>
-            <w:tcW w:w="2872" w:type="dxa"/>
+            <w:tcW w:w="2871" w:type="dxa"/>
             <w:tcBorders>
               <w:left w:val="single" w:sz="2" w:space="0" w:color="000000"/>
               <w:bottom w:val="single" w:sz="2" w:space="0" w:color="000000"/>
@@ -17086,7 +17102,7 @@
         </w:tc>
         <w:tc>
           <w:tcPr>
-            <w:tcW w:w="6774" w:type="dxa"/>
+            <w:tcW w:w="6775" w:type="dxa"/>
             <w:tcBorders>
               <w:left w:val="single" w:sz="2" w:space="0" w:color="000000"/>
               <w:bottom w:val="single" w:sz="2" w:space="0" w:color="000000"/>
@@ -17671,7 +17687,7 @@
     </w:r>
     <w:r>
       <w:rPr/>
-      <w:t>11</w:t>
+      <w:t>26</w:t>
     </w:r>
     <w:r>
       <w:rPr/>
@@ -19010,7 +19026,7 @@
     <w:qFormat/>
     <w:pPr>
       <w:widowControl/>
-      <w:overflowPunct w:val="true"/>
+      <w:overflowPunct w:val="false"/>
       <w:bidi w:val="0"/>
       <w:jc w:val="left"/>
     </w:pPr>

</xml_diff>